<commit_message>
Formatting changes; recovered final step to install bottom board next to doorway.
</commit_message>
<xml_diff>
--- a/Interior_Panels/Interior_Panels.docx
+++ b/Interior_Panels/Interior_Panels.docx
@@ -1203,6 +1203,11 @@
       </w:r>
     </w:p>
     <w:p>
+      <w:r>
+        <w:br w:type="page"/>
+      </w:r>
+    </w:p>
+    <w:p>
       <w:pPr>
         <w:pStyle w:val="FirstParagraph"/>
       </w:pPr>
@@ -1247,6 +1252,36 @@
             </a:graphic>
           </wp:inline>
         </w:drawing>
+      </w:r>
+    </w:p>
+    <w:p>
+      <w:pPr>
+        <w:pStyle w:val="Compact"/>
+        <w:numPr>
+          <w:ilvl w:val="0"/>
+          <w:numId w:val="1007"/>
+        </w:numPr>
+      </w:pPr>
+      <w:r>
+        <w:t xml:space="preserve">Step 7 - Find and install a 4” piece of ½” plywood that goes below the remaining edge of the D panel on the narrow side next to the doorway.</w:t>
+      </w:r>
+      <w:r>
+        <w:br/>
+      </w:r>
+      <w:r>
+        <w:t xml:space="preserve">— This piece is 38¼” long and 4” wide, and can be found in a square barrel where the trim pieces are kept.</w:t>
+      </w:r>
+      <w:r>
+        <w:br/>
+      </w:r>
+      <w:r>
+        <w:t xml:space="preserve">— Pre-drill along the long edges about 8” apart.</w:t>
+      </w:r>
+      <w:r>
+        <w:br/>
+      </w:r>
+      <w:r>
+        <w:t xml:space="preserve">— Install, making sure that the edge next to the doorway aligns with the routed doorway above it.</w:t>
       </w:r>
     </w:p>
     <w:bookmarkEnd w:id="36"/>
@@ -1753,6 +1788,9 @@
     <w:abstractNumId w:val="991"/>
   </w:num>
   <w:num w:numId="1006">
+    <w:abstractNumId w:val="991"/>
+  </w:num>
+  <w:num w:numId="1007">
     <w:abstractNumId w:val="991"/>
   </w:num>
 </w:numbering>

</xml_diff>

<commit_message>
Updates to post-tilt-up, tilt-up, and interior-panels .md files to adjust for docx manual template font sizing & spacing changes
</commit_message>
<xml_diff>
--- a/Interior_Panels/Interior_Panels.docx
+++ b/Interior_Panels/Interior_Panels.docx
@@ -1203,11 +1203,6 @@
       </w:r>
     </w:p>
     <w:p>
-      <w:r>
-        <w:br w:type="page"/>
-      </w:r>
-    </w:p>
-    <w:p>
       <w:pPr>
         <w:pStyle w:val="FirstParagraph"/>
       </w:pPr>
@@ -1287,16 +1282,11 @@
     <w:bookmarkEnd w:id="36"/>
     <w:bookmarkEnd w:id="37"/>
     <w:sectPr>
-      <w:headerReference r:id="rId9" w:type="even"/>
-      <w:headerReference r:id="rId11" w:type="default"/>
-      <w:footerReference r:id="rId14" w:type="even"/>
-      <w:footerReference r:id="rId13" w:type="default"/>
-      <w:headerReference r:id="rId10" w:type="first"/>
-      <w:footerReference r:id="rId12" w:type="first"/>
+      <w:footerReference r:id="rId9" w:type="default"/>
       <w:pgSz w:code="1" w:h="15840" w:w="12240"/>
       <w:pgMar w:bottom="1440" w:footer="708" w:gutter="0" w:header="708" w:left="1440" w:right="1440" w:top="1440"/>
       <w:cols w:space="708"/>
-      <w:docGrid w:linePitch="360"/>
+      <w:docGrid w:linePitch="381"/>
     </w:sectPr>
   </w:body>
 </w:document>
@@ -1307,118 +1297,65 @@
 </file>
 
 <file path=word/footer1.xml><?xml version="1.0" encoding="utf-8"?>
-<w:ftr xmlns:wpc="http://schemas.microsoft.com/office/word/2010/wordprocessingCanvas" xmlns:cx="http://schemas.microsoft.com/office/drawing/2014/chartex" xmlns:cx1="http://schemas.microsoft.com/office/drawing/2015/9/8/chartex" xmlns:cx2="http://schemas.microsoft.com/office/drawing/2015/10/21/chartex" xmlns:cx3="http://schemas.microsoft.com/office/drawing/2016/5/9/chartex" xmlns:cx4="http://schemas.microsoft.com/office/drawing/2016/5/10/chartex" xmlns:cx5="http://schemas.microsoft.com/office/drawing/2016/5/11/chartex" xmlns:cx6="http://schemas.microsoft.com/office/drawing/2016/5/12/chartex" xmlns:cx7="http://schemas.microsoft.com/office/drawing/2016/5/13/chartex" xmlns:cx8="http://schemas.microsoft.com/office/drawing/2016/5/14/chartex" xmlns:mc="http://schemas.openxmlformats.org/markup-compatibility/2006" xmlns:aink="http://schemas.microsoft.com/office/drawing/2016/ink" xmlns:am3d="http://schemas.microsoft.com/office/drawing/2017/model3d" xmlns:o="urn:schemas-microsoft-com:office:office" xmlns:oel="http://schemas.microsoft.com/office/2019/extlst" xmlns:r="http://schemas.openxmlformats.org/officeDocument/2006/relationships" xmlns:m="http://schemas.openxmlformats.org/officeDocument/2006/math" xmlns:v="urn:schemas-microsoft-com:vml" xmlns:wp14="http://schemas.microsoft.com/office/word/2010/wordprocessingDrawing" xmlns:wp="http://schemas.openxmlformats.org/drawingml/2006/wordprocessingDrawing" xmlns:w10="urn:schemas-microsoft-com:office:word" xmlns:w="http://schemas.openxmlformats.org/wordprocessingml/2006/main" xmlns:w14="http://schemas.microsoft.com/office/word/2010/wordml" xmlns:w15="http://schemas.microsoft.com/office/word/2012/wordml" xmlns:w16cex="http://schemas.microsoft.com/office/word/2018/wordml/cex" xmlns:w16cid="http://schemas.microsoft.com/office/word/2016/wordml/cid" xmlns:w16="http://schemas.microsoft.com/office/word/2018/wordml" xmlns:w16du="http://schemas.microsoft.com/office/word/2023/wordml/word16du" xmlns:w16sdtdh="http://schemas.microsoft.com/office/word/2020/wordml/sdtdatahash" xmlns:w16sdtfl="http://schemas.microsoft.com/office/word/2024/wordml/sdtformatlock" xmlns:w16se="http://schemas.microsoft.com/office/word/2015/wordml/symex" xmlns:wpg="http://schemas.microsoft.com/office/word/2010/wordprocessingGroup" xmlns:wpi="http://schemas.microsoft.com/office/word/2010/wordprocessingInk" xmlns:wne="http://schemas.microsoft.com/office/word/2006/wordml" xmlns:wps="http://schemas.microsoft.com/office/word/2010/wordprocessingShape" mc:Ignorable="w14 w15 w16se w16cid w16 w16cex w16sdtdh w16sdtfl w16du wp14">
-  <w:p>
-    <w:pPr>
-      <w:pStyle w:val="Footer"/>
-    </w:pPr>
-  </w:p>
-</w:ftr>
-</file>
-
-<file path=word/footer2.xml><?xml version="1.0" encoding="utf-8"?>
-<w:ftr xmlns:wpc="http://schemas.microsoft.com/office/word/2010/wordprocessingCanvas" xmlns:cx="http://schemas.microsoft.com/office/drawing/2014/chartex" xmlns:cx1="http://schemas.microsoft.com/office/drawing/2015/9/8/chartex" xmlns:cx2="http://schemas.microsoft.com/office/drawing/2015/10/21/chartex" xmlns:cx3="http://schemas.microsoft.com/office/drawing/2016/5/9/chartex" xmlns:cx4="http://schemas.microsoft.com/office/drawing/2016/5/10/chartex" xmlns:cx5="http://schemas.microsoft.com/office/drawing/2016/5/11/chartex" xmlns:cx6="http://schemas.microsoft.com/office/drawing/2016/5/12/chartex" xmlns:cx7="http://schemas.microsoft.com/office/drawing/2016/5/13/chartex" xmlns:cx8="http://schemas.microsoft.com/office/drawing/2016/5/14/chartex" xmlns:mc="http://schemas.openxmlformats.org/markup-compatibility/2006" xmlns:aink="http://schemas.microsoft.com/office/drawing/2016/ink" xmlns:am3d="http://schemas.microsoft.com/office/drawing/2017/model3d" xmlns:o="urn:schemas-microsoft-com:office:office" xmlns:oel="http://schemas.microsoft.com/office/2019/extlst" xmlns:r="http://schemas.openxmlformats.org/officeDocument/2006/relationships" xmlns:m="http://schemas.openxmlformats.org/officeDocument/2006/math" xmlns:v="urn:schemas-microsoft-com:vml" xmlns:wp14="http://schemas.microsoft.com/office/word/2010/wordprocessingDrawing" xmlns:wp="http://schemas.openxmlformats.org/drawingml/2006/wordprocessingDrawing" xmlns:w10="urn:schemas-microsoft-com:office:word" xmlns:w="http://schemas.openxmlformats.org/wordprocessingml/2006/main" xmlns:w14="http://schemas.microsoft.com/office/word/2010/wordml" xmlns:w15="http://schemas.microsoft.com/office/word/2012/wordml" xmlns:w16cex="http://schemas.microsoft.com/office/word/2018/wordml/cex" xmlns:w16cid="http://schemas.microsoft.com/office/word/2016/wordml/cid" xmlns:w16="http://schemas.microsoft.com/office/word/2018/wordml" xmlns:w16du="http://schemas.microsoft.com/office/word/2023/wordml/word16du" xmlns:w16sdtdh="http://schemas.microsoft.com/office/word/2020/wordml/sdtdatahash" xmlns:w16sdtfl="http://schemas.microsoft.com/office/word/2024/wordml/sdtformatlock" xmlns:w16se="http://schemas.microsoft.com/office/word/2015/wordml/symex" xmlns:wpg="http://schemas.microsoft.com/office/word/2010/wordprocessingGroup" xmlns:wpi="http://schemas.microsoft.com/office/word/2010/wordprocessingInk" xmlns:wne="http://schemas.microsoft.com/office/word/2006/wordml" xmlns:wps="http://schemas.microsoft.com/office/word/2010/wordprocessingShape" mc:Ignorable="w14 w15 w16se w16cid w16 w16cex w16sdtdh w16sdtfl w16du wp14">
+<w:ftr xmlns:wpc="http://schemas.microsoft.com/office/word/2010/wordprocessingCanvas" xmlns:mc="http://schemas.openxmlformats.org/markup-compatibility/2006" xmlns:o="urn:schemas-microsoft-com:office:office" xmlns:r="http://schemas.openxmlformats.org/officeDocument/2006/relationships" xmlns:m="http://schemas.openxmlformats.org/officeDocument/2006/math" xmlns:v="urn:schemas-microsoft-com:vml" xmlns:wp14="http://schemas.microsoft.com/office/word/2010/wordprocessingDrawing" xmlns:wp="http://schemas.openxmlformats.org/drawingml/2006/wordprocessingDrawing" xmlns:w10="urn:schemas-microsoft-com:office:word" xmlns:w="http://schemas.openxmlformats.org/wordprocessingml/2006/main" xmlns:w14="http://schemas.microsoft.com/office/word/2010/wordml" xmlns:wpg="http://schemas.microsoft.com/office/word/2010/wordprocessingGroup" xmlns:wpi="http://schemas.microsoft.com/office/word/2010/wordprocessingInk" xmlns:wne="http://schemas.microsoft.com/office/word/2006/wordml" xmlns:wps="http://schemas.microsoft.com/office/word/2010/wordprocessingShape" mc:Ignorable="w14 wp14">
   <w:p>
     <w:pPr>
       <w:pStyle w:val="Footer"/>
       <w:pBdr>
-        <w:top w:val="single" w:sz="4" w:space="1" w:color="BFBFBF" w:themeColor="background1" w:themeShade="BF"/>
+        <w:top w:val="single" w:sz="4" w:space="1" w:color="auto"/>
       </w:pBdr>
-      <w:rPr>
-        <w:sz w:val="22"/>
-      </w:rPr>
     </w:pPr>
     <w:r>
-      <w:rPr>
-        <w:sz w:val="22"/>
-      </w:rPr>
       <w:t>Sound Foundations NW</w:t>
     </w:r>
     <w:r>
-      <w:rPr>
-        <w:sz w:val="22"/>
-      </w:rPr>
       <w:ptab w:relativeTo="margin" w:alignment="center" w:leader="none"/>
     </w:r>
     <w:r>
-      <w:rPr>
-        <w:sz w:val="22"/>
-      </w:rPr>
+      <w:t xml:space="preserve"> </w:t>
+    </w:r>
+    <w:r>
       <w:fldChar w:fldCharType="begin"/>
     </w:r>
     <w:r>
-      <w:rPr>
-        <w:sz w:val="22"/>
-      </w:rPr>
       <w:instrText xml:space="preserve"> SAVEDATE  \@ "d MMMM yyyy"  \* MERGEFORMAT </w:instrText>
     </w:r>
     <w:r>
-      <w:rPr>
-        <w:sz w:val="22"/>
-      </w:rPr>
       <w:fldChar w:fldCharType="separate"/>
     </w:r>
     <w:r>
       <w:rPr>
         <w:noProof/>
-        <w:sz w:val="22"/>
       </w:rPr>
-      <w:t>30 January 2025</w:t>
+      <w:t>12 March 2025</w:t>
     </w:r>
     <w:r>
-      <w:rPr>
-        <w:sz w:val="22"/>
-      </w:rPr>
       <w:fldChar w:fldCharType="end"/>
     </w:r>
     <w:r>
-      <w:rPr>
-        <w:sz w:val="22"/>
-      </w:rPr>
+      <w:t xml:space="preserve"> </w:t>
+    </w:r>
+    <w:r>
       <w:ptab w:relativeTo="margin" w:alignment="right" w:leader="none"/>
     </w:r>
     <w:r>
-      <w:rPr>
-        <w:sz w:val="22"/>
-      </w:rPr>
       <w:fldChar w:fldCharType="begin"/>
     </w:r>
     <w:r>
-      <w:rPr>
-        <w:sz w:val="22"/>
-      </w:rPr>
       <w:instrText xml:space="preserve"> PAGE   \* MERGEFORMAT </w:instrText>
     </w:r>
     <w:r>
-      <w:rPr>
-        <w:sz w:val="22"/>
-      </w:rPr>
       <w:fldChar w:fldCharType="separate"/>
     </w:r>
     <w:r>
       <w:rPr>
         <w:noProof/>
-        <w:sz w:val="22"/>
       </w:rPr>
       <w:t>1</w:t>
     </w:r>
     <w:r>
-      <w:rPr>
-        <w:noProof/>
-        <w:sz w:val="22"/>
-      </w:rPr>
       <w:fldChar w:fldCharType="end"/>
     </w:r>
-  </w:p>
-</w:ftr>
-</file>
-
-<file path=word/footer3.xml><?xml version="1.0" encoding="utf-8"?>
-<w:ftr xmlns:wpc="http://schemas.microsoft.com/office/word/2010/wordprocessingCanvas" xmlns:cx="http://schemas.microsoft.com/office/drawing/2014/chartex" xmlns:cx1="http://schemas.microsoft.com/office/drawing/2015/9/8/chartex" xmlns:cx2="http://schemas.microsoft.com/office/drawing/2015/10/21/chartex" xmlns:cx3="http://schemas.microsoft.com/office/drawing/2016/5/9/chartex" xmlns:cx4="http://schemas.microsoft.com/office/drawing/2016/5/10/chartex" xmlns:cx5="http://schemas.microsoft.com/office/drawing/2016/5/11/chartex" xmlns:cx6="http://schemas.microsoft.com/office/drawing/2016/5/12/chartex" xmlns:cx7="http://schemas.microsoft.com/office/drawing/2016/5/13/chartex" xmlns:cx8="http://schemas.microsoft.com/office/drawing/2016/5/14/chartex" xmlns:mc="http://schemas.openxmlformats.org/markup-compatibility/2006" xmlns:aink="http://schemas.microsoft.com/office/drawing/2016/ink" xmlns:am3d="http://schemas.microsoft.com/office/drawing/2017/model3d" xmlns:o="urn:schemas-microsoft-com:office:office" xmlns:oel="http://schemas.microsoft.com/office/2019/extlst" xmlns:r="http://schemas.openxmlformats.org/officeDocument/2006/relationships" xmlns:m="http://schemas.openxmlformats.org/officeDocument/2006/math" xmlns:v="urn:schemas-microsoft-com:vml" xmlns:wp14="http://schemas.microsoft.com/office/word/2010/wordprocessingDrawing" xmlns:wp="http://schemas.openxmlformats.org/drawingml/2006/wordprocessingDrawing" xmlns:w10="urn:schemas-microsoft-com:office:word" xmlns:w="http://schemas.openxmlformats.org/wordprocessingml/2006/main" xmlns:w14="http://schemas.microsoft.com/office/word/2010/wordml" xmlns:w15="http://schemas.microsoft.com/office/word/2012/wordml" xmlns:w16cex="http://schemas.microsoft.com/office/word/2018/wordml/cex" xmlns:w16cid="http://schemas.microsoft.com/office/word/2016/wordml/cid" xmlns:w16="http://schemas.microsoft.com/office/word/2018/wordml" xmlns:w16du="http://schemas.microsoft.com/office/word/2023/wordml/word16du" xmlns:w16sdtdh="http://schemas.microsoft.com/office/word/2020/wordml/sdtdatahash" xmlns:w16sdtfl="http://schemas.microsoft.com/office/word/2024/wordml/sdtformatlock" xmlns:w16se="http://schemas.microsoft.com/office/word/2015/wordml/symex" xmlns:wpg="http://schemas.microsoft.com/office/word/2010/wordprocessingGroup" xmlns:wpi="http://schemas.microsoft.com/office/word/2010/wordprocessingInk" xmlns:wne="http://schemas.microsoft.com/office/word/2006/wordml" xmlns:wps="http://schemas.microsoft.com/office/word/2010/wordprocessingShape" mc:Ignorable="w14 w15 w16se w16cid w16 w16cex w16sdtdh w16sdtfl w16du wp14">
-  <w:p>
-    <w:pPr>
-      <w:pStyle w:val="Footer"/>
-    </w:pPr>
   </w:p>
 </w:ftr>
 </file>
@@ -1442,45 +1379,16 @@
 </w:footnotes>
 </file>
 
-<file path=word/header1.xml><?xml version="1.0" encoding="utf-8"?>
-<w:hdr xmlns:wpc="http://schemas.microsoft.com/office/word/2010/wordprocessingCanvas" xmlns:cx="http://schemas.microsoft.com/office/drawing/2014/chartex" xmlns:cx1="http://schemas.microsoft.com/office/drawing/2015/9/8/chartex" xmlns:cx2="http://schemas.microsoft.com/office/drawing/2015/10/21/chartex" xmlns:cx3="http://schemas.microsoft.com/office/drawing/2016/5/9/chartex" xmlns:cx4="http://schemas.microsoft.com/office/drawing/2016/5/10/chartex" xmlns:cx5="http://schemas.microsoft.com/office/drawing/2016/5/11/chartex" xmlns:cx6="http://schemas.microsoft.com/office/drawing/2016/5/12/chartex" xmlns:cx7="http://schemas.microsoft.com/office/drawing/2016/5/13/chartex" xmlns:cx8="http://schemas.microsoft.com/office/drawing/2016/5/14/chartex" xmlns:mc="http://schemas.openxmlformats.org/markup-compatibility/2006" xmlns:aink="http://schemas.microsoft.com/office/drawing/2016/ink" xmlns:am3d="http://schemas.microsoft.com/office/drawing/2017/model3d" xmlns:o="urn:schemas-microsoft-com:office:office" xmlns:oel="http://schemas.microsoft.com/office/2019/extlst" xmlns:r="http://schemas.openxmlformats.org/officeDocument/2006/relationships" xmlns:m="http://schemas.openxmlformats.org/officeDocument/2006/math" xmlns:v="urn:schemas-microsoft-com:vml" xmlns:wp14="http://schemas.microsoft.com/office/word/2010/wordprocessingDrawing" xmlns:wp="http://schemas.openxmlformats.org/drawingml/2006/wordprocessingDrawing" xmlns:w10="urn:schemas-microsoft-com:office:word" xmlns:w="http://schemas.openxmlformats.org/wordprocessingml/2006/main" xmlns:w14="http://schemas.microsoft.com/office/word/2010/wordml" xmlns:w15="http://schemas.microsoft.com/office/word/2012/wordml" xmlns:w16cex="http://schemas.microsoft.com/office/word/2018/wordml/cex" xmlns:w16cid="http://schemas.microsoft.com/office/word/2016/wordml/cid" xmlns:w16="http://schemas.microsoft.com/office/word/2018/wordml" xmlns:w16du="http://schemas.microsoft.com/office/word/2023/wordml/word16du" xmlns:w16sdtdh="http://schemas.microsoft.com/office/word/2020/wordml/sdtdatahash" xmlns:w16sdtfl="http://schemas.microsoft.com/office/word/2024/wordml/sdtformatlock" xmlns:w16se="http://schemas.microsoft.com/office/word/2015/wordml/symex" xmlns:wpg="http://schemas.microsoft.com/office/word/2010/wordprocessingGroup" xmlns:wpi="http://schemas.microsoft.com/office/word/2010/wordprocessingInk" xmlns:wne="http://schemas.microsoft.com/office/word/2006/wordml" xmlns:wps="http://schemas.microsoft.com/office/word/2010/wordprocessingShape" mc:Ignorable="w14 w15 w16se w16cid w16 w16cex w16sdtdh w16sdtfl w16du wp14">
-  <w:p>
-    <w:pPr>
-      <w:pStyle w:val="Header"/>
-    </w:pPr>
-  </w:p>
-</w:hdr>
-</file>
-
-<file path=word/header2.xml><?xml version="1.0" encoding="utf-8"?>
-<w:hdr xmlns:wpc="http://schemas.microsoft.com/office/word/2010/wordprocessingCanvas" xmlns:cx="http://schemas.microsoft.com/office/drawing/2014/chartex" xmlns:cx1="http://schemas.microsoft.com/office/drawing/2015/9/8/chartex" xmlns:cx2="http://schemas.microsoft.com/office/drawing/2015/10/21/chartex" xmlns:cx3="http://schemas.microsoft.com/office/drawing/2016/5/9/chartex" xmlns:cx4="http://schemas.microsoft.com/office/drawing/2016/5/10/chartex" xmlns:cx5="http://schemas.microsoft.com/office/drawing/2016/5/11/chartex" xmlns:cx6="http://schemas.microsoft.com/office/drawing/2016/5/12/chartex" xmlns:cx7="http://schemas.microsoft.com/office/drawing/2016/5/13/chartex" xmlns:cx8="http://schemas.microsoft.com/office/drawing/2016/5/14/chartex" xmlns:mc="http://schemas.openxmlformats.org/markup-compatibility/2006" xmlns:aink="http://schemas.microsoft.com/office/drawing/2016/ink" xmlns:am3d="http://schemas.microsoft.com/office/drawing/2017/model3d" xmlns:o="urn:schemas-microsoft-com:office:office" xmlns:oel="http://schemas.microsoft.com/office/2019/extlst" xmlns:r="http://schemas.openxmlformats.org/officeDocument/2006/relationships" xmlns:m="http://schemas.openxmlformats.org/officeDocument/2006/math" xmlns:v="urn:schemas-microsoft-com:vml" xmlns:wp14="http://schemas.microsoft.com/office/word/2010/wordprocessingDrawing" xmlns:wp="http://schemas.openxmlformats.org/drawingml/2006/wordprocessingDrawing" xmlns:w10="urn:schemas-microsoft-com:office:word" xmlns:w="http://schemas.openxmlformats.org/wordprocessingml/2006/main" xmlns:w14="http://schemas.microsoft.com/office/word/2010/wordml" xmlns:w15="http://schemas.microsoft.com/office/word/2012/wordml" xmlns:w16cex="http://schemas.microsoft.com/office/word/2018/wordml/cex" xmlns:w16cid="http://schemas.microsoft.com/office/word/2016/wordml/cid" xmlns:w16="http://schemas.microsoft.com/office/word/2018/wordml" xmlns:w16du="http://schemas.microsoft.com/office/word/2023/wordml/word16du" xmlns:w16sdtdh="http://schemas.microsoft.com/office/word/2020/wordml/sdtdatahash" xmlns:w16sdtfl="http://schemas.microsoft.com/office/word/2024/wordml/sdtformatlock" xmlns:w16se="http://schemas.microsoft.com/office/word/2015/wordml/symex" xmlns:wpg="http://schemas.microsoft.com/office/word/2010/wordprocessingGroup" xmlns:wpi="http://schemas.microsoft.com/office/word/2010/wordprocessingInk" xmlns:wne="http://schemas.microsoft.com/office/word/2006/wordml" xmlns:wps="http://schemas.microsoft.com/office/word/2010/wordprocessingShape" mc:Ignorable="w14 w15 w16se w16cid w16 w16cex w16sdtdh w16sdtfl w16du wp14">
-  <w:p>
-    <w:pPr>
-      <w:pStyle w:val="Header"/>
-    </w:pPr>
-  </w:p>
-</w:hdr>
-</file>
-
-<file path=word/header3.xml><?xml version="1.0" encoding="utf-8"?>
-<w:hdr xmlns:wpc="http://schemas.microsoft.com/office/word/2010/wordprocessingCanvas" xmlns:cx="http://schemas.microsoft.com/office/drawing/2014/chartex" xmlns:cx1="http://schemas.microsoft.com/office/drawing/2015/9/8/chartex" xmlns:cx2="http://schemas.microsoft.com/office/drawing/2015/10/21/chartex" xmlns:cx3="http://schemas.microsoft.com/office/drawing/2016/5/9/chartex" xmlns:cx4="http://schemas.microsoft.com/office/drawing/2016/5/10/chartex" xmlns:cx5="http://schemas.microsoft.com/office/drawing/2016/5/11/chartex" xmlns:cx6="http://schemas.microsoft.com/office/drawing/2016/5/12/chartex" xmlns:cx7="http://schemas.microsoft.com/office/drawing/2016/5/13/chartex" xmlns:cx8="http://schemas.microsoft.com/office/drawing/2016/5/14/chartex" xmlns:mc="http://schemas.openxmlformats.org/markup-compatibility/2006" xmlns:aink="http://schemas.microsoft.com/office/drawing/2016/ink" xmlns:am3d="http://schemas.microsoft.com/office/drawing/2017/model3d" xmlns:o="urn:schemas-microsoft-com:office:office" xmlns:oel="http://schemas.microsoft.com/office/2019/extlst" xmlns:r="http://schemas.openxmlformats.org/officeDocument/2006/relationships" xmlns:m="http://schemas.openxmlformats.org/officeDocument/2006/math" xmlns:v="urn:schemas-microsoft-com:vml" xmlns:wp14="http://schemas.microsoft.com/office/word/2010/wordprocessingDrawing" xmlns:wp="http://schemas.openxmlformats.org/drawingml/2006/wordprocessingDrawing" xmlns:w10="urn:schemas-microsoft-com:office:word" xmlns:w="http://schemas.openxmlformats.org/wordprocessingml/2006/main" xmlns:w14="http://schemas.microsoft.com/office/word/2010/wordml" xmlns:w15="http://schemas.microsoft.com/office/word/2012/wordml" xmlns:w16cex="http://schemas.microsoft.com/office/word/2018/wordml/cex" xmlns:w16cid="http://schemas.microsoft.com/office/word/2016/wordml/cid" xmlns:w16="http://schemas.microsoft.com/office/word/2018/wordml" xmlns:w16du="http://schemas.microsoft.com/office/word/2023/wordml/word16du" xmlns:w16sdtdh="http://schemas.microsoft.com/office/word/2020/wordml/sdtdatahash" xmlns:w16sdtfl="http://schemas.microsoft.com/office/word/2024/wordml/sdtformatlock" xmlns:w16se="http://schemas.microsoft.com/office/word/2015/wordml/symex" xmlns:wpg="http://schemas.microsoft.com/office/word/2010/wordprocessingGroup" xmlns:wpi="http://schemas.microsoft.com/office/word/2010/wordprocessingInk" xmlns:wne="http://schemas.microsoft.com/office/word/2006/wordml" xmlns:wps="http://schemas.microsoft.com/office/word/2010/wordprocessingShape" mc:Ignorable="w14 w15 w16se w16cid w16 w16cex w16sdtdh w16sdtfl w16du wp14">
-  <w:p>
-    <w:pPr>
-      <w:pStyle w:val="Header"/>
-    </w:pPr>
-  </w:p>
-</w:hdr>
-</file>
-
 <file path=word/numbering.xml><?xml version="1.0" encoding="utf-8"?>
-<w:numbering xmlns:aink="http://schemas.microsoft.com/office/drawing/2016/ink" xmlns:am3d="http://schemas.microsoft.com/office/drawing/2017/model3d" xmlns:cx="http://schemas.microsoft.com/office/drawing/2014/chartex" xmlns:cx1="http://schemas.microsoft.com/office/drawing/2015/9/8/chartex" xmlns:cx2="http://schemas.microsoft.com/office/drawing/2015/10/21/chartex" xmlns:cx3="http://schemas.microsoft.com/office/drawing/2016/5/9/chartex" xmlns:cx4="http://schemas.microsoft.com/office/drawing/2016/5/10/chartex" xmlns:cx5="http://schemas.microsoft.com/office/drawing/2016/5/11/chartex" xmlns:cx6="http://schemas.microsoft.com/office/drawing/2016/5/12/chartex" xmlns:cx7="http://schemas.microsoft.com/office/drawing/2016/5/13/chartex" xmlns:cx8="http://schemas.microsoft.com/office/drawing/2016/5/14/chartex" xmlns:m="http://schemas.openxmlformats.org/officeDocument/2006/math" xmlns:mc="http://schemas.openxmlformats.org/markup-compatibility/2006" xmlns:o="urn:schemas-microsoft-com:office:office" xmlns:oel="http://schemas.microsoft.com/office/2019/extlst" xmlns:r="http://schemas.openxmlformats.org/officeDocument/2006/relationships" xmlns:v="urn:schemas-microsoft-com:vml" xmlns:w="http://schemas.openxmlformats.org/wordprocessingml/2006/main" xmlns:w10="urn:schemas-microsoft-com:office:word" xmlns:w14="http://schemas.microsoft.com/office/word/2010/wordml" xmlns:w15="http://schemas.microsoft.com/office/word/2012/wordml" xmlns:w16="http://schemas.microsoft.com/office/word/2018/wordml" xmlns:w16cex="http://schemas.microsoft.com/office/word/2018/wordml/cex" xmlns:w16cid="http://schemas.microsoft.com/office/word/2016/wordml/cid" xmlns:w16du="http://schemas.microsoft.com/office/word/2023/wordml/word16du" xmlns:w16sdtdh="http://schemas.microsoft.com/office/word/2020/wordml/sdtdatahash" xmlns:w16sdtfl="http://schemas.microsoft.com/office/word/2024/wordml/sdtformatlock" xmlns:w16se="http://schemas.microsoft.com/office/word/2015/wordml/symex" xmlns:wne="http://schemas.microsoft.com/office/word/2006/wordml" xmlns:wp="http://schemas.openxmlformats.org/drawingml/2006/wordprocessingDrawing" xmlns:wp14="http://schemas.microsoft.com/office/word/2010/wordprocessingDrawing" xmlns:wpc="http://schemas.microsoft.com/office/word/2010/wordprocessingCanvas" xmlns:wpg="http://schemas.microsoft.com/office/word/2010/wordprocessingGroup" xmlns:wpi="http://schemas.microsoft.com/office/word/2010/wordprocessingInk" xmlns:wps="http://schemas.microsoft.com/office/word/2010/wordprocessingShape" mc:Ignorable="w14 w15 w16se w16cid w16 w16cex w16sdtdh w16sdtfl w16du wp14">
-  <w:abstractNum w15:restartNumberingAfterBreak="0" w:abstractNumId="0">
+<w:numbering xmlns:m="http://schemas.openxmlformats.org/officeDocument/2006/math" xmlns:mc="http://schemas.openxmlformats.org/markup-compatibility/2006" xmlns:o="urn:schemas-microsoft-com:office:office" xmlns:r="http://schemas.openxmlformats.org/officeDocument/2006/relationships" xmlns:v="urn:schemas-microsoft-com:vml" xmlns:w="http://schemas.openxmlformats.org/wordprocessingml/2006/main" xmlns:w10="urn:schemas-microsoft-com:office:word" xmlns:w14="http://schemas.microsoft.com/office/word/2010/wordml" xmlns:wne="http://schemas.microsoft.com/office/word/2006/wordml" xmlns:wp="http://schemas.openxmlformats.org/drawingml/2006/wordprocessingDrawing" xmlns:wp14="http://schemas.microsoft.com/office/word/2010/wordprocessingDrawing" xmlns:wpc="http://schemas.microsoft.com/office/word/2010/wordprocessingCanvas" xmlns:wpg="http://schemas.microsoft.com/office/word/2010/wordprocessingGroup" xmlns:wpi="http://schemas.microsoft.com/office/word/2010/wordprocessingInk" xmlns:wps="http://schemas.microsoft.com/office/word/2010/wordprocessingShape" mc:Ignorable="w14 wp14">
+  <w:abstractNum w:abstractNumId="0">
     <w:nsid w:val="5BCE4232"/>
     <w:multiLevelType w:val="hybridMultilevel"/>
-    <w:tmpl w:val="622EFD06"/>
-    <w:lvl w:ilvl="0" w:tplc="0C090001">
+    <w:tmpl w:val="C14AE192"/>
+    <w:lvl w:ilvl="0" w:tplc="4A0AC008">
       <w:start w:val="1"/>
       <w:numFmt w:val="bullet"/>
+      <w:pStyle w:val="ListParagraph"/>
       <w:lvlText w:val=""/>
       <w:lvlJc w:val="left"/>
       <w:pPr>
@@ -1766,7 +1674,7 @@
       </w:rPr>
     </w:lvl>
   </w:abstractNum>
-  <w:num w16cid:durableId="1603538387" w:numId="1">
+  <w:num w:numId="1">
     <w:abstractNumId w:val="0"/>
   </w:num>
   <w:num w:numId="1000">
@@ -1797,7 +1705,7 @@
 </file>
 
 <file path=word/styles.xml><?xml version="1.0" encoding="utf-8"?>
-<w:styles xmlns:mc="http://schemas.openxmlformats.org/markup-compatibility/2006" xmlns:r="http://schemas.openxmlformats.org/officeDocument/2006/relationships" xmlns:w="http://schemas.openxmlformats.org/wordprocessingml/2006/main" xmlns:w14="http://schemas.microsoft.com/office/word/2010/wordml" xmlns:w15="http://schemas.microsoft.com/office/word/2012/wordml" xmlns:w16="http://schemas.microsoft.com/office/word/2018/wordml" xmlns:w16cex="http://schemas.microsoft.com/office/word/2018/wordml/cex" xmlns:w16cid="http://schemas.microsoft.com/office/word/2016/wordml/cid" xmlns:w16du="http://schemas.microsoft.com/office/word/2023/wordml/word16du" xmlns:w16sdtdh="http://schemas.microsoft.com/office/word/2020/wordml/sdtdatahash" xmlns:w16sdtfl="http://schemas.microsoft.com/office/word/2024/wordml/sdtformatlock" xmlns:w16se="http://schemas.microsoft.com/office/word/2015/wordml/symex" mc:Ignorable="w14 w15 w16se w16cid w16 w16cex w16sdtdh w16sdtfl w16du">
+<w:styles xmlns:mc="http://schemas.openxmlformats.org/markup-compatibility/2006" xmlns:r="http://schemas.openxmlformats.org/officeDocument/2006/relationships" xmlns:w="http://schemas.openxmlformats.org/wordprocessingml/2006/main" xmlns:w14="http://schemas.microsoft.com/office/word/2010/wordml" mc:Ignorable="w14">
   <w:docDefaults>
     <w:rPrDefault>
       <w:rPr>
@@ -1813,388 +1721,149 @@
       </w:pPr>
     </w:pPrDefault>
   </w:docDefaults>
-  <w:latentStyles w:count="376" w:defLockedState="0" w:defQFormat="0" w:defSemiHidden="0" w:defUIPriority="99" w:defUnhideWhenUsed="0">
-    <w:lsdException w:name="Normal" w:qFormat="1" w:uiPriority="0"/>
-    <w:lsdException w:name="heading 1" w:qFormat="1" w:uiPriority="9"/>
-    <w:lsdException w:name="heading 2" w:qFormat="1" w:semiHidden="1" w:uiPriority="9" w:unhideWhenUsed="1"/>
-    <w:lsdException w:name="heading 3" w:qFormat="1" w:semiHidden="1" w:uiPriority="9" w:unhideWhenUsed="1"/>
-    <w:lsdException w:name="heading 4" w:qFormat="1" w:semiHidden="1" w:uiPriority="9" w:unhideWhenUsed="1"/>
-    <w:lsdException w:name="heading 5" w:qFormat="1" w:semiHidden="1" w:uiPriority="9" w:unhideWhenUsed="1"/>
-    <w:lsdException w:name="heading 6" w:qFormat="1" w:semiHidden="1" w:uiPriority="9" w:unhideWhenUsed="1"/>
-    <w:lsdException w:name="heading 7" w:qFormat="1" w:semiHidden="1" w:uiPriority="9" w:unhideWhenUsed="1"/>
-    <w:lsdException w:name="heading 8" w:qFormat="1" w:semiHidden="1" w:uiPriority="9" w:unhideWhenUsed="1"/>
-    <w:lsdException w:name="heading 9" w:qFormat="1" w:semiHidden="1" w:uiPriority="9" w:unhideWhenUsed="1"/>
-    <w:lsdException w:name="index 1" w:semiHidden="1" w:unhideWhenUsed="1"/>
-    <w:lsdException w:name="index 2" w:semiHidden="1" w:unhideWhenUsed="1"/>
-    <w:lsdException w:name="index 3" w:semiHidden="1" w:unhideWhenUsed="1"/>
-    <w:lsdException w:name="index 4" w:semiHidden="1" w:unhideWhenUsed="1"/>
-    <w:lsdException w:name="index 5" w:semiHidden="1" w:unhideWhenUsed="1"/>
-    <w:lsdException w:name="index 6" w:semiHidden="1" w:unhideWhenUsed="1"/>
-    <w:lsdException w:name="index 7" w:semiHidden="1" w:unhideWhenUsed="1"/>
-    <w:lsdException w:name="index 8" w:semiHidden="1" w:unhideWhenUsed="1"/>
-    <w:lsdException w:name="index 9" w:semiHidden="1" w:unhideWhenUsed="1"/>
-    <w:lsdException w:name="toc 1" w:semiHidden="1" w:uiPriority="39" w:unhideWhenUsed="1"/>
-    <w:lsdException w:name="toc 2" w:semiHidden="1" w:uiPriority="39" w:unhideWhenUsed="1"/>
-    <w:lsdException w:name="toc 3" w:semiHidden="1" w:uiPriority="39" w:unhideWhenUsed="1"/>
-    <w:lsdException w:name="toc 4" w:semiHidden="1" w:uiPriority="39" w:unhideWhenUsed="1"/>
-    <w:lsdException w:name="toc 5" w:semiHidden="1" w:uiPriority="39" w:unhideWhenUsed="1"/>
-    <w:lsdException w:name="toc 6" w:semiHidden="1" w:uiPriority="39" w:unhideWhenUsed="1"/>
-    <w:lsdException w:name="toc 7" w:semiHidden="1" w:uiPriority="39" w:unhideWhenUsed="1"/>
-    <w:lsdException w:name="toc 8" w:semiHidden="1" w:uiPriority="39" w:unhideWhenUsed="1"/>
-    <w:lsdException w:name="toc 9" w:semiHidden="1" w:uiPriority="39" w:unhideWhenUsed="1"/>
-    <w:lsdException w:name="Normal Indent" w:semiHidden="1" w:unhideWhenUsed="1"/>
-    <w:lsdException w:name="footnote text" w:semiHidden="1" w:unhideWhenUsed="1"/>
-    <w:lsdException w:name="annotation text" w:semiHidden="1" w:unhideWhenUsed="1"/>
-    <w:lsdException w:name="header" w:semiHidden="1" w:unhideWhenUsed="1"/>
-    <w:lsdException w:name="footer" w:semiHidden="1" w:unhideWhenUsed="1"/>
-    <w:lsdException w:name="index heading" w:semiHidden="1" w:unhideWhenUsed="1"/>
-    <w:lsdException w:name="caption" w:qFormat="1" w:semiHidden="1" w:uiPriority="35" w:unhideWhenUsed="1"/>
-    <w:lsdException w:name="table of figures" w:semiHidden="1" w:unhideWhenUsed="1"/>
-    <w:lsdException w:name="envelope address" w:semiHidden="1" w:unhideWhenUsed="1"/>
-    <w:lsdException w:name="envelope return" w:semiHidden="1" w:unhideWhenUsed="1"/>
-    <w:lsdException w:name="footnote reference" w:semiHidden="1" w:unhideWhenUsed="1"/>
-    <w:lsdException w:name="annotation reference" w:semiHidden="1" w:unhideWhenUsed="1"/>
-    <w:lsdException w:name="line number" w:semiHidden="1" w:unhideWhenUsed="1"/>
-    <w:lsdException w:name="page number" w:semiHidden="1" w:unhideWhenUsed="1"/>
-    <w:lsdException w:name="endnote reference" w:semiHidden="1" w:unhideWhenUsed="1"/>
-    <w:lsdException w:name="endnote text" w:semiHidden="1" w:unhideWhenUsed="1"/>
-    <w:lsdException w:name="table of authorities" w:semiHidden="1" w:unhideWhenUsed="1"/>
-    <w:lsdException w:name="macro" w:semiHidden="1" w:unhideWhenUsed="1"/>
-    <w:lsdException w:name="toa heading" w:semiHidden="1" w:unhideWhenUsed="1"/>
-    <w:lsdException w:name="List" w:semiHidden="1" w:unhideWhenUsed="1"/>
-    <w:lsdException w:name="List Bullet" w:semiHidden="1" w:unhideWhenUsed="1"/>
-    <w:lsdException w:name="List Number" w:semiHidden="1" w:unhideWhenUsed="1"/>
-    <w:lsdException w:name="List 2" w:semiHidden="1" w:unhideWhenUsed="1"/>
-    <w:lsdException w:name="List 3" w:semiHidden="1" w:unhideWhenUsed="1"/>
-    <w:lsdException w:name="List 4" w:semiHidden="1" w:unhideWhenUsed="1"/>
-    <w:lsdException w:name="List 5" w:semiHidden="1" w:unhideWhenUsed="1"/>
-    <w:lsdException w:name="List Bullet 2" w:semiHidden="1" w:unhideWhenUsed="1"/>
-    <w:lsdException w:name="List Bullet 3" w:semiHidden="1" w:unhideWhenUsed="1"/>
-    <w:lsdException w:name="List Bullet 4" w:semiHidden="1" w:unhideWhenUsed="1"/>
-    <w:lsdException w:name="List Bullet 5" w:semiHidden="1" w:unhideWhenUsed="1"/>
-    <w:lsdException w:name="List Number 2" w:semiHidden="1" w:unhideWhenUsed="1"/>
-    <w:lsdException w:name="List Number 3" w:semiHidden="1" w:unhideWhenUsed="1"/>
-    <w:lsdException w:name="List Number 4" w:semiHidden="1" w:unhideWhenUsed="1"/>
-    <w:lsdException w:name="List Number 5" w:semiHidden="1" w:unhideWhenUsed="1"/>
-    <w:lsdException w:name="Title" w:qFormat="1" w:uiPriority="10"/>
-    <w:lsdException w:name="Closing" w:semiHidden="1" w:unhideWhenUsed="1"/>
-    <w:lsdException w:name="Signature" w:semiHidden="1" w:unhideWhenUsed="1"/>
-    <w:lsdException w:name="Default Paragraph Font" w:semiHidden="1" w:uiPriority="1" w:unhideWhenUsed="1"/>
-    <w:lsdException w:name="Body Text" w:semiHidden="1" w:unhideWhenUsed="1"/>
-    <w:lsdException w:name="Body Text Indent" w:semiHidden="1" w:unhideWhenUsed="1"/>
-    <w:lsdException w:name="List Continue" w:semiHidden="1" w:unhideWhenUsed="1"/>
-    <w:lsdException w:name="List Continue 2" w:semiHidden="1" w:unhideWhenUsed="1"/>
-    <w:lsdException w:name="List Continue 3" w:semiHidden="1" w:unhideWhenUsed="1"/>
-    <w:lsdException w:name="List Continue 4" w:semiHidden="1" w:unhideWhenUsed="1"/>
-    <w:lsdException w:name="List Continue 5" w:semiHidden="1" w:unhideWhenUsed="1"/>
-    <w:lsdException w:name="Message Header" w:semiHidden="1" w:unhideWhenUsed="1"/>
-    <w:lsdException w:name="Subtitle" w:qFormat="1" w:uiPriority="11"/>
-    <w:lsdException w:name="Salutation" w:semiHidden="1" w:unhideWhenUsed="1"/>
-    <w:lsdException w:name="Date" w:semiHidden="1" w:unhideWhenUsed="1"/>
-    <w:lsdException w:name="Body Text First Indent" w:semiHidden="1" w:unhideWhenUsed="1"/>
-    <w:lsdException w:name="Body Text First Indent 2" w:semiHidden="1" w:unhideWhenUsed="1"/>
-    <w:lsdException w:name="Note Heading" w:semiHidden="1" w:unhideWhenUsed="1"/>
-    <w:lsdException w:name="Body Text 2" w:semiHidden="1" w:unhideWhenUsed="1"/>
-    <w:lsdException w:name="Body Text 3" w:semiHidden="1" w:unhideWhenUsed="1"/>
-    <w:lsdException w:name="Body Text Indent 2" w:semiHidden="1" w:unhideWhenUsed="1"/>
-    <w:lsdException w:name="Body Text Indent 3" w:semiHidden="1" w:unhideWhenUsed="1"/>
-    <w:lsdException w:name="Block Text" w:semiHidden="1" w:unhideWhenUsed="1"/>
-    <w:lsdException w:name="Hyperlink" w:semiHidden="1" w:unhideWhenUsed="1"/>
-    <w:lsdException w:name="FollowedHyperlink" w:semiHidden="1" w:unhideWhenUsed="1"/>
-    <w:lsdException w:name="Strong" w:qFormat="1" w:uiPriority="22"/>
-    <w:lsdException w:name="Emphasis" w:qFormat="1" w:uiPriority="20"/>
-    <w:lsdException w:name="Document Map" w:semiHidden="1" w:unhideWhenUsed="1"/>
-    <w:lsdException w:name="Plain Text" w:semiHidden="1" w:unhideWhenUsed="1"/>
-    <w:lsdException w:name="E-mail Signature" w:semiHidden="1" w:unhideWhenUsed="1"/>
-    <w:lsdException w:name="HTML Top of Form" w:semiHidden="1" w:unhideWhenUsed="1"/>
-    <w:lsdException w:name="HTML Bottom of Form" w:semiHidden="1" w:unhideWhenUsed="1"/>
-    <w:lsdException w:name="Normal (Web)" w:semiHidden="1" w:unhideWhenUsed="1"/>
-    <w:lsdException w:name="HTML Acronym" w:semiHidden="1" w:unhideWhenUsed="1"/>
-    <w:lsdException w:name="HTML Address" w:semiHidden="1" w:unhideWhenUsed="1"/>
-    <w:lsdException w:name="HTML Cite" w:semiHidden="1" w:unhideWhenUsed="1"/>
-    <w:lsdException w:name="HTML Code" w:semiHidden="1" w:unhideWhenUsed="1"/>
-    <w:lsdException w:name="HTML Definition" w:semiHidden="1" w:unhideWhenUsed="1"/>
-    <w:lsdException w:name="HTML Keyboard" w:semiHidden="1" w:unhideWhenUsed="1"/>
-    <w:lsdException w:name="HTML Preformatted" w:semiHidden="1" w:unhideWhenUsed="1"/>
-    <w:lsdException w:name="HTML Sample" w:semiHidden="1" w:unhideWhenUsed="1"/>
-    <w:lsdException w:name="HTML Typewriter" w:semiHidden="1" w:unhideWhenUsed="1"/>
-    <w:lsdException w:name="HTML Variable" w:semiHidden="1" w:unhideWhenUsed="1"/>
-    <w:lsdException w:name="Normal Table" w:semiHidden="1" w:unhideWhenUsed="1"/>
-    <w:lsdException w:name="annotation subject" w:semiHidden="1" w:unhideWhenUsed="1"/>
-    <w:lsdException w:name="No List" w:semiHidden="1" w:unhideWhenUsed="1"/>
-    <w:lsdException w:name="Outline List 1" w:semiHidden="1" w:unhideWhenUsed="1"/>
-    <w:lsdException w:name="Outline List 2" w:semiHidden="1" w:unhideWhenUsed="1"/>
-    <w:lsdException w:name="Outline List 3" w:semiHidden="1" w:unhideWhenUsed="1"/>
-    <w:lsdException w:name="Table Simple 1" w:semiHidden="1" w:unhideWhenUsed="1"/>
-    <w:lsdException w:name="Table Simple 2" w:semiHidden="1" w:unhideWhenUsed="1"/>
-    <w:lsdException w:name="Table Simple 3" w:semiHidden="1" w:unhideWhenUsed="1"/>
-    <w:lsdException w:name="Table Classic 1" w:semiHidden="1" w:unhideWhenUsed="1"/>
-    <w:lsdException w:name="Table Classic 2" w:semiHidden="1" w:unhideWhenUsed="1"/>
-    <w:lsdException w:name="Table Classic 3" w:semiHidden="1" w:unhideWhenUsed="1"/>
-    <w:lsdException w:name="Table Classic 4" w:semiHidden="1" w:unhideWhenUsed="1"/>
-    <w:lsdException w:name="Table Colorful 1" w:semiHidden="1" w:unhideWhenUsed="1"/>
-    <w:lsdException w:name="Table Colorful 2" w:semiHidden="1" w:unhideWhenUsed="1"/>
-    <w:lsdException w:name="Table Colorful 3" w:semiHidden="1" w:unhideWhenUsed="1"/>
-    <w:lsdException w:name="Table Columns 1" w:semiHidden="1" w:unhideWhenUsed="1"/>
-    <w:lsdException w:name="Table Columns 2" w:semiHidden="1" w:unhideWhenUsed="1"/>
-    <w:lsdException w:name="Table Columns 3" w:semiHidden="1" w:unhideWhenUsed="1"/>
-    <w:lsdException w:name="Table Columns 4" w:semiHidden="1" w:unhideWhenUsed="1"/>
-    <w:lsdException w:name="Table Columns 5" w:semiHidden="1" w:unhideWhenUsed="1"/>
-    <w:lsdException w:name="Table Grid 1" w:semiHidden="1" w:unhideWhenUsed="1"/>
-    <w:lsdException w:name="Table Grid 2" w:semiHidden="1" w:unhideWhenUsed="1"/>
-    <w:lsdException w:name="Table Grid 3" w:semiHidden="1" w:unhideWhenUsed="1"/>
-    <w:lsdException w:name="Table Grid 4" w:semiHidden="1" w:unhideWhenUsed="1"/>
-    <w:lsdException w:name="Table Grid 5" w:semiHidden="1" w:unhideWhenUsed="1"/>
-    <w:lsdException w:name="Table Grid 6" w:semiHidden="1" w:unhideWhenUsed="1"/>
-    <w:lsdException w:name="Table Grid 7" w:semiHidden="1" w:unhideWhenUsed="1"/>
-    <w:lsdException w:name="Table Grid 8" w:semiHidden="1" w:unhideWhenUsed="1"/>
-    <w:lsdException w:name="Table List 1" w:semiHidden="1" w:unhideWhenUsed="1"/>
-    <w:lsdException w:name="Table List 2" w:semiHidden="1" w:unhideWhenUsed="1"/>
-    <w:lsdException w:name="Table List 3" w:semiHidden="1" w:unhideWhenUsed="1"/>
-    <w:lsdException w:name="Table List 4" w:semiHidden="1" w:unhideWhenUsed="1"/>
-    <w:lsdException w:name="Table List 5" w:semiHidden="1" w:unhideWhenUsed="1"/>
-    <w:lsdException w:name="Table List 6" w:semiHidden="1" w:unhideWhenUsed="1"/>
-    <w:lsdException w:name="Table List 7" w:semiHidden="1" w:unhideWhenUsed="1"/>
-    <w:lsdException w:name="Table List 8" w:semiHidden="1" w:unhideWhenUsed="1"/>
-    <w:lsdException w:name="Table 3D effects 1" w:semiHidden="1" w:unhideWhenUsed="1"/>
-    <w:lsdException w:name="Table 3D effects 2" w:semiHidden="1" w:unhideWhenUsed="1"/>
-    <w:lsdException w:name="Table 3D effects 3" w:semiHidden="1" w:unhideWhenUsed="1"/>
-    <w:lsdException w:name="Table Contemporary" w:semiHidden="1" w:unhideWhenUsed="1"/>
-    <w:lsdException w:name="Table Elegant" w:semiHidden="1" w:unhideWhenUsed="1"/>
-    <w:lsdException w:name="Table Professional" w:semiHidden="1" w:unhideWhenUsed="1"/>
-    <w:lsdException w:name="Table Subtle 1" w:semiHidden="1" w:unhideWhenUsed="1"/>
-    <w:lsdException w:name="Table Subtle 2" w:semiHidden="1" w:unhideWhenUsed="1"/>
-    <w:lsdException w:name="Table Web 1" w:semiHidden="1" w:unhideWhenUsed="1"/>
-    <w:lsdException w:name="Table Web 2" w:semiHidden="1" w:unhideWhenUsed="1"/>
-    <w:lsdException w:name="Table Web 3" w:semiHidden="1" w:unhideWhenUsed="1"/>
-    <w:lsdException w:name="Balloon Text" w:semiHidden="1" w:unhideWhenUsed="1"/>
-    <w:lsdException w:name="Table Grid" w:uiPriority="59"/>
-    <w:lsdException w:name="Table Theme" w:semiHidden="1" w:unhideWhenUsed="1"/>
-    <w:lsdException w:name="Placeholder Text" w:semiHidden="1"/>
-    <w:lsdException w:name="No Spacing" w:qFormat="1" w:uiPriority="1"/>
-    <w:lsdException w:name="Light Shading" w:uiPriority="60"/>
-    <w:lsdException w:name="Light List" w:uiPriority="61"/>
-    <w:lsdException w:name="Light Grid" w:uiPriority="62"/>
-    <w:lsdException w:name="Medium Shading 1" w:uiPriority="63"/>
-    <w:lsdException w:name="Medium Shading 2" w:uiPriority="64"/>
-    <w:lsdException w:name="Medium List 1" w:uiPriority="65"/>
-    <w:lsdException w:name="Medium List 2" w:uiPriority="66"/>
-    <w:lsdException w:name="Medium Grid 1" w:uiPriority="67"/>
-    <w:lsdException w:name="Medium Grid 2" w:uiPriority="68"/>
-    <w:lsdException w:name="Medium Grid 3" w:uiPriority="69"/>
-    <w:lsdException w:name="Dark List" w:uiPriority="70"/>
-    <w:lsdException w:name="Colorful Shading" w:uiPriority="71"/>
-    <w:lsdException w:name="Colorful List" w:uiPriority="72"/>
-    <w:lsdException w:name="Colorful Grid" w:uiPriority="73"/>
-    <w:lsdException w:name="Light Shading Accent 1" w:uiPriority="60"/>
-    <w:lsdException w:name="Light List Accent 1" w:uiPriority="61"/>
-    <w:lsdException w:name="Light Grid Accent 1" w:uiPriority="62"/>
-    <w:lsdException w:name="Medium Shading 1 Accent 1" w:uiPriority="63"/>
-    <w:lsdException w:name="Medium Shading 2 Accent 1" w:uiPriority="64"/>
-    <w:lsdException w:name="Medium List 1 Accent 1" w:uiPriority="65"/>
-    <w:lsdException w:name="Revision" w:semiHidden="1"/>
-    <w:lsdException w:name="List Paragraph" w:qFormat="1" w:uiPriority="34"/>
-    <w:lsdException w:name="Quote" w:qFormat="1" w:uiPriority="29"/>
-    <w:lsdException w:name="Intense Quote" w:qFormat="1" w:uiPriority="30"/>
-    <w:lsdException w:name="Medium List 2 Accent 1" w:uiPriority="66"/>
-    <w:lsdException w:name="Medium Grid 1 Accent 1" w:uiPriority="67"/>
-    <w:lsdException w:name="Medium Grid 2 Accent 1" w:uiPriority="68"/>
-    <w:lsdException w:name="Medium Grid 3 Accent 1" w:uiPriority="69"/>
-    <w:lsdException w:name="Dark List Accent 1" w:uiPriority="70"/>
-    <w:lsdException w:name="Colorful Shading Accent 1" w:uiPriority="71"/>
-    <w:lsdException w:name="Colorful List Accent 1" w:uiPriority="72"/>
-    <w:lsdException w:name="Colorful Grid Accent 1" w:uiPriority="73"/>
-    <w:lsdException w:name="Light Shading Accent 2" w:uiPriority="60"/>
-    <w:lsdException w:name="Light List Accent 2" w:uiPriority="61"/>
-    <w:lsdException w:name="Light Grid Accent 2" w:uiPriority="62"/>
-    <w:lsdException w:name="Medium Shading 1 Accent 2" w:uiPriority="63"/>
-    <w:lsdException w:name="Medium Shading 2 Accent 2" w:uiPriority="64"/>
-    <w:lsdException w:name="Medium List 1 Accent 2" w:uiPriority="65"/>
-    <w:lsdException w:name="Medium List 2 Accent 2" w:uiPriority="66"/>
-    <w:lsdException w:name="Medium Grid 1 Accent 2" w:uiPriority="67"/>
-    <w:lsdException w:name="Medium Grid 2 Accent 2" w:uiPriority="68"/>
-    <w:lsdException w:name="Medium Grid 3 Accent 2" w:uiPriority="69"/>
-    <w:lsdException w:name="Dark List Accent 2" w:uiPriority="70"/>
-    <w:lsdException w:name="Colorful Shading Accent 2" w:uiPriority="71"/>
-    <w:lsdException w:name="Colorful List Accent 2" w:uiPriority="72"/>
-    <w:lsdException w:name="Colorful Grid Accent 2" w:uiPriority="73"/>
-    <w:lsdException w:name="Light Shading Accent 3" w:uiPriority="60"/>
-    <w:lsdException w:name="Light List Accent 3" w:uiPriority="61"/>
-    <w:lsdException w:name="Light Grid Accent 3" w:uiPriority="62"/>
-    <w:lsdException w:name="Medium Shading 1 Accent 3" w:uiPriority="63"/>
-    <w:lsdException w:name="Medium Shading 2 Accent 3" w:uiPriority="64"/>
-    <w:lsdException w:name="Medium List 1 Accent 3" w:uiPriority="65"/>
-    <w:lsdException w:name="Medium List 2 Accent 3" w:uiPriority="66"/>
-    <w:lsdException w:name="Medium Grid 1 Accent 3" w:uiPriority="67"/>
-    <w:lsdException w:name="Medium Grid 2 Accent 3" w:uiPriority="68"/>
-    <w:lsdException w:name="Medium Grid 3 Accent 3" w:uiPriority="69"/>
-    <w:lsdException w:name="Dark List Accent 3" w:uiPriority="70"/>
-    <w:lsdException w:name="Colorful Shading Accent 3" w:uiPriority="71"/>
-    <w:lsdException w:name="Colorful List Accent 3" w:uiPriority="72"/>
-    <w:lsdException w:name="Colorful Grid Accent 3" w:uiPriority="73"/>
-    <w:lsdException w:name="Light Shading Accent 4" w:uiPriority="60"/>
-    <w:lsdException w:name="Light List Accent 4" w:uiPriority="61"/>
-    <w:lsdException w:name="Light Grid Accent 4" w:uiPriority="62"/>
-    <w:lsdException w:name="Medium Shading 1 Accent 4" w:uiPriority="63"/>
-    <w:lsdException w:name="Medium Shading 2 Accent 4" w:uiPriority="64"/>
-    <w:lsdException w:name="Medium List 1 Accent 4" w:uiPriority="65"/>
-    <w:lsdException w:name="Medium List 2 Accent 4" w:uiPriority="66"/>
-    <w:lsdException w:name="Medium Grid 1 Accent 4" w:uiPriority="67"/>
-    <w:lsdException w:name="Medium Grid 2 Accent 4" w:uiPriority="68"/>
-    <w:lsdException w:name="Medium Grid 3 Accent 4" w:uiPriority="69"/>
-    <w:lsdException w:name="Dark List Accent 4" w:uiPriority="70"/>
-    <w:lsdException w:name="Colorful Shading Accent 4" w:uiPriority="71"/>
-    <w:lsdException w:name="Colorful List Accent 4" w:uiPriority="72"/>
-    <w:lsdException w:name="Colorful Grid Accent 4" w:uiPriority="73"/>
-    <w:lsdException w:name="Light Shading Accent 5" w:uiPriority="60"/>
-    <w:lsdException w:name="Light List Accent 5" w:uiPriority="61"/>
-    <w:lsdException w:name="Light Grid Accent 5" w:uiPriority="62"/>
-    <w:lsdException w:name="Medium Shading 1 Accent 5" w:uiPriority="63"/>
-    <w:lsdException w:name="Medium Shading 2 Accent 5" w:uiPriority="64"/>
-    <w:lsdException w:name="Medium List 1 Accent 5" w:uiPriority="65"/>
-    <w:lsdException w:name="Medium List 2 Accent 5" w:uiPriority="66"/>
-    <w:lsdException w:name="Medium Grid 1 Accent 5" w:uiPriority="67"/>
-    <w:lsdException w:name="Medium Grid 2 Accent 5" w:uiPriority="68"/>
-    <w:lsdException w:name="Medium Grid 3 Accent 5" w:uiPriority="69"/>
-    <w:lsdException w:name="Dark List Accent 5" w:uiPriority="70"/>
-    <w:lsdException w:name="Colorful Shading Accent 5" w:uiPriority="71"/>
-    <w:lsdException w:name="Colorful List Accent 5" w:uiPriority="72"/>
-    <w:lsdException w:name="Colorful Grid Accent 5" w:uiPriority="73"/>
-    <w:lsdException w:name="Light Shading Accent 6" w:uiPriority="60"/>
-    <w:lsdException w:name="Light List Accent 6" w:uiPriority="61"/>
-    <w:lsdException w:name="Light Grid Accent 6" w:uiPriority="62"/>
-    <w:lsdException w:name="Medium Shading 1 Accent 6" w:uiPriority="63"/>
-    <w:lsdException w:name="Medium Shading 2 Accent 6" w:uiPriority="64"/>
-    <w:lsdException w:name="Medium List 1 Accent 6" w:uiPriority="65"/>
-    <w:lsdException w:name="Medium List 2 Accent 6" w:uiPriority="66"/>
-    <w:lsdException w:name="Medium Grid 1 Accent 6" w:uiPriority="67"/>
-    <w:lsdException w:name="Medium Grid 2 Accent 6" w:uiPriority="68"/>
-    <w:lsdException w:name="Medium Grid 3 Accent 6" w:uiPriority="69"/>
-    <w:lsdException w:name="Dark List Accent 6" w:uiPriority="70"/>
-    <w:lsdException w:name="Colorful Shading Accent 6" w:uiPriority="71"/>
-    <w:lsdException w:name="Colorful List Accent 6" w:uiPriority="72"/>
-    <w:lsdException w:name="Colorful Grid Accent 6" w:uiPriority="73"/>
-    <w:lsdException w:name="Subtle Emphasis" w:qFormat="1" w:uiPriority="19"/>
-    <w:lsdException w:name="Intense Emphasis" w:qFormat="1" w:uiPriority="21"/>
-    <w:lsdException w:name="Subtle Reference" w:qFormat="1" w:uiPriority="31"/>
-    <w:lsdException w:name="Intense Reference" w:qFormat="1" w:uiPriority="32"/>
-    <w:lsdException w:name="Book Title" w:qFormat="1" w:uiPriority="33"/>
-    <w:lsdException w:name="Bibliography" w:semiHidden="1" w:uiPriority="37" w:unhideWhenUsed="1"/>
-    <w:lsdException w:name="TOC Heading" w:qFormat="1" w:semiHidden="1" w:uiPriority="39" w:unhideWhenUsed="1"/>
-    <w:lsdException w:name="Plain Table 1" w:uiPriority="41"/>
-    <w:lsdException w:name="Plain Table 2" w:uiPriority="42"/>
-    <w:lsdException w:name="Plain Table 3" w:uiPriority="43"/>
-    <w:lsdException w:name="Plain Table 4" w:uiPriority="44"/>
-    <w:lsdException w:name="Plain Table 5" w:uiPriority="45"/>
-    <w:lsdException w:name="Grid Table Light" w:uiPriority="40"/>
-    <w:lsdException w:name="Grid Table 1 Light" w:uiPriority="46"/>
-    <w:lsdException w:name="Grid Table 2" w:uiPriority="47"/>
-    <w:lsdException w:name="Grid Table 3" w:uiPriority="48"/>
-    <w:lsdException w:name="Grid Table 4" w:uiPriority="49"/>
-    <w:lsdException w:name="Grid Table 5 Dark" w:uiPriority="50"/>
-    <w:lsdException w:name="Grid Table 6 Colorful" w:uiPriority="51"/>
-    <w:lsdException w:name="Grid Table 7 Colorful" w:uiPriority="52"/>
-    <w:lsdException w:name="Grid Table 1 Light Accent 1" w:uiPriority="46"/>
-    <w:lsdException w:name="Grid Table 2 Accent 1" w:uiPriority="47"/>
-    <w:lsdException w:name="Grid Table 3 Accent 1" w:uiPriority="48"/>
-    <w:lsdException w:name="Grid Table 4 Accent 1" w:uiPriority="49"/>
-    <w:lsdException w:name="Grid Table 5 Dark Accent 1" w:uiPriority="50"/>
-    <w:lsdException w:name="Grid Table 6 Colorful Accent 1" w:uiPriority="51"/>
-    <w:lsdException w:name="Grid Table 7 Colorful Accent 1" w:uiPriority="52"/>
-    <w:lsdException w:name="Grid Table 1 Light Accent 2" w:uiPriority="46"/>
-    <w:lsdException w:name="Grid Table 2 Accent 2" w:uiPriority="47"/>
-    <w:lsdException w:name="Grid Table 3 Accent 2" w:uiPriority="48"/>
-    <w:lsdException w:name="Grid Table 4 Accent 2" w:uiPriority="49"/>
-    <w:lsdException w:name="Grid Table 5 Dark Accent 2" w:uiPriority="50"/>
-    <w:lsdException w:name="Grid Table 6 Colorful Accent 2" w:uiPriority="51"/>
-    <w:lsdException w:name="Grid Table 7 Colorful Accent 2" w:uiPriority="52"/>
-    <w:lsdException w:name="Grid Table 1 Light Accent 3" w:uiPriority="46"/>
-    <w:lsdException w:name="Grid Table 2 Accent 3" w:uiPriority="47"/>
-    <w:lsdException w:name="Grid Table 3 Accent 3" w:uiPriority="48"/>
-    <w:lsdException w:name="Grid Table 4 Accent 3" w:uiPriority="49"/>
-    <w:lsdException w:name="Grid Table 5 Dark Accent 3" w:uiPriority="50"/>
-    <w:lsdException w:name="Grid Table 6 Colorful Accent 3" w:uiPriority="51"/>
-    <w:lsdException w:name="Grid Table 7 Colorful Accent 3" w:uiPriority="52"/>
-    <w:lsdException w:name="Grid Table 1 Light Accent 4" w:uiPriority="46"/>
-    <w:lsdException w:name="Grid Table 2 Accent 4" w:uiPriority="47"/>
-    <w:lsdException w:name="Grid Table 3 Accent 4" w:uiPriority="48"/>
-    <w:lsdException w:name="Grid Table 4 Accent 4" w:uiPriority="49"/>
-    <w:lsdException w:name="Grid Table 5 Dark Accent 4" w:uiPriority="50"/>
-    <w:lsdException w:name="Grid Table 6 Colorful Accent 4" w:uiPriority="51"/>
-    <w:lsdException w:name="Grid Table 7 Colorful Accent 4" w:uiPriority="52"/>
-    <w:lsdException w:name="Grid Table 1 Light Accent 5" w:uiPriority="46"/>
-    <w:lsdException w:name="Grid Table 2 Accent 5" w:uiPriority="47"/>
-    <w:lsdException w:name="Grid Table 3 Accent 5" w:uiPriority="48"/>
-    <w:lsdException w:name="Grid Table 4 Accent 5" w:uiPriority="49"/>
-    <w:lsdException w:name="Grid Table 5 Dark Accent 5" w:uiPriority="50"/>
-    <w:lsdException w:name="Grid Table 6 Colorful Accent 5" w:uiPriority="51"/>
-    <w:lsdException w:name="Grid Table 7 Colorful Accent 5" w:uiPriority="52"/>
-    <w:lsdException w:name="Grid Table 1 Light Accent 6" w:uiPriority="46"/>
-    <w:lsdException w:name="Grid Table 2 Accent 6" w:uiPriority="47"/>
-    <w:lsdException w:name="Grid Table 3 Accent 6" w:uiPriority="48"/>
-    <w:lsdException w:name="Grid Table 4 Accent 6" w:uiPriority="49"/>
-    <w:lsdException w:name="Grid Table 5 Dark Accent 6" w:uiPriority="50"/>
-    <w:lsdException w:name="Grid Table 6 Colorful Accent 6" w:uiPriority="51"/>
-    <w:lsdException w:name="Grid Table 7 Colorful Accent 6" w:uiPriority="52"/>
-    <w:lsdException w:name="List Table 1 Light" w:uiPriority="46"/>
-    <w:lsdException w:name="List Table 2" w:uiPriority="47"/>
-    <w:lsdException w:name="List Table 3" w:uiPriority="48"/>
-    <w:lsdException w:name="List Table 4" w:uiPriority="49"/>
-    <w:lsdException w:name="List Table 5 Dark" w:uiPriority="50"/>
-    <w:lsdException w:name="List Table 6 Colorful" w:uiPriority="51"/>
-    <w:lsdException w:name="List Table 7 Colorful" w:uiPriority="52"/>
-    <w:lsdException w:name="List Table 1 Light Accent 1" w:uiPriority="46"/>
-    <w:lsdException w:name="List Table 2 Accent 1" w:uiPriority="47"/>
-    <w:lsdException w:name="List Table 3 Accent 1" w:uiPriority="48"/>
-    <w:lsdException w:name="List Table 4 Accent 1" w:uiPriority="49"/>
-    <w:lsdException w:name="List Table 5 Dark Accent 1" w:uiPriority="50"/>
-    <w:lsdException w:name="List Table 6 Colorful Accent 1" w:uiPriority="51"/>
-    <w:lsdException w:name="List Table 7 Colorful Accent 1" w:uiPriority="52"/>
-    <w:lsdException w:name="List Table 1 Light Accent 2" w:uiPriority="46"/>
-    <w:lsdException w:name="List Table 2 Accent 2" w:uiPriority="47"/>
-    <w:lsdException w:name="List Table 3 Accent 2" w:uiPriority="48"/>
-    <w:lsdException w:name="List Table 4 Accent 2" w:uiPriority="49"/>
-    <w:lsdException w:name="List Table 5 Dark Accent 2" w:uiPriority="50"/>
-    <w:lsdException w:name="List Table 6 Colorful Accent 2" w:uiPriority="51"/>
-    <w:lsdException w:name="List Table 7 Colorful Accent 2" w:uiPriority="52"/>
-    <w:lsdException w:name="List Table 1 Light Accent 3" w:uiPriority="46"/>
-    <w:lsdException w:name="List Table 2 Accent 3" w:uiPriority="47"/>
-    <w:lsdException w:name="List Table 3 Accent 3" w:uiPriority="48"/>
-    <w:lsdException w:name="List Table 4 Accent 3" w:uiPriority="49"/>
-    <w:lsdException w:name="List Table 5 Dark Accent 3" w:uiPriority="50"/>
-    <w:lsdException w:name="List Table 6 Colorful Accent 3" w:uiPriority="51"/>
-    <w:lsdException w:name="List Table 7 Colorful Accent 3" w:uiPriority="52"/>
-    <w:lsdException w:name="List Table 1 Light Accent 4" w:uiPriority="46"/>
-    <w:lsdException w:name="List Table 2 Accent 4" w:uiPriority="47"/>
-    <w:lsdException w:name="List Table 3 Accent 4" w:uiPriority="48"/>
-    <w:lsdException w:name="List Table 4 Accent 4" w:uiPriority="49"/>
-    <w:lsdException w:name="List Table 5 Dark Accent 4" w:uiPriority="50"/>
-    <w:lsdException w:name="List Table 6 Colorful Accent 4" w:uiPriority="51"/>
-    <w:lsdException w:name="List Table 7 Colorful Accent 4" w:uiPriority="52"/>
-    <w:lsdException w:name="List Table 1 Light Accent 5" w:uiPriority="46"/>
-    <w:lsdException w:name="List Table 2 Accent 5" w:uiPriority="47"/>
-    <w:lsdException w:name="List Table 3 Accent 5" w:uiPriority="48"/>
-    <w:lsdException w:name="List Table 4 Accent 5" w:uiPriority="49"/>
-    <w:lsdException w:name="List Table 5 Dark Accent 5" w:uiPriority="50"/>
-    <w:lsdException w:name="List Table 6 Colorful Accent 5" w:uiPriority="51"/>
-    <w:lsdException w:name="List Table 7 Colorful Accent 5" w:uiPriority="52"/>
-    <w:lsdException w:name="List Table 1 Light Accent 6" w:uiPriority="46"/>
-    <w:lsdException w:name="List Table 2 Accent 6" w:uiPriority="47"/>
-    <w:lsdException w:name="List Table 3 Accent 6" w:uiPriority="48"/>
-    <w:lsdException w:name="List Table 4 Accent 6" w:uiPriority="49"/>
-    <w:lsdException w:name="List Table 5 Dark Accent 6" w:uiPriority="50"/>
-    <w:lsdException w:name="List Table 6 Colorful Accent 6" w:uiPriority="51"/>
-    <w:lsdException w:name="List Table 7 Colorful Accent 6" w:uiPriority="52"/>
-    <w:lsdException w:name="Mention" w:semiHidden="1" w:unhideWhenUsed="1"/>
-    <w:lsdException w:name="Smart Hyperlink" w:semiHidden="1" w:unhideWhenUsed="1"/>
-    <w:lsdException w:name="Hashtag" w:semiHidden="1" w:unhideWhenUsed="1"/>
-    <w:lsdException w:name="Unresolved Mention" w:semiHidden="1" w:unhideWhenUsed="1"/>
-    <w:lsdException w:name="Smart Link" w:semiHidden="1" w:unhideWhenUsed="1"/>
+  <w:latentStyles w:count="267" w:defLockedState="0" w:defQFormat="0" w:defSemiHidden="1" w:defUIPriority="99" w:defUnhideWhenUsed="1">
+    <w:lsdException w:name="Normal" w:qFormat="1" w:semiHidden="0" w:uiPriority="0" w:unhideWhenUsed="0"/>
+    <w:lsdException w:name="heading 1" w:qFormat="1" w:semiHidden="0" w:uiPriority="9" w:unhideWhenUsed="0"/>
+    <w:lsdException w:name="heading 2" w:qFormat="1" w:uiPriority="9"/>
+    <w:lsdException w:name="heading 3" w:qFormat="1" w:uiPriority="9"/>
+    <w:lsdException w:name="heading 4" w:qFormat="1" w:uiPriority="9"/>
+    <w:lsdException w:name="heading 5" w:qFormat="1" w:uiPriority="9"/>
+    <w:lsdException w:name="heading 6" w:qFormat="1" w:uiPriority="9"/>
+    <w:lsdException w:name="heading 7" w:qFormat="1" w:uiPriority="9"/>
+    <w:lsdException w:name="heading 8" w:qFormat="1" w:uiPriority="9"/>
+    <w:lsdException w:name="heading 9" w:qFormat="1" w:uiPriority="9"/>
+    <w:lsdException w:name="toc 1" w:uiPriority="39"/>
+    <w:lsdException w:name="toc 2" w:uiPriority="39"/>
+    <w:lsdException w:name="toc 3" w:uiPriority="39"/>
+    <w:lsdException w:name="toc 4" w:uiPriority="39"/>
+    <w:lsdException w:name="toc 5" w:uiPriority="39"/>
+    <w:lsdException w:name="toc 6" w:uiPriority="39"/>
+    <w:lsdException w:name="toc 7" w:uiPriority="39"/>
+    <w:lsdException w:name="toc 8" w:uiPriority="39"/>
+    <w:lsdException w:name="toc 9" w:uiPriority="39"/>
+    <w:lsdException w:name="caption" w:qFormat="1" w:uiPriority="35"/>
+    <w:lsdException w:name="Title" w:qFormat="1" w:semiHidden="0" w:uiPriority="10" w:unhideWhenUsed="0"/>
+    <w:lsdException w:name="Default Paragraph Font" w:uiPriority="1"/>
+    <w:lsdException w:name="Subtitle" w:qFormat="1" w:semiHidden="0" w:uiPriority="11" w:unhideWhenUsed="0"/>
+    <w:lsdException w:name="Strong" w:qFormat="1" w:semiHidden="0" w:uiPriority="22" w:unhideWhenUsed="0"/>
+    <w:lsdException w:name="Emphasis" w:qFormat="1" w:semiHidden="0" w:uiPriority="20" w:unhideWhenUsed="0"/>
+    <w:lsdException w:name="Table Grid" w:semiHidden="0" w:uiPriority="59" w:unhideWhenUsed="0"/>
+    <w:lsdException w:name="Placeholder Text" w:unhideWhenUsed="0"/>
+    <w:lsdException w:name="No Spacing" w:qFormat="1" w:semiHidden="0" w:uiPriority="1" w:unhideWhenUsed="0"/>
+    <w:lsdException w:name="Light Shading" w:semiHidden="0" w:uiPriority="60" w:unhideWhenUsed="0"/>
+    <w:lsdException w:name="Light List" w:semiHidden="0" w:uiPriority="61" w:unhideWhenUsed="0"/>
+    <w:lsdException w:name="Light Grid" w:semiHidden="0" w:uiPriority="62" w:unhideWhenUsed="0"/>
+    <w:lsdException w:name="Medium Shading 1" w:semiHidden="0" w:uiPriority="63" w:unhideWhenUsed="0"/>
+    <w:lsdException w:name="Medium Shading 2" w:semiHidden="0" w:uiPriority="64" w:unhideWhenUsed="0"/>
+    <w:lsdException w:name="Medium List 1" w:semiHidden="0" w:uiPriority="65" w:unhideWhenUsed="0"/>
+    <w:lsdException w:name="Medium List 2" w:semiHidden="0" w:uiPriority="66" w:unhideWhenUsed="0"/>
+    <w:lsdException w:name="Medium Grid 1" w:semiHidden="0" w:uiPriority="67" w:unhideWhenUsed="0"/>
+    <w:lsdException w:name="Medium Grid 2" w:semiHidden="0" w:uiPriority="68" w:unhideWhenUsed="0"/>
+    <w:lsdException w:name="Medium Grid 3" w:semiHidden="0" w:uiPriority="69" w:unhideWhenUsed="0"/>
+    <w:lsdException w:name="Dark List" w:semiHidden="0" w:uiPriority="70" w:unhideWhenUsed="0"/>
+    <w:lsdException w:name="Colorful Shading" w:semiHidden="0" w:uiPriority="71" w:unhideWhenUsed="0"/>
+    <w:lsdException w:name="Colorful List" w:semiHidden="0" w:uiPriority="72" w:unhideWhenUsed="0"/>
+    <w:lsdException w:name="Colorful Grid" w:semiHidden="0" w:uiPriority="73" w:unhideWhenUsed="0"/>
+    <w:lsdException w:name="Light Shading Accent 1" w:semiHidden="0" w:uiPriority="60" w:unhideWhenUsed="0"/>
+    <w:lsdException w:name="Light List Accent 1" w:semiHidden="0" w:uiPriority="61" w:unhideWhenUsed="0"/>
+    <w:lsdException w:name="Light Grid Accent 1" w:semiHidden="0" w:uiPriority="62" w:unhideWhenUsed="0"/>
+    <w:lsdException w:name="Medium Shading 1 Accent 1" w:semiHidden="0" w:uiPriority="63" w:unhideWhenUsed="0"/>
+    <w:lsdException w:name="Medium Shading 2 Accent 1" w:semiHidden="0" w:uiPriority="64" w:unhideWhenUsed="0"/>
+    <w:lsdException w:name="Medium List 1 Accent 1" w:semiHidden="0" w:uiPriority="65" w:unhideWhenUsed="0"/>
+    <w:lsdException w:name="Revision" w:unhideWhenUsed="0"/>
+    <w:lsdException w:name="List Paragraph" w:qFormat="1" w:semiHidden="0" w:uiPriority="34" w:unhideWhenUsed="0"/>
+    <w:lsdException w:name="Quote" w:qFormat="1" w:semiHidden="0" w:uiPriority="29" w:unhideWhenUsed="0"/>
+    <w:lsdException w:name="Intense Quote" w:qFormat="1" w:semiHidden="0" w:uiPriority="30" w:unhideWhenUsed="0"/>
+    <w:lsdException w:name="Medium List 2 Accent 1" w:semiHidden="0" w:uiPriority="66" w:unhideWhenUsed="0"/>
+    <w:lsdException w:name="Medium Grid 1 Accent 1" w:semiHidden="0" w:uiPriority="67" w:unhideWhenUsed="0"/>
+    <w:lsdException w:name="Medium Grid 2 Accent 1" w:semiHidden="0" w:uiPriority="68" w:unhideWhenUsed="0"/>
+    <w:lsdException w:name="Medium Grid 3 Accent 1" w:semiHidden="0" w:uiPriority="69" w:unhideWhenUsed="0"/>
+    <w:lsdException w:name="Dark List Accent 1" w:semiHidden="0" w:uiPriority="70" w:unhideWhenUsed="0"/>
+    <w:lsdException w:name="Colorful Shading Accent 1" w:semiHidden="0" w:uiPriority="71" w:unhideWhenUsed="0"/>
+    <w:lsdException w:name="Colorful List Accent 1" w:semiHidden="0" w:uiPriority="72" w:unhideWhenUsed="0"/>
+    <w:lsdException w:name="Colorful Grid Accent 1" w:semiHidden="0" w:uiPriority="73" w:unhideWhenUsed="0"/>
+    <w:lsdException w:name="Light Shading Accent 2" w:semiHidden="0" w:uiPriority="60" w:unhideWhenUsed="0"/>
+    <w:lsdException w:name="Light List Accent 2" w:semiHidden="0" w:uiPriority="61" w:unhideWhenUsed="0"/>
+    <w:lsdException w:name="Light Grid Accent 2" w:semiHidden="0" w:uiPriority="62" w:unhideWhenUsed="0"/>
+    <w:lsdException w:name="Medium Shading 1 Accent 2" w:semiHidden="0" w:uiPriority="63" w:unhideWhenUsed="0"/>
+    <w:lsdException w:name="Medium Shading 2 Accent 2" w:semiHidden="0" w:uiPriority="64" w:unhideWhenUsed="0"/>
+    <w:lsdException w:name="Medium List 1 Accent 2" w:semiHidden="0" w:uiPriority="65" w:unhideWhenUsed="0"/>
+    <w:lsdException w:name="Medium List 2 Accent 2" w:semiHidden="0" w:uiPriority="66" w:unhideWhenUsed="0"/>
+    <w:lsdException w:name="Medium Grid 1 Accent 2" w:semiHidden="0" w:uiPriority="67" w:unhideWhenUsed="0"/>
+    <w:lsdException w:name="Medium Grid 2 Accent 2" w:semiHidden="0" w:uiPriority="68" w:unhideWhenUsed="0"/>
+    <w:lsdException w:name="Medium Grid 3 Accent 2" w:semiHidden="0" w:uiPriority="69" w:unhideWhenUsed="0"/>
+    <w:lsdException w:name="Dark List Accent 2" w:semiHidden="0" w:uiPriority="70" w:unhideWhenUsed="0"/>
+    <w:lsdException w:name="Colorful Shading Accent 2" w:semiHidden="0" w:uiPriority="71" w:unhideWhenUsed="0"/>
+    <w:lsdException w:name="Colorful List Accent 2" w:semiHidden="0" w:uiPriority="72" w:unhideWhenUsed="0"/>
+    <w:lsdException w:name="Colorful Grid Accent 2" w:semiHidden="0" w:uiPriority="73" w:unhideWhenUsed="0"/>
+    <w:lsdException w:name="Light Shading Accent 3" w:semiHidden="0" w:uiPriority="60" w:unhideWhenUsed="0"/>
+    <w:lsdException w:name="Light List Accent 3" w:semiHidden="0" w:uiPriority="61" w:unhideWhenUsed="0"/>
+    <w:lsdException w:name="Light Grid Accent 3" w:semiHidden="0" w:uiPriority="62" w:unhideWhenUsed="0"/>
+    <w:lsdException w:name="Medium Shading 1 Accent 3" w:semiHidden="0" w:uiPriority="63" w:unhideWhenUsed="0"/>
+    <w:lsdException w:name="Medium Shading 2 Accent 3" w:semiHidden="0" w:uiPriority="64" w:unhideWhenUsed="0"/>
+    <w:lsdException w:name="Medium List 1 Accent 3" w:semiHidden="0" w:uiPriority="65" w:unhideWhenUsed="0"/>
+    <w:lsdException w:name="Medium List 2 Accent 3" w:semiHidden="0" w:uiPriority="66" w:unhideWhenUsed="0"/>
+    <w:lsdException w:name="Medium Grid 1 Accent 3" w:semiHidden="0" w:uiPriority="67" w:unhideWhenUsed="0"/>
+    <w:lsdException w:name="Medium Grid 2 Accent 3" w:semiHidden="0" w:uiPriority="68" w:unhideWhenUsed="0"/>
+    <w:lsdException w:name="Medium Grid 3 Accent 3" w:semiHidden="0" w:uiPriority="69" w:unhideWhenUsed="0"/>
+    <w:lsdException w:name="Dark List Accent 3" w:semiHidden="0" w:uiPriority="70" w:unhideWhenUsed="0"/>
+    <w:lsdException w:name="Colorful Shading Accent 3" w:semiHidden="0" w:uiPriority="71" w:unhideWhenUsed="0"/>
+    <w:lsdException w:name="Colorful List Accent 3" w:semiHidden="0" w:uiPriority="72" w:unhideWhenUsed="0"/>
+    <w:lsdException w:name="Colorful Grid Accent 3" w:semiHidden="0" w:uiPriority="73" w:unhideWhenUsed="0"/>
+    <w:lsdException w:name="Light Shading Accent 4" w:semiHidden="0" w:uiPriority="60" w:unhideWhenUsed="0"/>
+    <w:lsdException w:name="Light List Accent 4" w:semiHidden="0" w:uiPriority="61" w:unhideWhenUsed="0"/>
+    <w:lsdException w:name="Light Grid Accent 4" w:semiHidden="0" w:uiPriority="62" w:unhideWhenUsed="0"/>
+    <w:lsdException w:name="Medium Shading 1 Accent 4" w:semiHidden="0" w:uiPriority="63" w:unhideWhenUsed="0"/>
+    <w:lsdException w:name="Medium Shading 2 Accent 4" w:semiHidden="0" w:uiPriority="64" w:unhideWhenUsed="0"/>
+    <w:lsdException w:name="Medium List 1 Accent 4" w:semiHidden="0" w:uiPriority="65" w:unhideWhenUsed="0"/>
+    <w:lsdException w:name="Medium List 2 Accent 4" w:semiHidden="0" w:uiPriority="66" w:unhideWhenUsed="0"/>
+    <w:lsdException w:name="Medium Grid 1 Accent 4" w:semiHidden="0" w:uiPriority="67" w:unhideWhenUsed="0"/>
+    <w:lsdException w:name="Medium Grid 2 Accent 4" w:semiHidden="0" w:uiPriority="68" w:unhideWhenUsed="0"/>
+    <w:lsdException w:name="Medium Grid 3 Accent 4" w:semiHidden="0" w:uiPriority="69" w:unhideWhenUsed="0"/>
+    <w:lsdException w:name="Dark List Accent 4" w:semiHidden="0" w:uiPriority="70" w:unhideWhenUsed="0"/>
+    <w:lsdException w:name="Colorful Shading Accent 4" w:semiHidden="0" w:uiPriority="71" w:unhideWhenUsed="0"/>
+    <w:lsdException w:name="Colorful List Accent 4" w:semiHidden="0" w:uiPriority="72" w:unhideWhenUsed="0"/>
+    <w:lsdException w:name="Colorful Grid Accent 4" w:semiHidden="0" w:uiPriority="73" w:unhideWhenUsed="0"/>
+    <w:lsdException w:name="Light Shading Accent 5" w:semiHidden="0" w:uiPriority="60" w:unhideWhenUsed="0"/>
+    <w:lsdException w:name="Light List Accent 5" w:semiHidden="0" w:uiPriority="61" w:unhideWhenUsed="0"/>
+    <w:lsdException w:name="Light Grid Accent 5" w:semiHidden="0" w:uiPriority="62" w:unhideWhenUsed="0"/>
+    <w:lsdException w:name="Medium Shading 1 Accent 5" w:semiHidden="0" w:uiPriority="63" w:unhideWhenUsed="0"/>
+    <w:lsdException w:name="Medium Shading 2 Accent 5" w:semiHidden="0" w:uiPriority="64" w:unhideWhenUsed="0"/>
+    <w:lsdException w:name="Medium List 1 Accent 5" w:semiHidden="0" w:uiPriority="65" w:unhideWhenUsed="0"/>
+    <w:lsdException w:name="Medium List 2 Accent 5" w:semiHidden="0" w:uiPriority="66" w:unhideWhenUsed="0"/>
+    <w:lsdException w:name="Medium Grid 1 Accent 5" w:semiHidden="0" w:uiPriority="67" w:unhideWhenUsed="0"/>
+    <w:lsdException w:name="Medium Grid 2 Accent 5" w:semiHidden="0" w:uiPriority="68" w:unhideWhenUsed="0"/>
+    <w:lsdException w:name="Medium Grid 3 Accent 5" w:semiHidden="0" w:uiPriority="69" w:unhideWhenUsed="0"/>
+    <w:lsdException w:name="Dark List Accent 5" w:semiHidden="0" w:uiPriority="70" w:unhideWhenUsed="0"/>
+    <w:lsdException w:name="Colorful Shading Accent 5" w:semiHidden="0" w:uiPriority="71" w:unhideWhenUsed="0"/>
+    <w:lsdException w:name="Colorful List Accent 5" w:semiHidden="0" w:uiPriority="72" w:unhideWhenUsed="0"/>
+    <w:lsdException w:name="Colorful Grid Accent 5" w:semiHidden="0" w:uiPriority="73" w:unhideWhenUsed="0"/>
+    <w:lsdException w:name="Light Shading Accent 6" w:semiHidden="0" w:uiPriority="60" w:unhideWhenUsed="0"/>
+    <w:lsdException w:name="Light List Accent 6" w:semiHidden="0" w:uiPriority="61" w:unhideWhenUsed="0"/>
+    <w:lsdException w:name="Light Grid Accent 6" w:semiHidden="0" w:uiPriority="62" w:unhideWhenUsed="0"/>
+    <w:lsdException w:name="Medium Shading 1 Accent 6" w:semiHidden="0" w:uiPriority="63" w:unhideWhenUsed="0"/>
+    <w:lsdException w:name="Medium Shading 2 Accent 6" w:semiHidden="0" w:uiPriority="64" w:unhideWhenUsed="0"/>
+    <w:lsdException w:name="Medium List 1 Accent 6" w:semiHidden="0" w:uiPriority="65" w:unhideWhenUsed="0"/>
+    <w:lsdException w:name="Medium List 2 Accent 6" w:semiHidden="0" w:uiPriority="66" w:unhideWhenUsed="0"/>
+    <w:lsdException w:name="Medium Grid 1 Accent 6" w:semiHidden="0" w:uiPriority="67" w:unhideWhenUsed="0"/>
+    <w:lsdException w:name="Medium Grid 2 Accent 6" w:semiHidden="0" w:uiPriority="68" w:unhideWhenUsed="0"/>
+    <w:lsdException w:name="Medium Grid 3 Accent 6" w:semiHidden="0" w:uiPriority="69" w:unhideWhenUsed="0"/>
+    <w:lsdException w:name="Dark List Accent 6" w:semiHidden="0" w:uiPriority="70" w:unhideWhenUsed="0"/>
+    <w:lsdException w:name="Colorful Shading Accent 6" w:semiHidden="0" w:uiPriority="71" w:unhideWhenUsed="0"/>
+    <w:lsdException w:name="Colorful List Accent 6" w:semiHidden="0" w:uiPriority="72" w:unhideWhenUsed="0"/>
+    <w:lsdException w:name="Colorful Grid Accent 6" w:semiHidden="0" w:uiPriority="73" w:unhideWhenUsed="0"/>
+    <w:lsdException w:name="Subtle Emphasis" w:qFormat="1" w:semiHidden="0" w:uiPriority="19" w:unhideWhenUsed="0"/>
+    <w:lsdException w:name="Intense Emphasis" w:qFormat="1" w:semiHidden="0" w:uiPriority="21" w:unhideWhenUsed="0"/>
+    <w:lsdException w:name="Subtle Reference" w:qFormat="1" w:semiHidden="0" w:uiPriority="31" w:unhideWhenUsed="0"/>
+    <w:lsdException w:name="Intense Reference" w:qFormat="1" w:semiHidden="0" w:uiPriority="32" w:unhideWhenUsed="0"/>
+    <w:lsdException w:name="Book Title" w:qFormat="1" w:semiHidden="0" w:uiPriority="33" w:unhideWhenUsed="0"/>
+    <w:lsdException w:name="Bibliography" w:uiPriority="37"/>
+    <w:lsdException w:name="TOC Heading" w:qFormat="1" w:uiPriority="39"/>
   </w:latentStyles>
   <w:style w:default="1" w:styleId="Normal" w:type="paragraph">
     <w:name w:val="Normal"/>
     <w:qFormat/>
-    <w:rsid w:val="0033722B"/>
+    <w:rsid w:val="00682500"/>
     <w:rPr>
       <w:sz w:val="28"/>
     </w:rPr>
@@ -2233,7 +1902,7 @@
     <w:uiPriority w:val="9"/>
     <w:unhideWhenUsed/>
     <w:qFormat/>
-    <w:rsid w:val="00F14C3E"/>
+    <w:rsid w:val="00B467BA"/>
     <w:pPr>
       <w:keepNext/>
       <w:keepLines/>
@@ -2257,11 +1926,11 @@
     <w:uiPriority w:val="9"/>
     <w:unhideWhenUsed/>
     <w:qFormat/>
-    <w:rsid w:val="005B3D4E"/>
+    <w:rsid w:val="001716AF"/>
     <w:pPr>
       <w:keepNext/>
       <w:keepLines/>
-      <w:spacing w:after="0" w:before="40"/>
+      <w:spacing w:after="0" w:before="120"/>
       <w:outlineLvl w:val="2"/>
     </w:pPr>
     <w:rPr>
@@ -2279,18 +1948,17 @@
     <w:uiPriority w:val="9"/>
     <w:unhideWhenUsed/>
     <w:qFormat/>
-    <w:rsid w:val="005B3D4E"/>
+    <w:rsid w:val="001716AF"/>
     <w:pPr>
       <w:keepNext/>
       <w:keepLines/>
-      <w:spacing w:after="0" w:before="40"/>
+      <w:spacing w:after="0"/>
       <w:outlineLvl w:val="3"/>
     </w:pPr>
     <w:rPr>
-      <w:rFonts w:asciiTheme="majorHAnsi" w:cstheme="majorBidi" w:eastAsiaTheme="majorEastAsia" w:hAnsiTheme="majorHAnsi"/>
-      <w:i/>
+      <w:rFonts w:ascii="Arial" w:cs="Arial" w:eastAsiaTheme="majorEastAsia" w:hAnsi="Arial"/>
+      <w:bCs/>
       <w:iCs/>
-      <w:color w:themeColor="accent1" w:themeShade="BF" w:val="365F91"/>
     </w:rPr>
   </w:style>
   <w:style w:default="1" w:styleId="DefaultParagraphFont" w:type="character">
@@ -2326,7 +1994,7 @@
     <w:link w:val="HeaderChar"/>
     <w:uiPriority w:val="99"/>
     <w:unhideWhenUsed/>
-    <w:rsid w:val="00E043FD"/>
+    <w:rsid w:val="00037B15"/>
     <w:pPr>
       <w:tabs>
         <w:tab w:pos="4513" w:val="center"/>
@@ -2341,6 +2009,9 @@
     <w:link w:val="Header"/>
     <w:uiPriority w:val="99"/>
     <w:rsid w:val="00E043FD"/>
+    <w:rPr>
+      <w:sz w:val="28"/>
+    </w:rPr>
   </w:style>
   <w:style w:styleId="Footer" w:type="paragraph">
     <w:name w:val="footer"/>
@@ -2348,7 +2019,7 @@
     <w:link w:val="FooterChar"/>
     <w:uiPriority w:val="99"/>
     <w:unhideWhenUsed/>
-    <w:rsid w:val="00E043FD"/>
+    <w:rsid w:val="00037B15"/>
     <w:pPr>
       <w:tabs>
         <w:tab w:pos="4513" w:val="center"/>
@@ -2363,6 +2034,9 @@
     <w:link w:val="Footer"/>
     <w:uiPriority w:val="99"/>
     <w:rsid w:val="00E043FD"/>
+    <w:rPr>
+      <w:sz w:val="28"/>
+    </w:rPr>
   </w:style>
   <w:style w:customStyle="1" w:styleId="3CBD5A742C28424DA5172AD252E32316" w:type="paragraph">
     <w:name w:val="3CBD5A742C28424DA5172AD252E32316"/>
@@ -2461,7 +2135,7 @@
     <w:basedOn w:val="DefaultParagraphFont"/>
     <w:link w:val="Heading2"/>
     <w:uiPriority w:val="9"/>
-    <w:rsid w:val="00F14C3E"/>
+    <w:rsid w:val="00B467BA"/>
     <w:rPr>
       <w:rFonts w:cstheme="minorHAnsi" w:eastAsiaTheme="majorEastAsia"/>
       <w:b/>
@@ -2474,11 +2148,15 @@
   <w:style w:styleId="ListParagraph" w:type="paragraph">
     <w:name w:val="List Paragraph"/>
     <w:basedOn w:val="Normal"/>
+    <w:link w:val="ListParagraphChar"/>
     <w:uiPriority w:val="34"/>
     <w:qFormat/>
-    <w:rsid w:val="0085261D"/>
+    <w:rsid w:val="002E72C0"/>
     <w:pPr>
-      <w:ind w:left="720"/>
+      <w:numPr>
+        <w:numId w:val="1"/>
+      </w:numPr>
+      <w:spacing w:after="120"/>
       <w:contextualSpacing/>
     </w:pPr>
   </w:style>
@@ -2487,7 +2165,7 @@
     <w:basedOn w:val="DefaultParagraphFont"/>
     <w:link w:val="Heading3"/>
     <w:uiPriority w:val="9"/>
-    <w:rsid w:val="005B3D4E"/>
+    <w:rsid w:val="001716AF"/>
     <w:rPr>
       <w:rFonts w:ascii="Arial" w:cstheme="majorBidi" w:eastAsiaTheme="majorEastAsia" w:hAnsi="Arial"/>
       <w:color w:themeColor="accent1" w:themeShade="7F" w:val="243F60"/>
@@ -2500,22 +2178,61 @@
     <w:basedOn w:val="DefaultParagraphFont"/>
     <w:link w:val="Heading4"/>
     <w:uiPriority w:val="9"/>
-    <w:rsid w:val="005B3D4E"/>
-    <w:rPr>
-      <w:rFonts w:asciiTheme="majorHAnsi" w:cstheme="majorBidi" w:eastAsiaTheme="majorEastAsia" w:hAnsiTheme="majorHAnsi"/>
-      <w:i/>
+    <w:rsid w:val="001716AF"/>
+    <w:rPr>
+      <w:rFonts w:ascii="Arial" w:cs="Arial" w:eastAsiaTheme="majorEastAsia" w:hAnsi="Arial"/>
+      <w:bCs/>
       <w:iCs/>
-      <w:color w:themeColor="accent1" w:themeShade="BF" w:val="365F91"/>
+      <w:sz w:val="28"/>
     </w:rPr>
   </w:style>
   <w:style w:styleId="NoSpacing" w:type="paragraph">
     <w:name w:val="No Spacing"/>
     <w:uiPriority w:val="1"/>
     <w:qFormat/>
-    <w:rsid w:val="0033722B"/>
+    <w:rsid w:val="00037B15"/>
     <w:pPr>
       <w:spacing w:after="0" w:line="240" w:lineRule="auto"/>
     </w:pPr>
+    <w:rPr>
+      <w:sz w:val="28"/>
+    </w:rPr>
+  </w:style>
+  <w:style w:styleId="Revision" w:type="paragraph">
+    <w:name w:val="Revision"/>
+    <w:hidden/>
+    <w:uiPriority w:val="99"/>
+    <w:semiHidden/>
+    <w:rsid w:val="00037B15"/>
+    <w:pPr>
+      <w:spacing w:after="0" w:line="240" w:lineRule="auto"/>
+    </w:pPr>
+  </w:style>
+  <w:style w:customStyle="1" w:styleId="Bulleted" w:type="paragraph">
+    <w:name w:val="Bulleted"/>
+    <w:basedOn w:val="ListParagraph"/>
+    <w:link w:val="BulletedChar"/>
+    <w:qFormat/>
+    <w:rsid w:val="006E24A1"/>
+    <w:pPr>
+      <w:spacing w:after="0"/>
+    </w:pPr>
+  </w:style>
+  <w:style w:customStyle="1" w:styleId="ListParagraphChar" w:type="character">
+    <w:name w:val="List Paragraph Char"/>
+    <w:basedOn w:val="DefaultParagraphFont"/>
+    <w:link w:val="ListParagraph"/>
+    <w:uiPriority w:val="34"/>
+    <w:rsid w:val="006E24A1"/>
+    <w:rPr>
+      <w:sz w:val="28"/>
+    </w:rPr>
+  </w:style>
+  <w:style w:customStyle="1" w:styleId="BulletedChar" w:type="character">
+    <w:name w:val="Bulleted Char"/>
+    <w:basedOn w:val="ListParagraphChar"/>
+    <w:link w:val="Bulleted"/>
+    <w:rsid w:val="006E24A1"/>
     <w:rPr>
       <w:sz w:val="28"/>
     </w:rPr>

</xml_diff>

<commit_message>
Added Quality Check heading and item about protruding screws on bird blocking.
</commit_message>
<xml_diff>
--- a/Interior_Panels/Interior_Panels.docx
+++ b/Interior_Panels/Interior_Panels.docx
@@ -2,7 +2,7 @@
 <file path=word/document.xml><?xml version="1.0" encoding="utf-8"?>
 <w:document xmlns:w="http://schemas.openxmlformats.org/wordprocessingml/2006/main" xmlns:m="http://schemas.openxmlformats.org/officeDocument/2006/math" xmlns:r="http://schemas.openxmlformats.org/officeDocument/2006/relationships" xmlns:o="urn:schemas-microsoft-com:office:office" xmlns:v="urn:schemas-microsoft-com:vml" xmlns:w10="urn:schemas-microsoft-com:office:word" xmlns:a="http://schemas.openxmlformats.org/drawingml/2006/main" xmlns:pic="http://schemas.openxmlformats.org/drawingml/2006/picture" xmlns:wp="http://schemas.openxmlformats.org/drawingml/2006/wordprocessingDrawing">
   <w:body>
-    <w:bookmarkStart w:id="20" w:name="interior-panels"/>
+    <w:bookmarkStart w:id="37" w:name="interior-panels"/>
     <w:p>
       <w:pPr>
         <w:pStyle w:val="Heading1"/>
@@ -152,37 +152,62 @@
       </w:r>
     </w:p>
     <w:p>
+      <w:pPr>
+        <w:pStyle w:val="Compact"/>
+        <w:numPr>
+          <w:ilvl w:val="0"/>
+          <w:numId w:val="1001"/>
+        </w:numPr>
+      </w:pPr>
+      <w:r>
+        <w:t xml:space="preserve">Panel cart with all of the cut and labeled interior panels</w:t>
+      </w:r>
+    </w:p>
+    <w:p>
       <w:r>
         <w:br w:type="page"/>
       </w:r>
     </w:p>
-    <w:bookmarkEnd w:id="20"/>
-    <w:bookmarkStart w:id="37" w:name="interior-panels-1"/>
-    <w:p>
-      <w:pPr>
-        <w:pStyle w:val="Heading1"/>
-      </w:pPr>
-      <w:r>
-        <w:t xml:space="preserve">INTERIOR PANELS</w:t>
-      </w:r>
-    </w:p>
-    <w:p>
-      <w:pPr>
-        <w:pStyle w:val="FirstParagraph"/>
-      </w:pPr>
-      <w:r>
-        <w:t xml:space="preserve">Make sure all insulation is installed including small spaces next to the</w:t>
-      </w:r>
-      <w:r>
-        <w:t xml:space="preserve"> </w:t>
-      </w:r>
-      <w:r>
-        <w:t xml:space="preserve">door.</w:t>
-      </w:r>
-    </w:p>
-    <w:p>
-      <w:pPr>
-        <w:pStyle w:val="BodyText"/>
+    <w:bookmarkStart w:id="20" w:name="pre-install-quality-checks"/>
+    <w:p>
+      <w:pPr>
+        <w:pStyle w:val="Heading2"/>
+      </w:pPr>
+      <w:r>
+        <w:t xml:space="preserve">Pre-Install Quality Checks</w:t>
+      </w:r>
+    </w:p>
+    <w:p>
+      <w:pPr>
+        <w:pStyle w:val="Compact"/>
+        <w:numPr>
+          <w:ilvl w:val="0"/>
+          <w:numId w:val="1002"/>
+        </w:numPr>
+      </w:pPr>
+      <w:r>
+        <w:t xml:space="preserve">Walk around the outside of the home and check if any screw ends are visible through the bird-blocks. If any are found, remove and re-install correctly.</w:t>
+      </w:r>
+    </w:p>
+    <w:p>
+      <w:pPr>
+        <w:pStyle w:val="Compact"/>
+        <w:numPr>
+          <w:ilvl w:val="0"/>
+          <w:numId w:val="1002"/>
+        </w:numPr>
+      </w:pPr>
+      <w:r>
+        <w:t xml:space="preserve">Make sure all insulation is installed including small spaces next to the door.</w:t>
+      </w:r>
+    </w:p>
+    <w:p>
+      <w:pPr>
+        <w:pStyle w:val="Compact"/>
+        <w:numPr>
+          <w:ilvl w:val="0"/>
+          <w:numId w:val="1002"/>
+        </w:numPr>
       </w:pPr>
       <w:r>
         <w:t xml:space="preserve">Make sure that the reference line is marked on the 2</w:t>
@@ -218,14 +243,7 @@
         <w:t xml:space="preserve">angle-iron guide.</w:t>
       </w:r>
     </w:p>
-    <w:p>
-      <w:pPr>
-        <w:pStyle w:val="BodyText"/>
-      </w:pPr>
-      <w:r>
-        <w:t xml:space="preserve">Get the panel cart with all of the cut and labeled interior panels</w:t>
-      </w:r>
-    </w:p>
+    <w:bookmarkEnd w:id="20"/>
     <w:bookmarkStart w:id="24" w:name="ceiling-panels-r1-r2-two-each"/>
     <w:p>
       <w:pPr>
@@ -251,7 +269,7 @@
       <w:pPr>
         <w:numPr>
           <w:ilvl w:val="0"/>
-          <w:numId w:val="1002"/>
+          <w:numId w:val="1003"/>
         </w:numPr>
       </w:pPr>
       <w:r>
@@ -284,7 +302,7 @@
       <w:pPr>
         <w:numPr>
           <w:ilvl w:val="0"/>
-          <w:numId w:val="1002"/>
+          <w:numId w:val="1003"/>
         </w:numPr>
       </w:pPr>
       <w:r>
@@ -311,7 +329,7 @@
       <w:pPr>
         <w:numPr>
           <w:ilvl w:val="0"/>
-          <w:numId w:val="1002"/>
+          <w:numId w:val="1003"/>
         </w:numPr>
       </w:pPr>
       <w:r>
@@ -321,7 +339,7 @@
         <w:br/>
       </w:r>
       <w:r>
-        <w:t xml:space="preserve">— Install R1</w:t>
+        <w:t xml:space="preserve">— Install R1s</w:t>
       </w:r>
       <w:r>
         <w:br/>
@@ -339,7 +357,7 @@
         <w:br/>
       </w:r>
       <w:r>
-        <w:t xml:space="preserve">— Install R2</w:t>
+        <w:t xml:space="preserve">— Install R2s</w:t>
       </w:r>
       <w:r>
         <w:br/>
@@ -356,15 +374,12 @@
       <w:r>
         <w:br/>
       </w:r>
-      <w:r>
-        <w:t xml:space="preserve">— REPEAT on the other side</w:t>
-      </w:r>
-    </w:p>
-    <w:p>
-      <w:pPr>
-        <w:numPr>
-          <w:ilvl w:val="0"/>
-          <w:numId w:val="1002"/>
+    </w:p>
+    <w:p>
+      <w:pPr>
+        <w:numPr>
+          <w:ilvl w:val="0"/>
+          <w:numId w:val="1003"/>
         </w:numPr>
       </w:pPr>
       <w:r>
@@ -383,16 +398,11 @@
       <w:r>
         <w:t xml:space="preserve">Inner ceiling panel screws</w:t>
       </w:r>
-    </w:p>
-    <w:p>
-      <w:pPr>
-        <w:numPr>
-          <w:ilvl w:val="0"/>
-          <w:numId w:val="1002"/>
-        </w:numPr>
-      </w:pPr>
-      <w:r>
-        <w:t xml:space="preserve">Use Screw Pattern Board to mark WITH PENCIL (</w:t>
+      <w:r>
+        <w:br/>
+      </w:r>
+      <w:r>
+        <w:t xml:space="preserve">— Use Screw Pattern Board to mark WITH PENCIL (</w:t>
       </w:r>
       <w:r>
         <w:rPr>
@@ -408,16 +418,11 @@
       <w:r>
         <w:t xml:space="preserve">marker) where the screws go. Align with visible rafter end at the top, and with marks on wall top plate.</w:t>
       </w:r>
-    </w:p>
-    <w:p>
-      <w:pPr>
-        <w:numPr>
-          <w:ilvl w:val="0"/>
-          <w:numId w:val="1002"/>
-        </w:numPr>
-      </w:pPr>
-      <w:r>
-        <w:t xml:space="preserve">Pre-drill and screw in</w:t>
+      <w:r>
+        <w:br/>
+      </w:r>
+      <w:r>
+        <w:t xml:space="preserve">— Pre-drill and screw in</w:t>
       </w:r>
       <w:r>
         <w:t xml:space="preserve"> </w:t>
@@ -497,7 +502,7 @@
       <w:pPr>
         <w:numPr>
           <w:ilvl w:val="0"/>
-          <w:numId w:val="1003"/>
+          <w:numId w:val="1004"/>
         </w:numPr>
       </w:pPr>
       <w:r>
@@ -530,7 +535,7 @@
       <w:pPr>
         <w:numPr>
           <w:ilvl w:val="0"/>
-          <w:numId w:val="1003"/>
+          <w:numId w:val="1004"/>
         </w:numPr>
       </w:pPr>
       <w:r>
@@ -557,7 +562,7 @@
       <w:pPr>
         <w:numPr>
           <w:ilvl w:val="0"/>
-          <w:numId w:val="1003"/>
+          <w:numId w:val="1004"/>
         </w:numPr>
       </w:pPr>
       <w:r>
@@ -580,7 +585,7 @@
       <w:pPr>
         <w:numPr>
           <w:ilvl w:val="0"/>
-          <w:numId w:val="1003"/>
+          <w:numId w:val="1004"/>
         </w:numPr>
       </w:pPr>
       <w:r>
@@ -603,7 +608,7 @@
       <w:pPr>
         <w:numPr>
           <w:ilvl w:val="0"/>
-          <w:numId w:val="1003"/>
+          <w:numId w:val="1004"/>
         </w:numPr>
       </w:pPr>
       <w:r>
@@ -629,7 +634,7 @@
         <w:pStyle w:val="Compact"/>
         <w:numPr>
           <w:ilvl w:val="0"/>
-          <w:numId w:val="1004"/>
+          <w:numId w:val="1005"/>
         </w:numPr>
       </w:pPr>
       <w:r>
@@ -763,7 +768,7 @@
         <w:pStyle w:val="Compact"/>
         <w:numPr>
           <w:ilvl w:val="0"/>
-          <w:numId w:val="1005"/>
+          <w:numId w:val="1006"/>
         </w:numPr>
       </w:pPr>
       <w:r>
@@ -797,7 +802,7 @@
         <w:pStyle w:val="Compact"/>
         <w:numPr>
           <w:ilvl w:val="0"/>
-          <w:numId w:val="1005"/>
+          <w:numId w:val="1006"/>
         </w:numPr>
       </w:pPr>
       <w:r>
@@ -825,7 +830,7 @@
         <w:pStyle w:val="Compact"/>
         <w:numPr>
           <w:ilvl w:val="0"/>
-          <w:numId w:val="1005"/>
+          <w:numId w:val="1006"/>
         </w:numPr>
       </w:pPr>
       <w:r>
@@ -849,7 +854,7 @@
         <w:pStyle w:val="Compact"/>
         <w:numPr>
           <w:ilvl w:val="0"/>
-          <w:numId w:val="1005"/>
+          <w:numId w:val="1006"/>
         </w:numPr>
       </w:pPr>
       <w:r>
@@ -873,7 +878,7 @@
         <w:pStyle w:val="Compact"/>
         <w:numPr>
           <w:ilvl w:val="0"/>
-          <w:numId w:val="1005"/>
+          <w:numId w:val="1006"/>
         </w:numPr>
       </w:pPr>
       <w:r>
@@ -1007,7 +1012,7 @@
         <w:pStyle w:val="Compact"/>
         <w:numPr>
           <w:ilvl w:val="0"/>
-          <w:numId w:val="1006"/>
+          <w:numId w:val="1007"/>
         </w:numPr>
       </w:pPr>
       <w:r>
@@ -1063,7 +1068,7 @@
         <w:pStyle w:val="Compact"/>
         <w:numPr>
           <w:ilvl w:val="0"/>
-          <w:numId w:val="1006"/>
+          <w:numId w:val="1007"/>
         </w:numPr>
       </w:pPr>
       <w:r>
@@ -1081,7 +1086,7 @@
         <w:pStyle w:val="Compact"/>
         <w:numPr>
           <w:ilvl w:val="0"/>
-          <w:numId w:val="1006"/>
+          <w:numId w:val="1007"/>
         </w:numPr>
       </w:pPr>
       <w:r>
@@ -1099,7 +1104,7 @@
         <w:pStyle w:val="Compact"/>
         <w:numPr>
           <w:ilvl w:val="0"/>
-          <w:numId w:val="1006"/>
+          <w:numId w:val="1007"/>
         </w:numPr>
       </w:pPr>
       <w:r>
@@ -1165,7 +1170,7 @@
         <w:pStyle w:val="Compact"/>
         <w:numPr>
           <w:ilvl w:val="0"/>
-          <w:numId w:val="1006"/>
+          <w:numId w:val="1007"/>
         </w:numPr>
       </w:pPr>
       <w:r>
@@ -1183,7 +1188,7 @@
         <w:pStyle w:val="Compact"/>
         <w:numPr>
           <w:ilvl w:val="0"/>
-          <w:numId w:val="1006"/>
+          <w:numId w:val="1007"/>
         </w:numPr>
       </w:pPr>
       <w:r>
@@ -1254,7 +1259,7 @@
         <w:pStyle w:val="Compact"/>
         <w:numPr>
           <w:ilvl w:val="0"/>
-          <w:numId w:val="1007"/>
+          <w:numId w:val="1008"/>
         </w:numPr>
       </w:pPr>
       <w:r>
@@ -1282,7 +1287,12 @@
     <w:bookmarkEnd w:id="36"/>
     <w:bookmarkEnd w:id="37"/>
     <w:sectPr>
-      <w:footerReference r:id="rId9" w:type="default"/>
+      <w:headerReference r:id="rId9" w:type="even"/>
+      <w:headerReference r:id="rId11" w:type="default"/>
+      <w:footerReference r:id="rId14" w:type="even"/>
+      <w:footerReference r:id="rId13" w:type="default"/>
+      <w:headerReference r:id="rId10" w:type="first"/>
+      <w:footerReference r:id="rId12" w:type="first"/>
       <w:pgSz w:code="1" w:h="15840" w:w="12240"/>
       <w:pgMar w:bottom="1440" w:footer="708" w:gutter="0" w:header="708" w:left="1440" w:right="1440" w:top="1440"/>
       <w:cols w:space="708"/>
@@ -1297,65 +1307,129 @@
 </file>
 
 <file path=word/footer1.xml><?xml version="1.0" encoding="utf-8"?>
-<w:ftr xmlns:wpc="http://schemas.microsoft.com/office/word/2010/wordprocessingCanvas" xmlns:mc="http://schemas.openxmlformats.org/markup-compatibility/2006" xmlns:o="urn:schemas-microsoft-com:office:office" xmlns:r="http://schemas.openxmlformats.org/officeDocument/2006/relationships" xmlns:m="http://schemas.openxmlformats.org/officeDocument/2006/math" xmlns:v="urn:schemas-microsoft-com:vml" xmlns:wp14="http://schemas.microsoft.com/office/word/2010/wordprocessingDrawing" xmlns:wp="http://schemas.openxmlformats.org/drawingml/2006/wordprocessingDrawing" xmlns:w10="urn:schemas-microsoft-com:office:word" xmlns:w="http://schemas.openxmlformats.org/wordprocessingml/2006/main" xmlns:w14="http://schemas.microsoft.com/office/word/2010/wordml" xmlns:wpg="http://schemas.microsoft.com/office/word/2010/wordprocessingGroup" xmlns:wpi="http://schemas.microsoft.com/office/word/2010/wordprocessingInk" xmlns:wne="http://schemas.microsoft.com/office/word/2006/wordml" xmlns:wps="http://schemas.microsoft.com/office/word/2010/wordprocessingShape" mc:Ignorable="w14 wp14">
+<w:ftr xmlns:wpc="http://schemas.microsoft.com/office/word/2010/wordprocessingCanvas" xmlns:cx="http://schemas.microsoft.com/office/drawing/2014/chartex" xmlns:cx1="http://schemas.microsoft.com/office/drawing/2015/9/8/chartex" xmlns:cx2="http://schemas.microsoft.com/office/drawing/2015/10/21/chartex" xmlns:cx3="http://schemas.microsoft.com/office/drawing/2016/5/9/chartex" xmlns:cx4="http://schemas.microsoft.com/office/drawing/2016/5/10/chartex" xmlns:cx5="http://schemas.microsoft.com/office/drawing/2016/5/11/chartex" xmlns:cx6="http://schemas.microsoft.com/office/drawing/2016/5/12/chartex" xmlns:cx7="http://schemas.microsoft.com/office/drawing/2016/5/13/chartex" xmlns:cx8="http://schemas.microsoft.com/office/drawing/2016/5/14/chartex" xmlns:mc="http://schemas.openxmlformats.org/markup-compatibility/2006" xmlns:aink="http://schemas.microsoft.com/office/drawing/2016/ink" xmlns:am3d="http://schemas.microsoft.com/office/drawing/2017/model3d" xmlns:o="urn:schemas-microsoft-com:office:office" xmlns:oel="http://schemas.microsoft.com/office/2019/extlst" xmlns:r="http://schemas.openxmlformats.org/officeDocument/2006/relationships" xmlns:m="http://schemas.openxmlformats.org/officeDocument/2006/math" xmlns:v="urn:schemas-microsoft-com:vml" xmlns:wp14="http://schemas.microsoft.com/office/word/2010/wordprocessingDrawing" xmlns:wp="http://schemas.openxmlformats.org/drawingml/2006/wordprocessingDrawing" xmlns:w10="urn:schemas-microsoft-com:office:word" xmlns:w="http://schemas.openxmlformats.org/wordprocessingml/2006/main" xmlns:w14="http://schemas.microsoft.com/office/word/2010/wordml" xmlns:w15="http://schemas.microsoft.com/office/word/2012/wordml" xmlns:w16cex="http://schemas.microsoft.com/office/word/2018/wordml/cex" xmlns:w16cid="http://schemas.microsoft.com/office/word/2016/wordml/cid" xmlns:w16="http://schemas.microsoft.com/office/word/2018/wordml" xmlns:w16du="http://schemas.microsoft.com/office/word/2023/wordml/word16du" xmlns:w16sdtdh="http://schemas.microsoft.com/office/word/2020/wordml/sdtdatahash" xmlns:w16sdtfl="http://schemas.microsoft.com/office/word/2024/wordml/sdtformatlock" xmlns:w16se="http://schemas.microsoft.com/office/word/2015/wordml/symex" xmlns:wpg="http://schemas.microsoft.com/office/word/2010/wordprocessingGroup" xmlns:wpi="http://schemas.microsoft.com/office/word/2010/wordprocessingInk" xmlns:wne="http://schemas.microsoft.com/office/word/2006/wordml" xmlns:wps="http://schemas.microsoft.com/office/word/2010/wordprocessingShape" mc:Ignorable="w14 w15 w16se w16cid w16 w16cex w16sdtdh w16sdtfl w16du wp14">
+  <w:p>
+    <w:pPr>
+      <w:pStyle w:val="Footer"/>
+    </w:pPr>
+  </w:p>
+</w:ftr>
+</file>
+
+<file path=word/footer2.xml><?xml version="1.0" encoding="utf-8"?>
+<w:ftr xmlns:wpc="http://schemas.microsoft.com/office/word/2010/wordprocessingCanvas" xmlns:cx="http://schemas.microsoft.com/office/drawing/2014/chartex" xmlns:cx1="http://schemas.microsoft.com/office/drawing/2015/9/8/chartex" xmlns:cx2="http://schemas.microsoft.com/office/drawing/2015/10/21/chartex" xmlns:cx3="http://schemas.microsoft.com/office/drawing/2016/5/9/chartex" xmlns:cx4="http://schemas.microsoft.com/office/drawing/2016/5/10/chartex" xmlns:cx5="http://schemas.microsoft.com/office/drawing/2016/5/11/chartex" xmlns:cx6="http://schemas.microsoft.com/office/drawing/2016/5/12/chartex" xmlns:cx7="http://schemas.microsoft.com/office/drawing/2016/5/13/chartex" xmlns:cx8="http://schemas.microsoft.com/office/drawing/2016/5/14/chartex" xmlns:mc="http://schemas.openxmlformats.org/markup-compatibility/2006" xmlns:aink="http://schemas.microsoft.com/office/drawing/2016/ink" xmlns:am3d="http://schemas.microsoft.com/office/drawing/2017/model3d" xmlns:o="urn:schemas-microsoft-com:office:office" xmlns:oel="http://schemas.microsoft.com/office/2019/extlst" xmlns:r="http://schemas.openxmlformats.org/officeDocument/2006/relationships" xmlns:m="http://schemas.openxmlformats.org/officeDocument/2006/math" xmlns:v="urn:schemas-microsoft-com:vml" xmlns:wp14="http://schemas.microsoft.com/office/word/2010/wordprocessingDrawing" xmlns:wp="http://schemas.openxmlformats.org/drawingml/2006/wordprocessingDrawing" xmlns:w10="urn:schemas-microsoft-com:office:word" xmlns:w="http://schemas.openxmlformats.org/wordprocessingml/2006/main" xmlns:w14="http://schemas.microsoft.com/office/word/2010/wordml" xmlns:w15="http://schemas.microsoft.com/office/word/2012/wordml" xmlns:w16cex="http://schemas.microsoft.com/office/word/2018/wordml/cex" xmlns:w16cid="http://schemas.microsoft.com/office/word/2016/wordml/cid" xmlns:w16="http://schemas.microsoft.com/office/word/2018/wordml" xmlns:w16du="http://schemas.microsoft.com/office/word/2023/wordml/word16du" xmlns:w16sdtdh="http://schemas.microsoft.com/office/word/2020/wordml/sdtdatahash" xmlns:w16sdtfl="http://schemas.microsoft.com/office/word/2024/wordml/sdtformatlock" xmlns:w16se="http://schemas.microsoft.com/office/word/2015/wordml/symex" xmlns:wpg="http://schemas.microsoft.com/office/word/2010/wordprocessingGroup" xmlns:wpi="http://schemas.microsoft.com/office/word/2010/wordprocessingInk" xmlns:wne="http://schemas.microsoft.com/office/word/2006/wordml" xmlns:wps="http://schemas.microsoft.com/office/word/2010/wordprocessingShape" mc:Ignorable="w14 w15 w16se w16cid w16 w16cex w16sdtdh w16sdtfl w16du wp14">
   <w:p>
     <w:pPr>
       <w:pStyle w:val="Footer"/>
       <w:pBdr>
         <w:top w:val="single" w:sz="4" w:space="1" w:color="auto"/>
       </w:pBdr>
+      <w:rPr>
+        <w:sz w:val="22"/>
+      </w:rPr>
     </w:pPr>
     <w:r>
+      <w:rPr>
+        <w:sz w:val="22"/>
+      </w:rPr>
       <w:t>Sound Foundations NW</w:t>
     </w:r>
     <w:r>
+      <w:rPr>
+        <w:sz w:val="22"/>
+      </w:rPr>
       <w:ptab w:relativeTo="margin" w:alignment="center" w:leader="none"/>
     </w:r>
     <w:r>
+      <w:rPr>
+        <w:sz w:val="22"/>
+      </w:rPr>
       <w:t xml:space="preserve"> </w:t>
     </w:r>
     <w:r>
+      <w:rPr>
+        <w:sz w:val="22"/>
+      </w:rPr>
       <w:fldChar w:fldCharType="begin"/>
     </w:r>
     <w:r>
+      <w:rPr>
+        <w:sz w:val="22"/>
+      </w:rPr>
       <w:instrText xml:space="preserve"> SAVEDATE  \@ "d MMMM yyyy"  \* MERGEFORMAT </w:instrText>
     </w:r>
     <w:r>
+      <w:rPr>
+        <w:sz w:val="22"/>
+      </w:rPr>
       <w:fldChar w:fldCharType="separate"/>
     </w:r>
     <w:r>
       <w:rPr>
         <w:noProof/>
+        <w:sz w:val="22"/>
       </w:rPr>
       <w:t>12 March 2025</w:t>
     </w:r>
     <w:r>
+      <w:rPr>
+        <w:sz w:val="22"/>
+      </w:rPr>
       <w:fldChar w:fldCharType="end"/>
     </w:r>
     <w:r>
+      <w:rPr>
+        <w:sz w:val="22"/>
+      </w:rPr>
       <w:t xml:space="preserve"> </w:t>
     </w:r>
     <w:r>
+      <w:rPr>
+        <w:sz w:val="22"/>
+      </w:rPr>
       <w:ptab w:relativeTo="margin" w:alignment="right" w:leader="none"/>
     </w:r>
     <w:r>
+      <w:rPr>
+        <w:sz w:val="22"/>
+      </w:rPr>
       <w:fldChar w:fldCharType="begin"/>
     </w:r>
     <w:r>
+      <w:rPr>
+        <w:sz w:val="22"/>
+      </w:rPr>
       <w:instrText xml:space="preserve"> PAGE   \* MERGEFORMAT </w:instrText>
     </w:r>
     <w:r>
+      <w:rPr>
+        <w:sz w:val="22"/>
+      </w:rPr>
       <w:fldChar w:fldCharType="separate"/>
     </w:r>
     <w:r>
       <w:rPr>
         <w:noProof/>
+        <w:sz w:val="22"/>
       </w:rPr>
       <w:t>1</w:t>
     </w:r>
     <w:r>
+      <w:rPr>
+        <w:sz w:val="22"/>
+      </w:rPr>
       <w:fldChar w:fldCharType="end"/>
     </w:r>
+  </w:p>
+</w:ftr>
+</file>
+
+<file path=word/footer3.xml><?xml version="1.0" encoding="utf-8"?>
+<w:ftr xmlns:wpc="http://schemas.microsoft.com/office/word/2010/wordprocessingCanvas" xmlns:cx="http://schemas.microsoft.com/office/drawing/2014/chartex" xmlns:cx1="http://schemas.microsoft.com/office/drawing/2015/9/8/chartex" xmlns:cx2="http://schemas.microsoft.com/office/drawing/2015/10/21/chartex" xmlns:cx3="http://schemas.microsoft.com/office/drawing/2016/5/9/chartex" xmlns:cx4="http://schemas.microsoft.com/office/drawing/2016/5/10/chartex" xmlns:cx5="http://schemas.microsoft.com/office/drawing/2016/5/11/chartex" xmlns:cx6="http://schemas.microsoft.com/office/drawing/2016/5/12/chartex" xmlns:cx7="http://schemas.microsoft.com/office/drawing/2016/5/13/chartex" xmlns:cx8="http://schemas.microsoft.com/office/drawing/2016/5/14/chartex" xmlns:mc="http://schemas.openxmlformats.org/markup-compatibility/2006" xmlns:aink="http://schemas.microsoft.com/office/drawing/2016/ink" xmlns:am3d="http://schemas.microsoft.com/office/drawing/2017/model3d" xmlns:o="urn:schemas-microsoft-com:office:office" xmlns:oel="http://schemas.microsoft.com/office/2019/extlst" xmlns:r="http://schemas.openxmlformats.org/officeDocument/2006/relationships" xmlns:m="http://schemas.openxmlformats.org/officeDocument/2006/math" xmlns:v="urn:schemas-microsoft-com:vml" xmlns:wp14="http://schemas.microsoft.com/office/word/2010/wordprocessingDrawing" xmlns:wp="http://schemas.openxmlformats.org/drawingml/2006/wordprocessingDrawing" xmlns:w10="urn:schemas-microsoft-com:office:word" xmlns:w="http://schemas.openxmlformats.org/wordprocessingml/2006/main" xmlns:w14="http://schemas.microsoft.com/office/word/2010/wordml" xmlns:w15="http://schemas.microsoft.com/office/word/2012/wordml" xmlns:w16cex="http://schemas.microsoft.com/office/word/2018/wordml/cex" xmlns:w16cid="http://schemas.microsoft.com/office/word/2016/wordml/cid" xmlns:w16="http://schemas.microsoft.com/office/word/2018/wordml" xmlns:w16du="http://schemas.microsoft.com/office/word/2023/wordml/word16du" xmlns:w16sdtdh="http://schemas.microsoft.com/office/word/2020/wordml/sdtdatahash" xmlns:w16sdtfl="http://schemas.microsoft.com/office/word/2024/wordml/sdtformatlock" xmlns:w16se="http://schemas.microsoft.com/office/word/2015/wordml/symex" xmlns:wpg="http://schemas.microsoft.com/office/word/2010/wordprocessingGroup" xmlns:wpi="http://schemas.microsoft.com/office/word/2010/wordprocessingInk" xmlns:wne="http://schemas.microsoft.com/office/word/2006/wordml" xmlns:wps="http://schemas.microsoft.com/office/word/2010/wordprocessingShape" mc:Ignorable="w14 w15 w16se w16cid w16 w16cex w16sdtdh w16sdtfl w16du wp14">
+  <w:p>
+    <w:pPr>
+      <w:pStyle w:val="Footer"/>
+    </w:pPr>
   </w:p>
 </w:ftr>
 </file>
@@ -1379,9 +1453,39 @@
 </w:footnotes>
 </file>
 
+<file path=word/header1.xml><?xml version="1.0" encoding="utf-8"?>
+<w:hdr xmlns:wpc="http://schemas.microsoft.com/office/word/2010/wordprocessingCanvas" xmlns:cx="http://schemas.microsoft.com/office/drawing/2014/chartex" xmlns:cx1="http://schemas.microsoft.com/office/drawing/2015/9/8/chartex" xmlns:cx2="http://schemas.microsoft.com/office/drawing/2015/10/21/chartex" xmlns:cx3="http://schemas.microsoft.com/office/drawing/2016/5/9/chartex" xmlns:cx4="http://schemas.microsoft.com/office/drawing/2016/5/10/chartex" xmlns:cx5="http://schemas.microsoft.com/office/drawing/2016/5/11/chartex" xmlns:cx6="http://schemas.microsoft.com/office/drawing/2016/5/12/chartex" xmlns:cx7="http://schemas.microsoft.com/office/drawing/2016/5/13/chartex" xmlns:cx8="http://schemas.microsoft.com/office/drawing/2016/5/14/chartex" xmlns:mc="http://schemas.openxmlformats.org/markup-compatibility/2006" xmlns:aink="http://schemas.microsoft.com/office/drawing/2016/ink" xmlns:am3d="http://schemas.microsoft.com/office/drawing/2017/model3d" xmlns:o="urn:schemas-microsoft-com:office:office" xmlns:oel="http://schemas.microsoft.com/office/2019/extlst" xmlns:r="http://schemas.openxmlformats.org/officeDocument/2006/relationships" xmlns:m="http://schemas.openxmlformats.org/officeDocument/2006/math" xmlns:v="urn:schemas-microsoft-com:vml" xmlns:wp14="http://schemas.microsoft.com/office/word/2010/wordprocessingDrawing" xmlns:wp="http://schemas.openxmlformats.org/drawingml/2006/wordprocessingDrawing" xmlns:w10="urn:schemas-microsoft-com:office:word" xmlns:w="http://schemas.openxmlformats.org/wordprocessingml/2006/main" xmlns:w14="http://schemas.microsoft.com/office/word/2010/wordml" xmlns:w15="http://schemas.microsoft.com/office/word/2012/wordml" xmlns:w16cex="http://schemas.microsoft.com/office/word/2018/wordml/cex" xmlns:w16cid="http://schemas.microsoft.com/office/word/2016/wordml/cid" xmlns:w16="http://schemas.microsoft.com/office/word/2018/wordml" xmlns:w16du="http://schemas.microsoft.com/office/word/2023/wordml/word16du" xmlns:w16sdtdh="http://schemas.microsoft.com/office/word/2020/wordml/sdtdatahash" xmlns:w16sdtfl="http://schemas.microsoft.com/office/word/2024/wordml/sdtformatlock" xmlns:w16se="http://schemas.microsoft.com/office/word/2015/wordml/symex" xmlns:wpg="http://schemas.microsoft.com/office/word/2010/wordprocessingGroup" xmlns:wpi="http://schemas.microsoft.com/office/word/2010/wordprocessingInk" xmlns:wne="http://schemas.microsoft.com/office/word/2006/wordml" xmlns:wps="http://schemas.microsoft.com/office/word/2010/wordprocessingShape" mc:Ignorable="w14 w15 w16se w16cid w16 w16cex w16sdtdh w16sdtfl w16du wp14">
+  <w:p>
+    <w:pPr>
+      <w:pStyle w:val="Header"/>
+    </w:pPr>
+  </w:p>
+</w:hdr>
+</file>
+
+<file path=word/header2.xml><?xml version="1.0" encoding="utf-8"?>
+<w:hdr xmlns:wpc="http://schemas.microsoft.com/office/word/2010/wordprocessingCanvas" xmlns:cx="http://schemas.microsoft.com/office/drawing/2014/chartex" xmlns:cx1="http://schemas.microsoft.com/office/drawing/2015/9/8/chartex" xmlns:cx2="http://schemas.microsoft.com/office/drawing/2015/10/21/chartex" xmlns:cx3="http://schemas.microsoft.com/office/drawing/2016/5/9/chartex" xmlns:cx4="http://schemas.microsoft.com/office/drawing/2016/5/10/chartex" xmlns:cx5="http://schemas.microsoft.com/office/drawing/2016/5/11/chartex" xmlns:cx6="http://schemas.microsoft.com/office/drawing/2016/5/12/chartex" xmlns:cx7="http://schemas.microsoft.com/office/drawing/2016/5/13/chartex" xmlns:cx8="http://schemas.microsoft.com/office/drawing/2016/5/14/chartex" xmlns:mc="http://schemas.openxmlformats.org/markup-compatibility/2006" xmlns:aink="http://schemas.microsoft.com/office/drawing/2016/ink" xmlns:am3d="http://schemas.microsoft.com/office/drawing/2017/model3d" xmlns:o="urn:schemas-microsoft-com:office:office" xmlns:oel="http://schemas.microsoft.com/office/2019/extlst" xmlns:r="http://schemas.openxmlformats.org/officeDocument/2006/relationships" xmlns:m="http://schemas.openxmlformats.org/officeDocument/2006/math" xmlns:v="urn:schemas-microsoft-com:vml" xmlns:wp14="http://schemas.microsoft.com/office/word/2010/wordprocessingDrawing" xmlns:wp="http://schemas.openxmlformats.org/drawingml/2006/wordprocessingDrawing" xmlns:w10="urn:schemas-microsoft-com:office:word" xmlns:w="http://schemas.openxmlformats.org/wordprocessingml/2006/main" xmlns:w14="http://schemas.microsoft.com/office/word/2010/wordml" xmlns:w15="http://schemas.microsoft.com/office/word/2012/wordml" xmlns:w16cex="http://schemas.microsoft.com/office/word/2018/wordml/cex" xmlns:w16cid="http://schemas.microsoft.com/office/word/2016/wordml/cid" xmlns:w16="http://schemas.microsoft.com/office/word/2018/wordml" xmlns:w16du="http://schemas.microsoft.com/office/word/2023/wordml/word16du" xmlns:w16sdtdh="http://schemas.microsoft.com/office/word/2020/wordml/sdtdatahash" xmlns:w16sdtfl="http://schemas.microsoft.com/office/word/2024/wordml/sdtformatlock" xmlns:w16se="http://schemas.microsoft.com/office/word/2015/wordml/symex" xmlns:wpg="http://schemas.microsoft.com/office/word/2010/wordprocessingGroup" xmlns:wpi="http://schemas.microsoft.com/office/word/2010/wordprocessingInk" xmlns:wne="http://schemas.microsoft.com/office/word/2006/wordml" xmlns:wps="http://schemas.microsoft.com/office/word/2010/wordprocessingShape" mc:Ignorable="w14 w15 w16se w16cid w16 w16cex w16sdtdh w16sdtfl w16du wp14">
+  <w:p>
+    <w:pPr>
+      <w:pStyle w:val="Header"/>
+    </w:pPr>
+  </w:p>
+</w:hdr>
+</file>
+
+<file path=word/header3.xml><?xml version="1.0" encoding="utf-8"?>
+<w:hdr xmlns:wpc="http://schemas.microsoft.com/office/word/2010/wordprocessingCanvas" xmlns:cx="http://schemas.microsoft.com/office/drawing/2014/chartex" xmlns:cx1="http://schemas.microsoft.com/office/drawing/2015/9/8/chartex" xmlns:cx2="http://schemas.microsoft.com/office/drawing/2015/10/21/chartex" xmlns:cx3="http://schemas.microsoft.com/office/drawing/2016/5/9/chartex" xmlns:cx4="http://schemas.microsoft.com/office/drawing/2016/5/10/chartex" xmlns:cx5="http://schemas.microsoft.com/office/drawing/2016/5/11/chartex" xmlns:cx6="http://schemas.microsoft.com/office/drawing/2016/5/12/chartex" xmlns:cx7="http://schemas.microsoft.com/office/drawing/2016/5/13/chartex" xmlns:cx8="http://schemas.microsoft.com/office/drawing/2016/5/14/chartex" xmlns:mc="http://schemas.openxmlformats.org/markup-compatibility/2006" xmlns:aink="http://schemas.microsoft.com/office/drawing/2016/ink" xmlns:am3d="http://schemas.microsoft.com/office/drawing/2017/model3d" xmlns:o="urn:schemas-microsoft-com:office:office" xmlns:oel="http://schemas.microsoft.com/office/2019/extlst" xmlns:r="http://schemas.openxmlformats.org/officeDocument/2006/relationships" xmlns:m="http://schemas.openxmlformats.org/officeDocument/2006/math" xmlns:v="urn:schemas-microsoft-com:vml" xmlns:wp14="http://schemas.microsoft.com/office/word/2010/wordprocessingDrawing" xmlns:wp="http://schemas.openxmlformats.org/drawingml/2006/wordprocessingDrawing" xmlns:w10="urn:schemas-microsoft-com:office:word" xmlns:w="http://schemas.openxmlformats.org/wordprocessingml/2006/main" xmlns:w14="http://schemas.microsoft.com/office/word/2010/wordml" xmlns:w15="http://schemas.microsoft.com/office/word/2012/wordml" xmlns:w16cex="http://schemas.microsoft.com/office/word/2018/wordml/cex" xmlns:w16cid="http://schemas.microsoft.com/office/word/2016/wordml/cid" xmlns:w16="http://schemas.microsoft.com/office/word/2018/wordml" xmlns:w16du="http://schemas.microsoft.com/office/word/2023/wordml/word16du" xmlns:w16sdtdh="http://schemas.microsoft.com/office/word/2020/wordml/sdtdatahash" xmlns:w16sdtfl="http://schemas.microsoft.com/office/word/2024/wordml/sdtformatlock" xmlns:w16se="http://schemas.microsoft.com/office/word/2015/wordml/symex" xmlns:wpg="http://schemas.microsoft.com/office/word/2010/wordprocessingGroup" xmlns:wpi="http://schemas.microsoft.com/office/word/2010/wordprocessingInk" xmlns:wne="http://schemas.microsoft.com/office/word/2006/wordml" xmlns:wps="http://schemas.microsoft.com/office/word/2010/wordprocessingShape" mc:Ignorable="w14 w15 w16se w16cid w16 w16cex w16sdtdh w16sdtfl w16du wp14">
+  <w:p>
+    <w:pPr>
+      <w:pStyle w:val="Header"/>
+    </w:pPr>
+  </w:p>
+</w:hdr>
+</file>
+
 <file path=word/numbering.xml><?xml version="1.0" encoding="utf-8"?>
-<w:numbering xmlns:m="http://schemas.openxmlformats.org/officeDocument/2006/math" xmlns:mc="http://schemas.openxmlformats.org/markup-compatibility/2006" xmlns:o="urn:schemas-microsoft-com:office:office" xmlns:r="http://schemas.openxmlformats.org/officeDocument/2006/relationships" xmlns:v="urn:schemas-microsoft-com:vml" xmlns:w="http://schemas.openxmlformats.org/wordprocessingml/2006/main" xmlns:w10="urn:schemas-microsoft-com:office:word" xmlns:w14="http://schemas.microsoft.com/office/word/2010/wordml" xmlns:wne="http://schemas.microsoft.com/office/word/2006/wordml" xmlns:wp="http://schemas.openxmlformats.org/drawingml/2006/wordprocessingDrawing" xmlns:wp14="http://schemas.microsoft.com/office/word/2010/wordprocessingDrawing" xmlns:wpc="http://schemas.microsoft.com/office/word/2010/wordprocessingCanvas" xmlns:wpg="http://schemas.microsoft.com/office/word/2010/wordprocessingGroup" xmlns:wpi="http://schemas.microsoft.com/office/word/2010/wordprocessingInk" xmlns:wps="http://schemas.microsoft.com/office/word/2010/wordprocessingShape" mc:Ignorable="w14 wp14">
-  <w:abstractNum w:abstractNumId="0">
+<w:numbering xmlns:aink="http://schemas.microsoft.com/office/drawing/2016/ink" xmlns:am3d="http://schemas.microsoft.com/office/drawing/2017/model3d" xmlns:cx="http://schemas.microsoft.com/office/drawing/2014/chartex" xmlns:cx1="http://schemas.microsoft.com/office/drawing/2015/9/8/chartex" xmlns:cx2="http://schemas.microsoft.com/office/drawing/2015/10/21/chartex" xmlns:cx3="http://schemas.microsoft.com/office/drawing/2016/5/9/chartex" xmlns:cx4="http://schemas.microsoft.com/office/drawing/2016/5/10/chartex" xmlns:cx5="http://schemas.microsoft.com/office/drawing/2016/5/11/chartex" xmlns:cx6="http://schemas.microsoft.com/office/drawing/2016/5/12/chartex" xmlns:cx7="http://schemas.microsoft.com/office/drawing/2016/5/13/chartex" xmlns:cx8="http://schemas.microsoft.com/office/drawing/2016/5/14/chartex" xmlns:m="http://schemas.openxmlformats.org/officeDocument/2006/math" xmlns:mc="http://schemas.openxmlformats.org/markup-compatibility/2006" xmlns:o="urn:schemas-microsoft-com:office:office" xmlns:oel="http://schemas.microsoft.com/office/2019/extlst" xmlns:r="http://schemas.openxmlformats.org/officeDocument/2006/relationships" xmlns:v="urn:schemas-microsoft-com:vml" xmlns:w="http://schemas.openxmlformats.org/wordprocessingml/2006/main" xmlns:w10="urn:schemas-microsoft-com:office:word" xmlns:w14="http://schemas.microsoft.com/office/word/2010/wordml" xmlns:w15="http://schemas.microsoft.com/office/word/2012/wordml" xmlns:w16="http://schemas.microsoft.com/office/word/2018/wordml" xmlns:w16cex="http://schemas.microsoft.com/office/word/2018/wordml/cex" xmlns:w16cid="http://schemas.microsoft.com/office/word/2016/wordml/cid" xmlns:w16du="http://schemas.microsoft.com/office/word/2023/wordml/word16du" xmlns:w16sdtdh="http://schemas.microsoft.com/office/word/2020/wordml/sdtdatahash" xmlns:w16sdtfl="http://schemas.microsoft.com/office/word/2024/wordml/sdtformatlock" xmlns:w16se="http://schemas.microsoft.com/office/word/2015/wordml/symex" xmlns:wne="http://schemas.microsoft.com/office/word/2006/wordml" xmlns:wp="http://schemas.openxmlformats.org/drawingml/2006/wordprocessingDrawing" xmlns:wp14="http://schemas.microsoft.com/office/word/2010/wordprocessingDrawing" xmlns:wpc="http://schemas.microsoft.com/office/word/2010/wordprocessingCanvas" xmlns:wpg="http://schemas.microsoft.com/office/word/2010/wordprocessingGroup" xmlns:wpi="http://schemas.microsoft.com/office/word/2010/wordprocessingInk" xmlns:wps="http://schemas.microsoft.com/office/word/2010/wordprocessingShape" mc:Ignorable="w14 w15 w16se w16cid w16 w16cex w16sdtdh w16sdtfl w16du wp14">
+  <w:abstractNum w15:restartNumberingAfterBreak="0" w:abstractNumId="0">
     <w:nsid w:val="5BCE4232"/>
     <w:multiLevelType w:val="hybridMultilevel"/>
     <w:tmpl w:val="C14AE192"/>
@@ -1674,7 +1778,7 @@
       </w:rPr>
     </w:lvl>
   </w:abstractNum>
-  <w:num w:numId="1">
+  <w:num w16cid:durableId="101804748" w:numId="1">
     <w:abstractNumId w:val="0"/>
   </w:num>
   <w:num w:numId="1000">
@@ -1701,11 +1805,14 @@
   <w:num w:numId="1007">
     <w:abstractNumId w:val="991"/>
   </w:num>
+  <w:num w:numId="1008">
+    <w:abstractNumId w:val="991"/>
+  </w:num>
 </w:numbering>
 </file>
 
 <file path=word/styles.xml><?xml version="1.0" encoding="utf-8"?>
-<w:styles xmlns:mc="http://schemas.openxmlformats.org/markup-compatibility/2006" xmlns:r="http://schemas.openxmlformats.org/officeDocument/2006/relationships" xmlns:w="http://schemas.openxmlformats.org/wordprocessingml/2006/main" xmlns:w14="http://schemas.microsoft.com/office/word/2010/wordml" mc:Ignorable="w14">
+<w:styles xmlns:mc="http://schemas.openxmlformats.org/markup-compatibility/2006" xmlns:r="http://schemas.openxmlformats.org/officeDocument/2006/relationships" xmlns:w="http://schemas.openxmlformats.org/wordprocessingml/2006/main" xmlns:w14="http://schemas.microsoft.com/office/word/2010/wordml" xmlns:w15="http://schemas.microsoft.com/office/word/2012/wordml" xmlns:w16="http://schemas.microsoft.com/office/word/2018/wordml" xmlns:w16cex="http://schemas.microsoft.com/office/word/2018/wordml/cex" xmlns:w16cid="http://schemas.microsoft.com/office/word/2016/wordml/cid" xmlns:w16du="http://schemas.microsoft.com/office/word/2023/wordml/word16du" xmlns:w16sdtdh="http://schemas.microsoft.com/office/word/2020/wordml/sdtdatahash" xmlns:w16sdtfl="http://schemas.microsoft.com/office/word/2024/wordml/sdtformatlock" xmlns:w16se="http://schemas.microsoft.com/office/word/2015/wordml/symex" mc:Ignorable="w14 w15 w16se w16cid w16 w16cex w16sdtdh w16sdtfl w16du">
   <w:docDefaults>
     <w:rPrDefault>
       <w:rPr>
@@ -1721,144 +1828,383 @@
       </w:pPr>
     </w:pPrDefault>
   </w:docDefaults>
-  <w:latentStyles w:count="267" w:defLockedState="0" w:defQFormat="0" w:defSemiHidden="1" w:defUIPriority="99" w:defUnhideWhenUsed="1">
-    <w:lsdException w:name="Normal" w:qFormat="1" w:semiHidden="0" w:uiPriority="0" w:unhideWhenUsed="0"/>
-    <w:lsdException w:name="heading 1" w:qFormat="1" w:semiHidden="0" w:uiPriority="9" w:unhideWhenUsed="0"/>
-    <w:lsdException w:name="heading 2" w:qFormat="1" w:uiPriority="9"/>
-    <w:lsdException w:name="heading 3" w:qFormat="1" w:uiPriority="9"/>
-    <w:lsdException w:name="heading 4" w:qFormat="1" w:uiPriority="9"/>
-    <w:lsdException w:name="heading 5" w:qFormat="1" w:uiPriority="9"/>
-    <w:lsdException w:name="heading 6" w:qFormat="1" w:uiPriority="9"/>
-    <w:lsdException w:name="heading 7" w:qFormat="1" w:uiPriority="9"/>
-    <w:lsdException w:name="heading 8" w:qFormat="1" w:uiPriority="9"/>
-    <w:lsdException w:name="heading 9" w:qFormat="1" w:uiPriority="9"/>
-    <w:lsdException w:name="toc 1" w:uiPriority="39"/>
-    <w:lsdException w:name="toc 2" w:uiPriority="39"/>
-    <w:lsdException w:name="toc 3" w:uiPriority="39"/>
-    <w:lsdException w:name="toc 4" w:uiPriority="39"/>
-    <w:lsdException w:name="toc 5" w:uiPriority="39"/>
-    <w:lsdException w:name="toc 6" w:uiPriority="39"/>
-    <w:lsdException w:name="toc 7" w:uiPriority="39"/>
-    <w:lsdException w:name="toc 8" w:uiPriority="39"/>
-    <w:lsdException w:name="toc 9" w:uiPriority="39"/>
-    <w:lsdException w:name="caption" w:qFormat="1" w:uiPriority="35"/>
-    <w:lsdException w:name="Title" w:qFormat="1" w:semiHidden="0" w:uiPriority="10" w:unhideWhenUsed="0"/>
-    <w:lsdException w:name="Default Paragraph Font" w:uiPriority="1"/>
-    <w:lsdException w:name="Subtitle" w:qFormat="1" w:semiHidden="0" w:uiPriority="11" w:unhideWhenUsed="0"/>
-    <w:lsdException w:name="Strong" w:qFormat="1" w:semiHidden="0" w:uiPriority="22" w:unhideWhenUsed="0"/>
-    <w:lsdException w:name="Emphasis" w:qFormat="1" w:semiHidden="0" w:uiPriority="20" w:unhideWhenUsed="0"/>
-    <w:lsdException w:name="Table Grid" w:semiHidden="0" w:uiPriority="59" w:unhideWhenUsed="0"/>
-    <w:lsdException w:name="Placeholder Text" w:unhideWhenUsed="0"/>
-    <w:lsdException w:name="No Spacing" w:qFormat="1" w:semiHidden="0" w:uiPriority="1" w:unhideWhenUsed="0"/>
-    <w:lsdException w:name="Light Shading" w:semiHidden="0" w:uiPriority="60" w:unhideWhenUsed="0"/>
-    <w:lsdException w:name="Light List" w:semiHidden="0" w:uiPriority="61" w:unhideWhenUsed="0"/>
-    <w:lsdException w:name="Light Grid" w:semiHidden="0" w:uiPriority="62" w:unhideWhenUsed="0"/>
-    <w:lsdException w:name="Medium Shading 1" w:semiHidden="0" w:uiPriority="63" w:unhideWhenUsed="0"/>
-    <w:lsdException w:name="Medium Shading 2" w:semiHidden="0" w:uiPriority="64" w:unhideWhenUsed="0"/>
-    <w:lsdException w:name="Medium List 1" w:semiHidden="0" w:uiPriority="65" w:unhideWhenUsed="0"/>
-    <w:lsdException w:name="Medium List 2" w:semiHidden="0" w:uiPriority="66" w:unhideWhenUsed="0"/>
-    <w:lsdException w:name="Medium Grid 1" w:semiHidden="0" w:uiPriority="67" w:unhideWhenUsed="0"/>
-    <w:lsdException w:name="Medium Grid 2" w:semiHidden="0" w:uiPriority="68" w:unhideWhenUsed="0"/>
-    <w:lsdException w:name="Medium Grid 3" w:semiHidden="0" w:uiPriority="69" w:unhideWhenUsed="0"/>
-    <w:lsdException w:name="Dark List" w:semiHidden="0" w:uiPriority="70" w:unhideWhenUsed="0"/>
-    <w:lsdException w:name="Colorful Shading" w:semiHidden="0" w:uiPriority="71" w:unhideWhenUsed="0"/>
-    <w:lsdException w:name="Colorful List" w:semiHidden="0" w:uiPriority="72" w:unhideWhenUsed="0"/>
-    <w:lsdException w:name="Colorful Grid" w:semiHidden="0" w:uiPriority="73" w:unhideWhenUsed="0"/>
-    <w:lsdException w:name="Light Shading Accent 1" w:semiHidden="0" w:uiPriority="60" w:unhideWhenUsed="0"/>
-    <w:lsdException w:name="Light List Accent 1" w:semiHidden="0" w:uiPriority="61" w:unhideWhenUsed="0"/>
-    <w:lsdException w:name="Light Grid Accent 1" w:semiHidden="0" w:uiPriority="62" w:unhideWhenUsed="0"/>
-    <w:lsdException w:name="Medium Shading 1 Accent 1" w:semiHidden="0" w:uiPriority="63" w:unhideWhenUsed="0"/>
-    <w:lsdException w:name="Medium Shading 2 Accent 1" w:semiHidden="0" w:uiPriority="64" w:unhideWhenUsed="0"/>
-    <w:lsdException w:name="Medium List 1 Accent 1" w:semiHidden="0" w:uiPriority="65" w:unhideWhenUsed="0"/>
-    <w:lsdException w:name="Revision" w:unhideWhenUsed="0"/>
-    <w:lsdException w:name="List Paragraph" w:qFormat="1" w:semiHidden="0" w:uiPriority="34" w:unhideWhenUsed="0"/>
-    <w:lsdException w:name="Quote" w:qFormat="1" w:semiHidden="0" w:uiPriority="29" w:unhideWhenUsed="0"/>
-    <w:lsdException w:name="Intense Quote" w:qFormat="1" w:semiHidden="0" w:uiPriority="30" w:unhideWhenUsed="0"/>
-    <w:lsdException w:name="Medium List 2 Accent 1" w:semiHidden="0" w:uiPriority="66" w:unhideWhenUsed="0"/>
-    <w:lsdException w:name="Medium Grid 1 Accent 1" w:semiHidden="0" w:uiPriority="67" w:unhideWhenUsed="0"/>
-    <w:lsdException w:name="Medium Grid 2 Accent 1" w:semiHidden="0" w:uiPriority="68" w:unhideWhenUsed="0"/>
-    <w:lsdException w:name="Medium Grid 3 Accent 1" w:semiHidden="0" w:uiPriority="69" w:unhideWhenUsed="0"/>
-    <w:lsdException w:name="Dark List Accent 1" w:semiHidden="0" w:uiPriority="70" w:unhideWhenUsed="0"/>
-    <w:lsdException w:name="Colorful Shading Accent 1" w:semiHidden="0" w:uiPriority="71" w:unhideWhenUsed="0"/>
-    <w:lsdException w:name="Colorful List Accent 1" w:semiHidden="0" w:uiPriority="72" w:unhideWhenUsed="0"/>
-    <w:lsdException w:name="Colorful Grid Accent 1" w:semiHidden="0" w:uiPriority="73" w:unhideWhenUsed="0"/>
-    <w:lsdException w:name="Light Shading Accent 2" w:semiHidden="0" w:uiPriority="60" w:unhideWhenUsed="0"/>
-    <w:lsdException w:name="Light List Accent 2" w:semiHidden="0" w:uiPriority="61" w:unhideWhenUsed="0"/>
-    <w:lsdException w:name="Light Grid Accent 2" w:semiHidden="0" w:uiPriority="62" w:unhideWhenUsed="0"/>
-    <w:lsdException w:name="Medium Shading 1 Accent 2" w:semiHidden="0" w:uiPriority="63" w:unhideWhenUsed="0"/>
-    <w:lsdException w:name="Medium Shading 2 Accent 2" w:semiHidden="0" w:uiPriority="64" w:unhideWhenUsed="0"/>
-    <w:lsdException w:name="Medium List 1 Accent 2" w:semiHidden="0" w:uiPriority="65" w:unhideWhenUsed="0"/>
-    <w:lsdException w:name="Medium List 2 Accent 2" w:semiHidden="0" w:uiPriority="66" w:unhideWhenUsed="0"/>
-    <w:lsdException w:name="Medium Grid 1 Accent 2" w:semiHidden="0" w:uiPriority="67" w:unhideWhenUsed="0"/>
-    <w:lsdException w:name="Medium Grid 2 Accent 2" w:semiHidden="0" w:uiPriority="68" w:unhideWhenUsed="0"/>
-    <w:lsdException w:name="Medium Grid 3 Accent 2" w:semiHidden="0" w:uiPriority="69" w:unhideWhenUsed="0"/>
-    <w:lsdException w:name="Dark List Accent 2" w:semiHidden="0" w:uiPriority="70" w:unhideWhenUsed="0"/>
-    <w:lsdException w:name="Colorful Shading Accent 2" w:semiHidden="0" w:uiPriority="71" w:unhideWhenUsed="0"/>
-    <w:lsdException w:name="Colorful List Accent 2" w:semiHidden="0" w:uiPriority="72" w:unhideWhenUsed="0"/>
-    <w:lsdException w:name="Colorful Grid Accent 2" w:semiHidden="0" w:uiPriority="73" w:unhideWhenUsed="0"/>
-    <w:lsdException w:name="Light Shading Accent 3" w:semiHidden="0" w:uiPriority="60" w:unhideWhenUsed="0"/>
-    <w:lsdException w:name="Light List Accent 3" w:semiHidden="0" w:uiPriority="61" w:unhideWhenUsed="0"/>
-    <w:lsdException w:name="Light Grid Accent 3" w:semiHidden="0" w:uiPriority="62" w:unhideWhenUsed="0"/>
-    <w:lsdException w:name="Medium Shading 1 Accent 3" w:semiHidden="0" w:uiPriority="63" w:unhideWhenUsed="0"/>
-    <w:lsdException w:name="Medium Shading 2 Accent 3" w:semiHidden="0" w:uiPriority="64" w:unhideWhenUsed="0"/>
-    <w:lsdException w:name="Medium List 1 Accent 3" w:semiHidden="0" w:uiPriority="65" w:unhideWhenUsed="0"/>
-    <w:lsdException w:name="Medium List 2 Accent 3" w:semiHidden="0" w:uiPriority="66" w:unhideWhenUsed="0"/>
-    <w:lsdException w:name="Medium Grid 1 Accent 3" w:semiHidden="0" w:uiPriority="67" w:unhideWhenUsed="0"/>
-    <w:lsdException w:name="Medium Grid 2 Accent 3" w:semiHidden="0" w:uiPriority="68" w:unhideWhenUsed="0"/>
-    <w:lsdException w:name="Medium Grid 3 Accent 3" w:semiHidden="0" w:uiPriority="69" w:unhideWhenUsed="0"/>
-    <w:lsdException w:name="Dark List Accent 3" w:semiHidden="0" w:uiPriority="70" w:unhideWhenUsed="0"/>
-    <w:lsdException w:name="Colorful Shading Accent 3" w:semiHidden="0" w:uiPriority="71" w:unhideWhenUsed="0"/>
-    <w:lsdException w:name="Colorful List Accent 3" w:semiHidden="0" w:uiPriority="72" w:unhideWhenUsed="0"/>
-    <w:lsdException w:name="Colorful Grid Accent 3" w:semiHidden="0" w:uiPriority="73" w:unhideWhenUsed="0"/>
-    <w:lsdException w:name="Light Shading Accent 4" w:semiHidden="0" w:uiPriority="60" w:unhideWhenUsed="0"/>
-    <w:lsdException w:name="Light List Accent 4" w:semiHidden="0" w:uiPriority="61" w:unhideWhenUsed="0"/>
-    <w:lsdException w:name="Light Grid Accent 4" w:semiHidden="0" w:uiPriority="62" w:unhideWhenUsed="0"/>
-    <w:lsdException w:name="Medium Shading 1 Accent 4" w:semiHidden="0" w:uiPriority="63" w:unhideWhenUsed="0"/>
-    <w:lsdException w:name="Medium Shading 2 Accent 4" w:semiHidden="0" w:uiPriority="64" w:unhideWhenUsed="0"/>
-    <w:lsdException w:name="Medium List 1 Accent 4" w:semiHidden="0" w:uiPriority="65" w:unhideWhenUsed="0"/>
-    <w:lsdException w:name="Medium List 2 Accent 4" w:semiHidden="0" w:uiPriority="66" w:unhideWhenUsed="0"/>
-    <w:lsdException w:name="Medium Grid 1 Accent 4" w:semiHidden="0" w:uiPriority="67" w:unhideWhenUsed="0"/>
-    <w:lsdException w:name="Medium Grid 2 Accent 4" w:semiHidden="0" w:uiPriority="68" w:unhideWhenUsed="0"/>
-    <w:lsdException w:name="Medium Grid 3 Accent 4" w:semiHidden="0" w:uiPriority="69" w:unhideWhenUsed="0"/>
-    <w:lsdException w:name="Dark List Accent 4" w:semiHidden="0" w:uiPriority="70" w:unhideWhenUsed="0"/>
-    <w:lsdException w:name="Colorful Shading Accent 4" w:semiHidden="0" w:uiPriority="71" w:unhideWhenUsed="0"/>
-    <w:lsdException w:name="Colorful List Accent 4" w:semiHidden="0" w:uiPriority="72" w:unhideWhenUsed="0"/>
-    <w:lsdException w:name="Colorful Grid Accent 4" w:semiHidden="0" w:uiPriority="73" w:unhideWhenUsed="0"/>
-    <w:lsdException w:name="Light Shading Accent 5" w:semiHidden="0" w:uiPriority="60" w:unhideWhenUsed="0"/>
-    <w:lsdException w:name="Light List Accent 5" w:semiHidden="0" w:uiPriority="61" w:unhideWhenUsed="0"/>
-    <w:lsdException w:name="Light Grid Accent 5" w:semiHidden="0" w:uiPriority="62" w:unhideWhenUsed="0"/>
-    <w:lsdException w:name="Medium Shading 1 Accent 5" w:semiHidden="0" w:uiPriority="63" w:unhideWhenUsed="0"/>
-    <w:lsdException w:name="Medium Shading 2 Accent 5" w:semiHidden="0" w:uiPriority="64" w:unhideWhenUsed="0"/>
-    <w:lsdException w:name="Medium List 1 Accent 5" w:semiHidden="0" w:uiPriority="65" w:unhideWhenUsed="0"/>
-    <w:lsdException w:name="Medium List 2 Accent 5" w:semiHidden="0" w:uiPriority="66" w:unhideWhenUsed="0"/>
-    <w:lsdException w:name="Medium Grid 1 Accent 5" w:semiHidden="0" w:uiPriority="67" w:unhideWhenUsed="0"/>
-    <w:lsdException w:name="Medium Grid 2 Accent 5" w:semiHidden="0" w:uiPriority="68" w:unhideWhenUsed="0"/>
-    <w:lsdException w:name="Medium Grid 3 Accent 5" w:semiHidden="0" w:uiPriority="69" w:unhideWhenUsed="0"/>
-    <w:lsdException w:name="Dark List Accent 5" w:semiHidden="0" w:uiPriority="70" w:unhideWhenUsed="0"/>
-    <w:lsdException w:name="Colorful Shading Accent 5" w:semiHidden="0" w:uiPriority="71" w:unhideWhenUsed="0"/>
-    <w:lsdException w:name="Colorful List Accent 5" w:semiHidden="0" w:uiPriority="72" w:unhideWhenUsed="0"/>
-    <w:lsdException w:name="Colorful Grid Accent 5" w:semiHidden="0" w:uiPriority="73" w:unhideWhenUsed="0"/>
-    <w:lsdException w:name="Light Shading Accent 6" w:semiHidden="0" w:uiPriority="60" w:unhideWhenUsed="0"/>
-    <w:lsdException w:name="Light List Accent 6" w:semiHidden="0" w:uiPriority="61" w:unhideWhenUsed="0"/>
-    <w:lsdException w:name="Light Grid Accent 6" w:semiHidden="0" w:uiPriority="62" w:unhideWhenUsed="0"/>
-    <w:lsdException w:name="Medium Shading 1 Accent 6" w:semiHidden="0" w:uiPriority="63" w:unhideWhenUsed="0"/>
-    <w:lsdException w:name="Medium Shading 2 Accent 6" w:semiHidden="0" w:uiPriority="64" w:unhideWhenUsed="0"/>
-    <w:lsdException w:name="Medium List 1 Accent 6" w:semiHidden="0" w:uiPriority="65" w:unhideWhenUsed="0"/>
-    <w:lsdException w:name="Medium List 2 Accent 6" w:semiHidden="0" w:uiPriority="66" w:unhideWhenUsed="0"/>
-    <w:lsdException w:name="Medium Grid 1 Accent 6" w:semiHidden="0" w:uiPriority="67" w:unhideWhenUsed="0"/>
-    <w:lsdException w:name="Medium Grid 2 Accent 6" w:semiHidden="0" w:uiPriority="68" w:unhideWhenUsed="0"/>
-    <w:lsdException w:name="Medium Grid 3 Accent 6" w:semiHidden="0" w:uiPriority="69" w:unhideWhenUsed="0"/>
-    <w:lsdException w:name="Dark List Accent 6" w:semiHidden="0" w:uiPriority="70" w:unhideWhenUsed="0"/>
-    <w:lsdException w:name="Colorful Shading Accent 6" w:semiHidden="0" w:uiPriority="71" w:unhideWhenUsed="0"/>
-    <w:lsdException w:name="Colorful List Accent 6" w:semiHidden="0" w:uiPriority="72" w:unhideWhenUsed="0"/>
-    <w:lsdException w:name="Colorful Grid Accent 6" w:semiHidden="0" w:uiPriority="73" w:unhideWhenUsed="0"/>
-    <w:lsdException w:name="Subtle Emphasis" w:qFormat="1" w:semiHidden="0" w:uiPriority="19" w:unhideWhenUsed="0"/>
-    <w:lsdException w:name="Intense Emphasis" w:qFormat="1" w:semiHidden="0" w:uiPriority="21" w:unhideWhenUsed="0"/>
-    <w:lsdException w:name="Subtle Reference" w:qFormat="1" w:semiHidden="0" w:uiPriority="31" w:unhideWhenUsed="0"/>
-    <w:lsdException w:name="Intense Reference" w:qFormat="1" w:semiHidden="0" w:uiPriority="32" w:unhideWhenUsed="0"/>
-    <w:lsdException w:name="Book Title" w:qFormat="1" w:semiHidden="0" w:uiPriority="33" w:unhideWhenUsed="0"/>
-    <w:lsdException w:name="Bibliography" w:uiPriority="37"/>
-    <w:lsdException w:name="TOC Heading" w:qFormat="1" w:uiPriority="39"/>
+  <w:latentStyles w:count="376" w:defLockedState="0" w:defQFormat="0" w:defSemiHidden="0" w:defUIPriority="99" w:defUnhideWhenUsed="0">
+    <w:lsdException w:name="Normal" w:qFormat="1" w:uiPriority="0"/>
+    <w:lsdException w:name="heading 1" w:qFormat="1" w:uiPriority="9"/>
+    <w:lsdException w:name="heading 2" w:qFormat="1" w:semiHidden="1" w:uiPriority="9" w:unhideWhenUsed="1"/>
+    <w:lsdException w:name="heading 3" w:qFormat="1" w:semiHidden="1" w:uiPriority="9" w:unhideWhenUsed="1"/>
+    <w:lsdException w:name="heading 4" w:qFormat="1" w:semiHidden="1" w:uiPriority="9" w:unhideWhenUsed="1"/>
+    <w:lsdException w:name="heading 5" w:qFormat="1" w:semiHidden="1" w:uiPriority="9" w:unhideWhenUsed="1"/>
+    <w:lsdException w:name="heading 6" w:qFormat="1" w:semiHidden="1" w:uiPriority="9" w:unhideWhenUsed="1"/>
+    <w:lsdException w:name="heading 7" w:qFormat="1" w:semiHidden="1" w:uiPriority="9" w:unhideWhenUsed="1"/>
+    <w:lsdException w:name="heading 8" w:qFormat="1" w:semiHidden="1" w:uiPriority="9" w:unhideWhenUsed="1"/>
+    <w:lsdException w:name="heading 9" w:qFormat="1" w:semiHidden="1" w:uiPriority="9" w:unhideWhenUsed="1"/>
+    <w:lsdException w:name="index 1" w:semiHidden="1" w:unhideWhenUsed="1"/>
+    <w:lsdException w:name="index 2" w:semiHidden="1" w:unhideWhenUsed="1"/>
+    <w:lsdException w:name="index 3" w:semiHidden="1" w:unhideWhenUsed="1"/>
+    <w:lsdException w:name="index 4" w:semiHidden="1" w:unhideWhenUsed="1"/>
+    <w:lsdException w:name="index 5" w:semiHidden="1" w:unhideWhenUsed="1"/>
+    <w:lsdException w:name="index 6" w:semiHidden="1" w:unhideWhenUsed="1"/>
+    <w:lsdException w:name="index 7" w:semiHidden="1" w:unhideWhenUsed="1"/>
+    <w:lsdException w:name="index 8" w:semiHidden="1" w:unhideWhenUsed="1"/>
+    <w:lsdException w:name="index 9" w:semiHidden="1" w:unhideWhenUsed="1"/>
+    <w:lsdException w:name="toc 1" w:semiHidden="1" w:uiPriority="39" w:unhideWhenUsed="1"/>
+    <w:lsdException w:name="toc 2" w:semiHidden="1" w:uiPriority="39" w:unhideWhenUsed="1"/>
+    <w:lsdException w:name="toc 3" w:semiHidden="1" w:uiPriority="39" w:unhideWhenUsed="1"/>
+    <w:lsdException w:name="toc 4" w:semiHidden="1" w:uiPriority="39" w:unhideWhenUsed="1"/>
+    <w:lsdException w:name="toc 5" w:semiHidden="1" w:uiPriority="39" w:unhideWhenUsed="1"/>
+    <w:lsdException w:name="toc 6" w:semiHidden="1" w:uiPriority="39" w:unhideWhenUsed="1"/>
+    <w:lsdException w:name="toc 7" w:semiHidden="1" w:uiPriority="39" w:unhideWhenUsed="1"/>
+    <w:lsdException w:name="toc 8" w:semiHidden="1" w:uiPriority="39" w:unhideWhenUsed="1"/>
+    <w:lsdException w:name="toc 9" w:semiHidden="1" w:uiPriority="39" w:unhideWhenUsed="1"/>
+    <w:lsdException w:name="Normal Indent" w:semiHidden="1" w:unhideWhenUsed="1"/>
+    <w:lsdException w:name="footnote text" w:semiHidden="1" w:unhideWhenUsed="1"/>
+    <w:lsdException w:name="annotation text" w:semiHidden="1" w:unhideWhenUsed="1"/>
+    <w:lsdException w:name="header" w:semiHidden="1" w:unhideWhenUsed="1"/>
+    <w:lsdException w:name="footer" w:semiHidden="1" w:unhideWhenUsed="1"/>
+    <w:lsdException w:name="index heading" w:semiHidden="1" w:unhideWhenUsed="1"/>
+    <w:lsdException w:name="caption" w:qFormat="1" w:semiHidden="1" w:uiPriority="35" w:unhideWhenUsed="1"/>
+    <w:lsdException w:name="table of figures" w:semiHidden="1" w:unhideWhenUsed="1"/>
+    <w:lsdException w:name="envelope address" w:semiHidden="1" w:unhideWhenUsed="1"/>
+    <w:lsdException w:name="envelope return" w:semiHidden="1" w:unhideWhenUsed="1"/>
+    <w:lsdException w:name="footnote reference" w:semiHidden="1" w:unhideWhenUsed="1"/>
+    <w:lsdException w:name="annotation reference" w:semiHidden="1" w:unhideWhenUsed="1"/>
+    <w:lsdException w:name="line number" w:semiHidden="1" w:unhideWhenUsed="1"/>
+    <w:lsdException w:name="page number" w:semiHidden="1" w:unhideWhenUsed="1"/>
+    <w:lsdException w:name="endnote reference" w:semiHidden="1" w:unhideWhenUsed="1"/>
+    <w:lsdException w:name="endnote text" w:semiHidden="1" w:unhideWhenUsed="1"/>
+    <w:lsdException w:name="table of authorities" w:semiHidden="1" w:unhideWhenUsed="1"/>
+    <w:lsdException w:name="macro" w:semiHidden="1" w:unhideWhenUsed="1"/>
+    <w:lsdException w:name="toa heading" w:semiHidden="1" w:unhideWhenUsed="1"/>
+    <w:lsdException w:name="List" w:semiHidden="1" w:unhideWhenUsed="1"/>
+    <w:lsdException w:name="List Bullet" w:semiHidden="1" w:unhideWhenUsed="1"/>
+    <w:lsdException w:name="List Number" w:semiHidden="1" w:unhideWhenUsed="1"/>
+    <w:lsdException w:name="List 2" w:semiHidden="1" w:unhideWhenUsed="1"/>
+    <w:lsdException w:name="List 3" w:semiHidden="1" w:unhideWhenUsed="1"/>
+    <w:lsdException w:name="List 4" w:semiHidden="1" w:unhideWhenUsed="1"/>
+    <w:lsdException w:name="List 5" w:semiHidden="1" w:unhideWhenUsed="1"/>
+    <w:lsdException w:name="List Bullet 2" w:semiHidden="1" w:unhideWhenUsed="1"/>
+    <w:lsdException w:name="List Bullet 3" w:semiHidden="1" w:unhideWhenUsed="1"/>
+    <w:lsdException w:name="List Bullet 4" w:semiHidden="1" w:unhideWhenUsed="1"/>
+    <w:lsdException w:name="List Bullet 5" w:semiHidden="1" w:unhideWhenUsed="1"/>
+    <w:lsdException w:name="List Number 2" w:semiHidden="1" w:unhideWhenUsed="1"/>
+    <w:lsdException w:name="List Number 3" w:semiHidden="1" w:unhideWhenUsed="1"/>
+    <w:lsdException w:name="List Number 4" w:semiHidden="1" w:unhideWhenUsed="1"/>
+    <w:lsdException w:name="List Number 5" w:semiHidden="1" w:unhideWhenUsed="1"/>
+    <w:lsdException w:name="Title" w:qFormat="1" w:uiPriority="10"/>
+    <w:lsdException w:name="Closing" w:semiHidden="1" w:unhideWhenUsed="1"/>
+    <w:lsdException w:name="Signature" w:semiHidden="1" w:unhideWhenUsed="1"/>
+    <w:lsdException w:name="Default Paragraph Font" w:semiHidden="1" w:uiPriority="1" w:unhideWhenUsed="1"/>
+    <w:lsdException w:name="Body Text" w:semiHidden="1" w:unhideWhenUsed="1"/>
+    <w:lsdException w:name="Body Text Indent" w:semiHidden="1" w:unhideWhenUsed="1"/>
+    <w:lsdException w:name="List Continue" w:semiHidden="1" w:unhideWhenUsed="1"/>
+    <w:lsdException w:name="List Continue 2" w:semiHidden="1" w:unhideWhenUsed="1"/>
+    <w:lsdException w:name="List Continue 3" w:semiHidden="1" w:unhideWhenUsed="1"/>
+    <w:lsdException w:name="List Continue 4" w:semiHidden="1" w:unhideWhenUsed="1"/>
+    <w:lsdException w:name="List Continue 5" w:semiHidden="1" w:unhideWhenUsed="1"/>
+    <w:lsdException w:name="Message Header" w:semiHidden="1" w:unhideWhenUsed="1"/>
+    <w:lsdException w:name="Subtitle" w:qFormat="1" w:uiPriority="11"/>
+    <w:lsdException w:name="Salutation" w:semiHidden="1" w:unhideWhenUsed="1"/>
+    <w:lsdException w:name="Date" w:semiHidden="1" w:unhideWhenUsed="1"/>
+    <w:lsdException w:name="Body Text First Indent" w:semiHidden="1" w:unhideWhenUsed="1"/>
+    <w:lsdException w:name="Body Text First Indent 2" w:semiHidden="1" w:unhideWhenUsed="1"/>
+    <w:lsdException w:name="Note Heading" w:semiHidden="1" w:unhideWhenUsed="1"/>
+    <w:lsdException w:name="Body Text 2" w:semiHidden="1" w:unhideWhenUsed="1"/>
+    <w:lsdException w:name="Body Text 3" w:semiHidden="1" w:unhideWhenUsed="1"/>
+    <w:lsdException w:name="Body Text Indent 2" w:semiHidden="1" w:unhideWhenUsed="1"/>
+    <w:lsdException w:name="Body Text Indent 3" w:semiHidden="1" w:unhideWhenUsed="1"/>
+    <w:lsdException w:name="Block Text" w:semiHidden="1" w:unhideWhenUsed="1"/>
+    <w:lsdException w:name="Hyperlink" w:semiHidden="1" w:unhideWhenUsed="1"/>
+    <w:lsdException w:name="FollowedHyperlink" w:semiHidden="1" w:unhideWhenUsed="1"/>
+    <w:lsdException w:name="Strong" w:qFormat="1" w:uiPriority="22"/>
+    <w:lsdException w:name="Emphasis" w:qFormat="1" w:uiPriority="20"/>
+    <w:lsdException w:name="Document Map" w:semiHidden="1" w:unhideWhenUsed="1"/>
+    <w:lsdException w:name="Plain Text" w:semiHidden="1" w:unhideWhenUsed="1"/>
+    <w:lsdException w:name="E-mail Signature" w:semiHidden="1" w:unhideWhenUsed="1"/>
+    <w:lsdException w:name="HTML Top of Form" w:semiHidden="1" w:unhideWhenUsed="1"/>
+    <w:lsdException w:name="HTML Bottom of Form" w:semiHidden="1" w:unhideWhenUsed="1"/>
+    <w:lsdException w:name="Normal (Web)" w:semiHidden="1" w:unhideWhenUsed="1"/>
+    <w:lsdException w:name="HTML Acronym" w:semiHidden="1" w:unhideWhenUsed="1"/>
+    <w:lsdException w:name="HTML Address" w:semiHidden="1" w:unhideWhenUsed="1"/>
+    <w:lsdException w:name="HTML Cite" w:semiHidden="1" w:unhideWhenUsed="1"/>
+    <w:lsdException w:name="HTML Code" w:semiHidden="1" w:unhideWhenUsed="1"/>
+    <w:lsdException w:name="HTML Definition" w:semiHidden="1" w:unhideWhenUsed="1"/>
+    <w:lsdException w:name="HTML Keyboard" w:semiHidden="1" w:unhideWhenUsed="1"/>
+    <w:lsdException w:name="HTML Preformatted" w:semiHidden="1" w:unhideWhenUsed="1"/>
+    <w:lsdException w:name="HTML Sample" w:semiHidden="1" w:unhideWhenUsed="1"/>
+    <w:lsdException w:name="HTML Typewriter" w:semiHidden="1" w:unhideWhenUsed="1"/>
+    <w:lsdException w:name="HTML Variable" w:semiHidden="1" w:unhideWhenUsed="1"/>
+    <w:lsdException w:name="Normal Table" w:semiHidden="1" w:unhideWhenUsed="1"/>
+    <w:lsdException w:name="annotation subject" w:semiHidden="1" w:unhideWhenUsed="1"/>
+    <w:lsdException w:name="No List" w:semiHidden="1" w:unhideWhenUsed="1"/>
+    <w:lsdException w:name="Outline List 1" w:semiHidden="1" w:unhideWhenUsed="1"/>
+    <w:lsdException w:name="Outline List 2" w:semiHidden="1" w:unhideWhenUsed="1"/>
+    <w:lsdException w:name="Outline List 3" w:semiHidden="1" w:unhideWhenUsed="1"/>
+    <w:lsdException w:name="Table Simple 1" w:semiHidden="1" w:unhideWhenUsed="1"/>
+    <w:lsdException w:name="Table Simple 2" w:semiHidden="1" w:unhideWhenUsed="1"/>
+    <w:lsdException w:name="Table Simple 3" w:semiHidden="1" w:unhideWhenUsed="1"/>
+    <w:lsdException w:name="Table Classic 1" w:semiHidden="1" w:unhideWhenUsed="1"/>
+    <w:lsdException w:name="Table Classic 2" w:semiHidden="1" w:unhideWhenUsed="1"/>
+    <w:lsdException w:name="Table Classic 3" w:semiHidden="1" w:unhideWhenUsed="1"/>
+    <w:lsdException w:name="Table Classic 4" w:semiHidden="1" w:unhideWhenUsed="1"/>
+    <w:lsdException w:name="Table Colorful 1" w:semiHidden="1" w:unhideWhenUsed="1"/>
+    <w:lsdException w:name="Table Colorful 2" w:semiHidden="1" w:unhideWhenUsed="1"/>
+    <w:lsdException w:name="Table Colorful 3" w:semiHidden="1" w:unhideWhenUsed="1"/>
+    <w:lsdException w:name="Table Columns 1" w:semiHidden="1" w:unhideWhenUsed="1"/>
+    <w:lsdException w:name="Table Columns 2" w:semiHidden="1" w:unhideWhenUsed="1"/>
+    <w:lsdException w:name="Table Columns 3" w:semiHidden="1" w:unhideWhenUsed="1"/>
+    <w:lsdException w:name="Table Columns 4" w:semiHidden="1" w:unhideWhenUsed="1"/>
+    <w:lsdException w:name="Table Columns 5" w:semiHidden="1" w:unhideWhenUsed="1"/>
+    <w:lsdException w:name="Table Grid 1" w:semiHidden="1" w:unhideWhenUsed="1"/>
+    <w:lsdException w:name="Table Grid 2" w:semiHidden="1" w:unhideWhenUsed="1"/>
+    <w:lsdException w:name="Table Grid 3" w:semiHidden="1" w:unhideWhenUsed="1"/>
+    <w:lsdException w:name="Table Grid 4" w:semiHidden="1" w:unhideWhenUsed="1"/>
+    <w:lsdException w:name="Table Grid 5" w:semiHidden="1" w:unhideWhenUsed="1"/>
+    <w:lsdException w:name="Table Grid 6" w:semiHidden="1" w:unhideWhenUsed="1"/>
+    <w:lsdException w:name="Table Grid 7" w:semiHidden="1" w:unhideWhenUsed="1"/>
+    <w:lsdException w:name="Table Grid 8" w:semiHidden="1" w:unhideWhenUsed="1"/>
+    <w:lsdException w:name="Table List 1" w:semiHidden="1" w:unhideWhenUsed="1"/>
+    <w:lsdException w:name="Table List 2" w:semiHidden="1" w:unhideWhenUsed="1"/>
+    <w:lsdException w:name="Table List 3" w:semiHidden="1" w:unhideWhenUsed="1"/>
+    <w:lsdException w:name="Table List 4" w:semiHidden="1" w:unhideWhenUsed="1"/>
+    <w:lsdException w:name="Table List 5" w:semiHidden="1" w:unhideWhenUsed="1"/>
+    <w:lsdException w:name="Table List 6" w:semiHidden="1" w:unhideWhenUsed="1"/>
+    <w:lsdException w:name="Table List 7" w:semiHidden="1" w:unhideWhenUsed="1"/>
+    <w:lsdException w:name="Table List 8" w:semiHidden="1" w:unhideWhenUsed="1"/>
+    <w:lsdException w:name="Table 3D effects 1" w:semiHidden="1" w:unhideWhenUsed="1"/>
+    <w:lsdException w:name="Table 3D effects 2" w:semiHidden="1" w:unhideWhenUsed="1"/>
+    <w:lsdException w:name="Table 3D effects 3" w:semiHidden="1" w:unhideWhenUsed="1"/>
+    <w:lsdException w:name="Table Contemporary" w:semiHidden="1" w:unhideWhenUsed="1"/>
+    <w:lsdException w:name="Table Elegant" w:semiHidden="1" w:unhideWhenUsed="1"/>
+    <w:lsdException w:name="Table Professional" w:semiHidden="1" w:unhideWhenUsed="1"/>
+    <w:lsdException w:name="Table Subtle 1" w:semiHidden="1" w:unhideWhenUsed="1"/>
+    <w:lsdException w:name="Table Subtle 2" w:semiHidden="1" w:unhideWhenUsed="1"/>
+    <w:lsdException w:name="Table Web 1" w:semiHidden="1" w:unhideWhenUsed="1"/>
+    <w:lsdException w:name="Table Web 2" w:semiHidden="1" w:unhideWhenUsed="1"/>
+    <w:lsdException w:name="Table Web 3" w:semiHidden="1" w:unhideWhenUsed="1"/>
+    <w:lsdException w:name="Balloon Text" w:semiHidden="1" w:unhideWhenUsed="1"/>
+    <w:lsdException w:name="Table Grid" w:uiPriority="59"/>
+    <w:lsdException w:name="Table Theme" w:semiHidden="1" w:unhideWhenUsed="1"/>
+    <w:lsdException w:name="Placeholder Text" w:semiHidden="1"/>
+    <w:lsdException w:name="No Spacing" w:qFormat="1" w:uiPriority="1"/>
+    <w:lsdException w:name="Light Shading" w:uiPriority="60"/>
+    <w:lsdException w:name="Light List" w:uiPriority="61"/>
+    <w:lsdException w:name="Light Grid" w:uiPriority="62"/>
+    <w:lsdException w:name="Medium Shading 1" w:uiPriority="63"/>
+    <w:lsdException w:name="Medium Shading 2" w:uiPriority="64"/>
+    <w:lsdException w:name="Medium List 1" w:uiPriority="65"/>
+    <w:lsdException w:name="Medium List 2" w:uiPriority="66"/>
+    <w:lsdException w:name="Medium Grid 1" w:uiPriority="67"/>
+    <w:lsdException w:name="Medium Grid 2" w:uiPriority="68"/>
+    <w:lsdException w:name="Medium Grid 3" w:uiPriority="69"/>
+    <w:lsdException w:name="Dark List" w:uiPriority="70"/>
+    <w:lsdException w:name="Colorful Shading" w:uiPriority="71"/>
+    <w:lsdException w:name="Colorful List" w:uiPriority="72"/>
+    <w:lsdException w:name="Colorful Grid" w:uiPriority="73"/>
+    <w:lsdException w:name="Light Shading Accent 1" w:uiPriority="60"/>
+    <w:lsdException w:name="Light List Accent 1" w:uiPriority="61"/>
+    <w:lsdException w:name="Light Grid Accent 1" w:uiPriority="62"/>
+    <w:lsdException w:name="Medium Shading 1 Accent 1" w:uiPriority="63"/>
+    <w:lsdException w:name="Medium Shading 2 Accent 1" w:uiPriority="64"/>
+    <w:lsdException w:name="Medium List 1 Accent 1" w:uiPriority="65"/>
+    <w:lsdException w:name="Revision" w:semiHidden="1"/>
+    <w:lsdException w:name="List Paragraph" w:qFormat="1" w:uiPriority="34"/>
+    <w:lsdException w:name="Quote" w:qFormat="1" w:uiPriority="29"/>
+    <w:lsdException w:name="Intense Quote" w:qFormat="1" w:uiPriority="30"/>
+    <w:lsdException w:name="Medium List 2 Accent 1" w:uiPriority="66"/>
+    <w:lsdException w:name="Medium Grid 1 Accent 1" w:uiPriority="67"/>
+    <w:lsdException w:name="Medium Grid 2 Accent 1" w:uiPriority="68"/>
+    <w:lsdException w:name="Medium Grid 3 Accent 1" w:uiPriority="69"/>
+    <w:lsdException w:name="Dark List Accent 1" w:uiPriority="70"/>
+    <w:lsdException w:name="Colorful Shading Accent 1" w:uiPriority="71"/>
+    <w:lsdException w:name="Colorful List Accent 1" w:uiPriority="72"/>
+    <w:lsdException w:name="Colorful Grid Accent 1" w:uiPriority="73"/>
+    <w:lsdException w:name="Light Shading Accent 2" w:uiPriority="60"/>
+    <w:lsdException w:name="Light List Accent 2" w:uiPriority="61"/>
+    <w:lsdException w:name="Light Grid Accent 2" w:uiPriority="62"/>
+    <w:lsdException w:name="Medium Shading 1 Accent 2" w:uiPriority="63"/>
+    <w:lsdException w:name="Medium Shading 2 Accent 2" w:uiPriority="64"/>
+    <w:lsdException w:name="Medium List 1 Accent 2" w:uiPriority="65"/>
+    <w:lsdException w:name="Medium List 2 Accent 2" w:uiPriority="66"/>
+    <w:lsdException w:name="Medium Grid 1 Accent 2" w:uiPriority="67"/>
+    <w:lsdException w:name="Medium Grid 2 Accent 2" w:uiPriority="68"/>
+    <w:lsdException w:name="Medium Grid 3 Accent 2" w:uiPriority="69"/>
+    <w:lsdException w:name="Dark List Accent 2" w:uiPriority="70"/>
+    <w:lsdException w:name="Colorful Shading Accent 2" w:uiPriority="71"/>
+    <w:lsdException w:name="Colorful List Accent 2" w:uiPriority="72"/>
+    <w:lsdException w:name="Colorful Grid Accent 2" w:uiPriority="73"/>
+    <w:lsdException w:name="Light Shading Accent 3" w:uiPriority="60"/>
+    <w:lsdException w:name="Light List Accent 3" w:uiPriority="61"/>
+    <w:lsdException w:name="Light Grid Accent 3" w:uiPriority="62"/>
+    <w:lsdException w:name="Medium Shading 1 Accent 3" w:uiPriority="63"/>
+    <w:lsdException w:name="Medium Shading 2 Accent 3" w:uiPriority="64"/>
+    <w:lsdException w:name="Medium List 1 Accent 3" w:uiPriority="65"/>
+    <w:lsdException w:name="Medium List 2 Accent 3" w:uiPriority="66"/>
+    <w:lsdException w:name="Medium Grid 1 Accent 3" w:uiPriority="67"/>
+    <w:lsdException w:name="Medium Grid 2 Accent 3" w:uiPriority="68"/>
+    <w:lsdException w:name="Medium Grid 3 Accent 3" w:uiPriority="69"/>
+    <w:lsdException w:name="Dark List Accent 3" w:uiPriority="70"/>
+    <w:lsdException w:name="Colorful Shading Accent 3" w:uiPriority="71"/>
+    <w:lsdException w:name="Colorful List Accent 3" w:uiPriority="72"/>
+    <w:lsdException w:name="Colorful Grid Accent 3" w:uiPriority="73"/>
+    <w:lsdException w:name="Light Shading Accent 4" w:uiPriority="60"/>
+    <w:lsdException w:name="Light List Accent 4" w:uiPriority="61"/>
+    <w:lsdException w:name="Light Grid Accent 4" w:uiPriority="62"/>
+    <w:lsdException w:name="Medium Shading 1 Accent 4" w:uiPriority="63"/>
+    <w:lsdException w:name="Medium Shading 2 Accent 4" w:uiPriority="64"/>
+    <w:lsdException w:name="Medium List 1 Accent 4" w:uiPriority="65"/>
+    <w:lsdException w:name="Medium List 2 Accent 4" w:uiPriority="66"/>
+    <w:lsdException w:name="Medium Grid 1 Accent 4" w:uiPriority="67"/>
+    <w:lsdException w:name="Medium Grid 2 Accent 4" w:uiPriority="68"/>
+    <w:lsdException w:name="Medium Grid 3 Accent 4" w:uiPriority="69"/>
+    <w:lsdException w:name="Dark List Accent 4" w:uiPriority="70"/>
+    <w:lsdException w:name="Colorful Shading Accent 4" w:uiPriority="71"/>
+    <w:lsdException w:name="Colorful List Accent 4" w:uiPriority="72"/>
+    <w:lsdException w:name="Colorful Grid Accent 4" w:uiPriority="73"/>
+    <w:lsdException w:name="Light Shading Accent 5" w:uiPriority="60"/>
+    <w:lsdException w:name="Light List Accent 5" w:uiPriority="61"/>
+    <w:lsdException w:name="Light Grid Accent 5" w:uiPriority="62"/>
+    <w:lsdException w:name="Medium Shading 1 Accent 5" w:uiPriority="63"/>
+    <w:lsdException w:name="Medium Shading 2 Accent 5" w:uiPriority="64"/>
+    <w:lsdException w:name="Medium List 1 Accent 5" w:uiPriority="65"/>
+    <w:lsdException w:name="Medium List 2 Accent 5" w:uiPriority="66"/>
+    <w:lsdException w:name="Medium Grid 1 Accent 5" w:uiPriority="67"/>
+    <w:lsdException w:name="Medium Grid 2 Accent 5" w:uiPriority="68"/>
+    <w:lsdException w:name="Medium Grid 3 Accent 5" w:uiPriority="69"/>
+    <w:lsdException w:name="Dark List Accent 5" w:uiPriority="70"/>
+    <w:lsdException w:name="Colorful Shading Accent 5" w:uiPriority="71"/>
+    <w:lsdException w:name="Colorful List Accent 5" w:uiPriority="72"/>
+    <w:lsdException w:name="Colorful Grid Accent 5" w:uiPriority="73"/>
+    <w:lsdException w:name="Light Shading Accent 6" w:uiPriority="60"/>
+    <w:lsdException w:name="Light List Accent 6" w:uiPriority="61"/>
+    <w:lsdException w:name="Light Grid Accent 6" w:uiPriority="62"/>
+    <w:lsdException w:name="Medium Shading 1 Accent 6" w:uiPriority="63"/>
+    <w:lsdException w:name="Medium Shading 2 Accent 6" w:uiPriority="64"/>
+    <w:lsdException w:name="Medium List 1 Accent 6" w:uiPriority="65"/>
+    <w:lsdException w:name="Medium List 2 Accent 6" w:uiPriority="66"/>
+    <w:lsdException w:name="Medium Grid 1 Accent 6" w:uiPriority="67"/>
+    <w:lsdException w:name="Medium Grid 2 Accent 6" w:uiPriority="68"/>
+    <w:lsdException w:name="Medium Grid 3 Accent 6" w:uiPriority="69"/>
+    <w:lsdException w:name="Dark List Accent 6" w:uiPriority="70"/>
+    <w:lsdException w:name="Colorful Shading Accent 6" w:uiPriority="71"/>
+    <w:lsdException w:name="Colorful List Accent 6" w:uiPriority="72"/>
+    <w:lsdException w:name="Colorful Grid Accent 6" w:uiPriority="73"/>
+    <w:lsdException w:name="Subtle Emphasis" w:qFormat="1" w:uiPriority="19"/>
+    <w:lsdException w:name="Intense Emphasis" w:qFormat="1" w:uiPriority="21"/>
+    <w:lsdException w:name="Subtle Reference" w:qFormat="1" w:uiPriority="31"/>
+    <w:lsdException w:name="Intense Reference" w:qFormat="1" w:uiPriority="32"/>
+    <w:lsdException w:name="Book Title" w:qFormat="1" w:uiPriority="33"/>
+    <w:lsdException w:name="Bibliography" w:semiHidden="1" w:uiPriority="37" w:unhideWhenUsed="1"/>
+    <w:lsdException w:name="TOC Heading" w:qFormat="1" w:semiHidden="1" w:uiPriority="39" w:unhideWhenUsed="1"/>
+    <w:lsdException w:name="Plain Table 1" w:uiPriority="41"/>
+    <w:lsdException w:name="Plain Table 2" w:uiPriority="42"/>
+    <w:lsdException w:name="Plain Table 3" w:uiPriority="43"/>
+    <w:lsdException w:name="Plain Table 4" w:uiPriority="44"/>
+    <w:lsdException w:name="Plain Table 5" w:uiPriority="45"/>
+    <w:lsdException w:name="Grid Table Light" w:uiPriority="40"/>
+    <w:lsdException w:name="Grid Table 1 Light" w:uiPriority="46"/>
+    <w:lsdException w:name="Grid Table 2" w:uiPriority="47"/>
+    <w:lsdException w:name="Grid Table 3" w:uiPriority="48"/>
+    <w:lsdException w:name="Grid Table 4" w:uiPriority="49"/>
+    <w:lsdException w:name="Grid Table 5 Dark" w:uiPriority="50"/>
+    <w:lsdException w:name="Grid Table 6 Colorful" w:uiPriority="51"/>
+    <w:lsdException w:name="Grid Table 7 Colorful" w:uiPriority="52"/>
+    <w:lsdException w:name="Grid Table 1 Light Accent 1" w:uiPriority="46"/>
+    <w:lsdException w:name="Grid Table 2 Accent 1" w:uiPriority="47"/>
+    <w:lsdException w:name="Grid Table 3 Accent 1" w:uiPriority="48"/>
+    <w:lsdException w:name="Grid Table 4 Accent 1" w:uiPriority="49"/>
+    <w:lsdException w:name="Grid Table 5 Dark Accent 1" w:uiPriority="50"/>
+    <w:lsdException w:name="Grid Table 6 Colorful Accent 1" w:uiPriority="51"/>
+    <w:lsdException w:name="Grid Table 7 Colorful Accent 1" w:uiPriority="52"/>
+    <w:lsdException w:name="Grid Table 1 Light Accent 2" w:uiPriority="46"/>
+    <w:lsdException w:name="Grid Table 2 Accent 2" w:uiPriority="47"/>
+    <w:lsdException w:name="Grid Table 3 Accent 2" w:uiPriority="48"/>
+    <w:lsdException w:name="Grid Table 4 Accent 2" w:uiPriority="49"/>
+    <w:lsdException w:name="Grid Table 5 Dark Accent 2" w:uiPriority="50"/>
+    <w:lsdException w:name="Grid Table 6 Colorful Accent 2" w:uiPriority="51"/>
+    <w:lsdException w:name="Grid Table 7 Colorful Accent 2" w:uiPriority="52"/>
+    <w:lsdException w:name="Grid Table 1 Light Accent 3" w:uiPriority="46"/>
+    <w:lsdException w:name="Grid Table 2 Accent 3" w:uiPriority="47"/>
+    <w:lsdException w:name="Grid Table 3 Accent 3" w:uiPriority="48"/>
+    <w:lsdException w:name="Grid Table 4 Accent 3" w:uiPriority="49"/>
+    <w:lsdException w:name="Grid Table 5 Dark Accent 3" w:uiPriority="50"/>
+    <w:lsdException w:name="Grid Table 6 Colorful Accent 3" w:uiPriority="51"/>
+    <w:lsdException w:name="Grid Table 7 Colorful Accent 3" w:uiPriority="52"/>
+    <w:lsdException w:name="Grid Table 1 Light Accent 4" w:uiPriority="46"/>
+    <w:lsdException w:name="Grid Table 2 Accent 4" w:uiPriority="47"/>
+    <w:lsdException w:name="Grid Table 3 Accent 4" w:uiPriority="48"/>
+    <w:lsdException w:name="Grid Table 4 Accent 4" w:uiPriority="49"/>
+    <w:lsdException w:name="Grid Table 5 Dark Accent 4" w:uiPriority="50"/>
+    <w:lsdException w:name="Grid Table 6 Colorful Accent 4" w:uiPriority="51"/>
+    <w:lsdException w:name="Grid Table 7 Colorful Accent 4" w:uiPriority="52"/>
+    <w:lsdException w:name="Grid Table 1 Light Accent 5" w:uiPriority="46"/>
+    <w:lsdException w:name="Grid Table 2 Accent 5" w:uiPriority="47"/>
+    <w:lsdException w:name="Grid Table 3 Accent 5" w:uiPriority="48"/>
+    <w:lsdException w:name="Grid Table 4 Accent 5" w:uiPriority="49"/>
+    <w:lsdException w:name="Grid Table 5 Dark Accent 5" w:uiPriority="50"/>
+    <w:lsdException w:name="Grid Table 6 Colorful Accent 5" w:uiPriority="51"/>
+    <w:lsdException w:name="Grid Table 7 Colorful Accent 5" w:uiPriority="52"/>
+    <w:lsdException w:name="Grid Table 1 Light Accent 6" w:uiPriority="46"/>
+    <w:lsdException w:name="Grid Table 2 Accent 6" w:uiPriority="47"/>
+    <w:lsdException w:name="Grid Table 3 Accent 6" w:uiPriority="48"/>
+    <w:lsdException w:name="Grid Table 4 Accent 6" w:uiPriority="49"/>
+    <w:lsdException w:name="Grid Table 5 Dark Accent 6" w:uiPriority="50"/>
+    <w:lsdException w:name="Grid Table 6 Colorful Accent 6" w:uiPriority="51"/>
+    <w:lsdException w:name="Grid Table 7 Colorful Accent 6" w:uiPriority="52"/>
+    <w:lsdException w:name="List Table 1 Light" w:uiPriority="46"/>
+    <w:lsdException w:name="List Table 2" w:uiPriority="47"/>
+    <w:lsdException w:name="List Table 3" w:uiPriority="48"/>
+    <w:lsdException w:name="List Table 4" w:uiPriority="49"/>
+    <w:lsdException w:name="List Table 5 Dark" w:uiPriority="50"/>
+    <w:lsdException w:name="List Table 6 Colorful" w:uiPriority="51"/>
+    <w:lsdException w:name="List Table 7 Colorful" w:uiPriority="52"/>
+    <w:lsdException w:name="List Table 1 Light Accent 1" w:uiPriority="46"/>
+    <w:lsdException w:name="List Table 2 Accent 1" w:uiPriority="47"/>
+    <w:lsdException w:name="List Table 3 Accent 1" w:uiPriority="48"/>
+    <w:lsdException w:name="List Table 4 Accent 1" w:uiPriority="49"/>
+    <w:lsdException w:name="List Table 5 Dark Accent 1" w:uiPriority="50"/>
+    <w:lsdException w:name="List Table 6 Colorful Accent 1" w:uiPriority="51"/>
+    <w:lsdException w:name="List Table 7 Colorful Accent 1" w:uiPriority="52"/>
+    <w:lsdException w:name="List Table 1 Light Accent 2" w:uiPriority="46"/>
+    <w:lsdException w:name="List Table 2 Accent 2" w:uiPriority="47"/>
+    <w:lsdException w:name="List Table 3 Accent 2" w:uiPriority="48"/>
+    <w:lsdException w:name="List Table 4 Accent 2" w:uiPriority="49"/>
+    <w:lsdException w:name="List Table 5 Dark Accent 2" w:uiPriority="50"/>
+    <w:lsdException w:name="List Table 6 Colorful Accent 2" w:uiPriority="51"/>
+    <w:lsdException w:name="List Table 7 Colorful Accent 2" w:uiPriority="52"/>
+    <w:lsdException w:name="List Table 1 Light Accent 3" w:uiPriority="46"/>
+    <w:lsdException w:name="List Table 2 Accent 3" w:uiPriority="47"/>
+    <w:lsdException w:name="List Table 3 Accent 3" w:uiPriority="48"/>
+    <w:lsdException w:name="List Table 4 Accent 3" w:uiPriority="49"/>
+    <w:lsdException w:name="List Table 5 Dark Accent 3" w:uiPriority="50"/>
+    <w:lsdException w:name="List Table 6 Colorful Accent 3" w:uiPriority="51"/>
+    <w:lsdException w:name="List Table 7 Colorful Accent 3" w:uiPriority="52"/>
+    <w:lsdException w:name="List Table 1 Light Accent 4" w:uiPriority="46"/>
+    <w:lsdException w:name="List Table 2 Accent 4" w:uiPriority="47"/>
+    <w:lsdException w:name="List Table 3 Accent 4" w:uiPriority="48"/>
+    <w:lsdException w:name="List Table 4 Accent 4" w:uiPriority="49"/>
+    <w:lsdException w:name="List Table 5 Dark Accent 4" w:uiPriority="50"/>
+    <w:lsdException w:name="List Table 6 Colorful Accent 4" w:uiPriority="51"/>
+    <w:lsdException w:name="List Table 7 Colorful Accent 4" w:uiPriority="52"/>
+    <w:lsdException w:name="List Table 1 Light Accent 5" w:uiPriority="46"/>
+    <w:lsdException w:name="List Table 2 Accent 5" w:uiPriority="47"/>
+    <w:lsdException w:name="List Table 3 Accent 5" w:uiPriority="48"/>
+    <w:lsdException w:name="List Table 4 Accent 5" w:uiPriority="49"/>
+    <w:lsdException w:name="List Table 5 Dark Accent 5" w:uiPriority="50"/>
+    <w:lsdException w:name="List Table 6 Colorful Accent 5" w:uiPriority="51"/>
+    <w:lsdException w:name="List Table 7 Colorful Accent 5" w:uiPriority="52"/>
+    <w:lsdException w:name="List Table 1 Light Accent 6" w:uiPriority="46"/>
+    <w:lsdException w:name="List Table 2 Accent 6" w:uiPriority="47"/>
+    <w:lsdException w:name="List Table 3 Accent 6" w:uiPriority="48"/>
+    <w:lsdException w:name="List Table 4 Accent 6" w:uiPriority="49"/>
+    <w:lsdException w:name="List Table 5 Dark Accent 6" w:uiPriority="50"/>
+    <w:lsdException w:name="List Table 6 Colorful Accent 6" w:uiPriority="51"/>
+    <w:lsdException w:name="List Table 7 Colorful Accent 6" w:uiPriority="52"/>
+    <w:lsdException w:name="Mention" w:semiHidden="1" w:unhideWhenUsed="1"/>
+    <w:lsdException w:name="Smart Hyperlink" w:semiHidden="1" w:unhideWhenUsed="1"/>
+    <w:lsdException w:name="Hashtag" w:semiHidden="1" w:unhideWhenUsed="1"/>
+    <w:lsdException w:name="Unresolved Mention" w:semiHidden="1" w:unhideWhenUsed="1"/>
+    <w:lsdException w:name="Smart Link" w:semiHidden="1" w:unhideWhenUsed="1"/>
   </w:latentStyles>
   <w:style w:default="1" w:styleId="Normal" w:type="paragraph">
     <w:name w:val="Normal"/>

</xml_diff>